<commit_message>
docs(report): update milestone 2 final report docx
</commit_message>
<xml_diff>
--- a/docs/reports/BaoCaoTienDoMoc2_NguyenHuuDung_11235559_final.docx
+++ b/docs/reports/BaoCaoTienDoMoc2_NguyenHuuDung_11235559_final.docx
@@ -4,53 +4,31 @@
   <w:body>
     <w:p>
       <w:pPr>
-        <w:keepNext/>
-        <w:spacing w:before="160"/>
+        <w:pStyle w:val="Title"/>
         <w:jc w:val="center"/>
       </w:pPr>
       <w:r>
-        <w:rPr>
-          <w:b/>
-          <w:sz w:val="26"/>
-        </w:rPr>
-        <w:t>ĐẠI HỌC KINH TẾ QUỐC DÂN</w:t>
+        <w:t>BÁO CÁO TIẾN ĐỘ KHÓA LUẬN TỐT NGHIỆP — MỐC 2</w:t>
       </w:r>
     </w:p>
     <w:p>
       <w:pPr>
-        <w:jc w:val="center"/>
-      </w:pPr>
-      <w:r>
-        <w:t>Trường Công nghệ – Khoa Hệ thống Thông tin Quản lý</w:t>
-      </w:r>
-    </w:p>
-    <w:p>
-      <w:pPr>
-        <w:keepNext/>
-        <w:spacing w:before="160"/>
-        <w:jc w:val="center"/>
-      </w:pPr>
-      <w:r>
-        <w:rPr>
-          <w:b/>
-          <w:sz w:val="32"/>
-        </w:rPr>
-        <w:t>BÁO CÁO TIẾN ĐỘ THỰC HIỆN KHÓA LUẬN TỐT NGHIỆP</w:t>
-      </w:r>
-    </w:p>
-    <w:p>
-      <w:pPr>
-        <w:jc w:val="center"/>
+        <w:jc w:val="both"/>
       </w:pPr>
       <w:r>
         <w:rPr>
           <w:b/>
         </w:rPr>
-        <w:t>MỐC 2 (21/09/2026 – 05/10/2026)</w:t>
+        <w:t>Giai đoạn:</w:t>
       </w:r>
       <w:r>
-        <w:br/>
+        <w:t xml:space="preserve"> 21/09/2026 – 05/10/2026</w:t>
       </w:r>
+    </w:p>
+    <w:p>
+      <w:pPr>
+        <w:jc w:val="both"/>
+      </w:pPr>
       <w:r>
         <w:rPr>
           <w:b/>
@@ -63,1679 +41,25 @@
     </w:p>
     <w:p>
       <w:pPr>
-        <w:keepNext/>
-        <w:jc w:val="center"/>
+        <w:jc w:val="both"/>
       </w:pPr>
       <w:r>
         <w:rPr>
           <w:b/>
         </w:rPr>
-        <w:t>Bảng 1. Thông tin chung của báo cáo tiến độ Mốc 2</w:t>
+        <w:t>Sinh viên:</w:t>
       </w:r>
-    </w:p>
-    <w:tbl>
-      <w:tblPr>
-        <w:tblStyle w:val="TableGrid"/>
-        <w:tblW w:type="auto" w:w="0"/>
-        <w:jc w:val="center"/>
-        <w:tblLayout w:type="autofit"/>
-        <w:tblLook w:firstColumn="1" w:firstRow="1" w:lastColumn="0" w:lastRow="0" w:noHBand="0" w:noVBand="1" w:val="04A0"/>
-      </w:tblPr>
-      <w:tblGrid>
-        <w:gridCol w:w="4535"/>
-        <w:gridCol w:w="4535"/>
-      </w:tblGrid>
-      <w:tr>
-        <w:tc>
-          <w:tcPr>
-            <w:tcW w:type="dxa" w:w="4535"/>
-            <w:tcBorders>
-              <w:top w:val="single" w:sz="5" w:color="B7C0C8"/>
-              <w:left w:val="single" w:sz="5" w:color="B7C0C8"/>
-              <w:bottom w:val="single" w:sz="5" w:color="B7C0C8"/>
-              <w:right w:val="single" w:sz="5" w:color="B7C0C8"/>
-            </w:tcBorders>
-            <w:shd w:fill="E9EDF1"/>
-          </w:tcPr>
-          <w:p>
-            <w:pPr>
-              <w:keepNext/>
-              <w:jc w:val="center"/>
-            </w:pPr>
-            <w:r>
-              <w:rPr>
-                <w:rFonts w:ascii="Times New Roman" w:hAnsi="Times New Roman"/>
-                <w:b/>
-                <w:sz w:val="19"/>
-              </w:rPr>
-              <w:t>Thông tin</w:t>
-            </w:r>
-          </w:p>
-        </w:tc>
-        <w:tc>
-          <w:tcPr>
-            <w:tcW w:type="dxa" w:w="4535"/>
-            <w:tcBorders>
-              <w:top w:val="single" w:sz="5" w:color="B7C0C8"/>
-              <w:left w:val="single" w:sz="5" w:color="B7C0C8"/>
-              <w:bottom w:val="single" w:sz="5" w:color="B7C0C8"/>
-              <w:right w:val="single" w:sz="5" w:color="B7C0C8"/>
-            </w:tcBorders>
-            <w:shd w:fill="E9EDF1"/>
-          </w:tcPr>
-          <w:p>
-            <w:pPr>
-              <w:keepNext/>
-              <w:jc w:val="center"/>
-            </w:pPr>
-            <w:r>
-              <w:rPr>
-                <w:rFonts w:ascii="Times New Roman" w:hAnsi="Times New Roman"/>
-                <w:b/>
-                <w:sz w:val="19"/>
-              </w:rPr>
-              <w:t>Nội dung</w:t>
-            </w:r>
-          </w:p>
-        </w:tc>
-      </w:tr>
-      <w:tr>
-        <w:tc>
-          <w:tcPr>
-            <w:tcW w:type="dxa" w:w="4535"/>
-            <w:tcBorders>
-              <w:top w:val="single" w:sz="5" w:color="B7C0C8"/>
-              <w:left w:val="single" w:sz="5" w:color="B7C0C8"/>
-              <w:bottom w:val="single" w:sz="5" w:color="B7C0C8"/>
-              <w:right w:val="single" w:sz="5" w:color="B7C0C8"/>
-            </w:tcBorders>
-          </w:tcPr>
-          <w:p>
-            <w:r>
-              <w:rPr>
-                <w:rFonts w:ascii="Times New Roman" w:hAnsi="Times New Roman"/>
-                <w:sz w:val="19"/>
-              </w:rPr>
-              <w:t>Sinh viên thực hiện</w:t>
-            </w:r>
-          </w:p>
-        </w:tc>
-        <w:tc>
-          <w:tcPr>
-            <w:tcW w:type="dxa" w:w="4535"/>
-            <w:tcBorders>
-              <w:top w:val="single" w:sz="5" w:color="B7C0C8"/>
-              <w:left w:val="single" w:sz="5" w:color="B7C0C8"/>
-              <w:bottom w:val="single" w:sz="5" w:color="B7C0C8"/>
-              <w:right w:val="single" w:sz="5" w:color="B7C0C8"/>
-            </w:tcBorders>
-          </w:tcPr>
-          <w:p>
-            <w:r>
-              <w:rPr>
-                <w:rFonts w:ascii="Times New Roman" w:hAnsi="Times New Roman"/>
-                <w:sz w:val="19"/>
-              </w:rPr>
-              <w:t>Nguyễn Hữu Dũng</w:t>
-            </w:r>
-          </w:p>
-        </w:tc>
-      </w:tr>
-      <w:tr>
-        <w:tc>
-          <w:tcPr>
-            <w:tcW w:type="dxa" w:w="4535"/>
-            <w:tcBorders>
-              <w:top w:val="single" w:sz="5" w:color="B7C0C8"/>
-              <w:left w:val="single" w:sz="5" w:color="B7C0C8"/>
-              <w:bottom w:val="single" w:sz="5" w:color="B7C0C8"/>
-              <w:right w:val="single" w:sz="5" w:color="B7C0C8"/>
-            </w:tcBorders>
-            <w:shd w:fill="F7F9FA"/>
-          </w:tcPr>
-          <w:p>
-            <w:r>
-              <w:rPr>
-                <w:rFonts w:ascii="Times New Roman" w:hAnsi="Times New Roman"/>
-                <w:sz w:val="19"/>
-              </w:rPr>
-              <w:t>Mã sinh viên, lớp</w:t>
-            </w:r>
-          </w:p>
-        </w:tc>
-        <w:tc>
-          <w:tcPr>
-            <w:tcW w:type="dxa" w:w="4535"/>
-            <w:tcBorders>
-              <w:top w:val="single" w:sz="5" w:color="B7C0C8"/>
-              <w:left w:val="single" w:sz="5" w:color="B7C0C8"/>
-              <w:bottom w:val="single" w:sz="5" w:color="B7C0C8"/>
-              <w:right w:val="single" w:sz="5" w:color="B7C0C8"/>
-            </w:tcBorders>
-            <w:shd w:fill="F7F9FA"/>
-          </w:tcPr>
-          <w:p>
-            <w:r>
-              <w:rPr>
-                <w:rFonts w:ascii="Times New Roman" w:hAnsi="Times New Roman"/>
-                <w:sz w:val="19"/>
-              </w:rPr>
-              <w:t>11235559, Hệ thống Thông tin Quản lý 65A</w:t>
-            </w:r>
-          </w:p>
-        </w:tc>
-      </w:tr>
-      <w:tr>
-        <w:tc>
-          <w:tcPr>
-            <w:tcW w:type="dxa" w:w="4535"/>
-            <w:tcBorders>
-              <w:top w:val="single" w:sz="5" w:color="B7C0C8"/>
-              <w:left w:val="single" w:sz="5" w:color="B7C0C8"/>
-              <w:bottom w:val="single" w:sz="5" w:color="B7C0C8"/>
-              <w:right w:val="single" w:sz="5" w:color="B7C0C8"/>
-            </w:tcBorders>
-          </w:tcPr>
-          <w:p>
-            <w:r>
-              <w:rPr>
-                <w:rFonts w:ascii="Times New Roman" w:hAnsi="Times New Roman"/>
-                <w:sz w:val="19"/>
-              </w:rPr>
-              <w:t>Giảng viên hướng dẫn</w:t>
-            </w:r>
-          </w:p>
-        </w:tc>
-        <w:tc>
-          <w:tcPr>
-            <w:tcW w:type="dxa" w:w="4535"/>
-            <w:tcBorders>
-              <w:top w:val="single" w:sz="5" w:color="B7C0C8"/>
-              <w:left w:val="single" w:sz="5" w:color="B7C0C8"/>
-              <w:bottom w:val="single" w:sz="5" w:color="B7C0C8"/>
-              <w:right w:val="single" w:sz="5" w:color="B7C0C8"/>
-            </w:tcBorders>
-          </w:tcPr>
-          <w:p>
-            <w:r>
-              <w:rPr>
-                <w:rFonts w:ascii="Times New Roman" w:hAnsi="Times New Roman"/>
-                <w:sz w:val="19"/>
-              </w:rPr>
-              <w:t>ThS. Trần Thanh Hải</w:t>
-            </w:r>
-          </w:p>
-        </w:tc>
-      </w:tr>
-      <w:tr>
-        <w:tc>
-          <w:tcPr>
-            <w:tcW w:type="dxa" w:w="4535"/>
-            <w:tcBorders>
-              <w:top w:val="single" w:sz="5" w:color="B7C0C8"/>
-              <w:left w:val="single" w:sz="5" w:color="B7C0C8"/>
-              <w:bottom w:val="single" w:sz="5" w:color="B7C0C8"/>
-              <w:right w:val="single" w:sz="5" w:color="B7C0C8"/>
-            </w:tcBorders>
-            <w:shd w:fill="F7F9FA"/>
-          </w:tcPr>
-          <w:p>
-            <w:r>
-              <w:rPr>
-                <w:rFonts w:ascii="Times New Roman" w:hAnsi="Times New Roman"/>
-                <w:sz w:val="19"/>
-              </w:rPr>
-              <w:t>Nơi thực tập</w:t>
-            </w:r>
-          </w:p>
-        </w:tc>
-        <w:tc>
-          <w:tcPr>
-            <w:tcW w:type="dxa" w:w="4535"/>
-            <w:tcBorders>
-              <w:top w:val="single" w:sz="5" w:color="B7C0C8"/>
-              <w:left w:val="single" w:sz="5" w:color="B7C0C8"/>
-              <w:bottom w:val="single" w:sz="5" w:color="B7C0C8"/>
-              <w:right w:val="single" w:sz="5" w:color="B7C0C8"/>
-            </w:tcBorders>
-            <w:shd w:fill="F7F9FA"/>
-          </w:tcPr>
-          <w:p>
-            <w:r>
-              <w:rPr>
-                <w:rFonts w:ascii="Times New Roman" w:hAnsi="Times New Roman"/>
-                <w:sz w:val="19"/>
-              </w:rPr>
-              <w:t>VinSmart Future</w:t>
-            </w:r>
-          </w:p>
-        </w:tc>
-      </w:tr>
-      <w:tr>
-        <w:tc>
-          <w:tcPr>
-            <w:tcW w:type="dxa" w:w="4535"/>
-            <w:tcBorders>
-              <w:top w:val="single" w:sz="5" w:color="B7C0C8"/>
-              <w:left w:val="single" w:sz="5" w:color="B7C0C8"/>
-              <w:bottom w:val="single" w:sz="5" w:color="B7C0C8"/>
-              <w:right w:val="single" w:sz="5" w:color="B7C0C8"/>
-            </w:tcBorders>
-          </w:tcPr>
-          <w:p>
-            <w:r>
-              <w:rPr>
-                <w:rFonts w:ascii="Times New Roman" w:hAnsi="Times New Roman"/>
-                <w:sz w:val="19"/>
-              </w:rPr>
-              <w:t>Thời gian báo cáo</w:t>
-            </w:r>
-          </w:p>
-        </w:tc>
-        <w:tc>
-          <w:tcPr>
-            <w:tcW w:type="dxa" w:w="4535"/>
-            <w:tcBorders>
-              <w:top w:val="single" w:sz="5" w:color="B7C0C8"/>
-              <w:left w:val="single" w:sz="5" w:color="B7C0C8"/>
-              <w:bottom w:val="single" w:sz="5" w:color="B7C0C8"/>
-              <w:right w:val="single" w:sz="5" w:color="B7C0C8"/>
-            </w:tcBorders>
-          </w:tcPr>
-          <w:p>
-            <w:r>
-              <w:rPr>
-                <w:rFonts w:ascii="Times New Roman" w:hAnsi="Times New Roman"/>
-                <w:sz w:val="19"/>
-              </w:rPr>
-              <w:t>21/09/2026 – 05/10/2026</w:t>
-            </w:r>
-          </w:p>
-        </w:tc>
-      </w:tr>
-      <w:tr>
-        <w:tc>
-          <w:tcPr>
-            <w:tcW w:type="dxa" w:w="4535"/>
-            <w:tcBorders>
-              <w:top w:val="single" w:sz="5" w:color="B7C0C8"/>
-              <w:left w:val="single" w:sz="5" w:color="B7C0C8"/>
-              <w:bottom w:val="single" w:sz="5" w:color="B7C0C8"/>
-              <w:right w:val="single" w:sz="5" w:color="B7C0C8"/>
-            </w:tcBorders>
-            <w:shd w:fill="F7F9FA"/>
-          </w:tcPr>
-          <w:p>
-            <w:r>
-              <w:rPr>
-                <w:rFonts w:ascii="Times New Roman" w:hAnsi="Times New Roman"/>
-                <w:sz w:val="19"/>
-              </w:rPr>
-              <w:t>Thời điểm đối chiếu minh chứng</w:t>
-            </w:r>
-          </w:p>
-        </w:tc>
-        <w:tc>
-          <w:tcPr>
-            <w:tcW w:type="dxa" w:w="4535"/>
-            <w:tcBorders>
-              <w:top w:val="single" w:sz="5" w:color="B7C0C8"/>
-              <w:left w:val="single" w:sz="5" w:color="B7C0C8"/>
-              <w:bottom w:val="single" w:sz="5" w:color="B7C0C8"/>
-              <w:right w:val="single" w:sz="5" w:color="B7C0C8"/>
-            </w:tcBorders>
-            <w:shd w:fill="F7F9FA"/>
-          </w:tcPr>
-          <w:p>
-            <w:r>
-              <w:rPr>
-                <w:rFonts w:ascii="Times New Roman" w:hAnsi="Times New Roman"/>
-                <w:sz w:val="19"/>
-              </w:rPr>
-              <w:t>04/10/2026</w:t>
-            </w:r>
-          </w:p>
-        </w:tc>
-      </w:tr>
-    </w:tbl>
-    <w:p>
-      <w:pPr>
-        <w:jc w:val="both"/>
-      </w:pPr>
       <w:r>
-        <w:t>Kính gửi Thầy Trần Thanh Hải,</w:t>
-      </w:r>
-    </w:p>
-    <w:p>
-      <w:pPr>
-        <w:jc w:val="both"/>
-      </w:pPr>
-      <w:r>
-        <w:t>Em xin báo cáo kết quả Mốc 2 theo bốn nhóm công việc Thầy giao. Sản phẩm trọng tâm là Web Prototype vận hành với mô hình U-Net đã khóa cấu hình, cho phép chuyên viên xem, chỉnh sửa và lưu mask phân đoạn. Các số liệu của bộ 307 ảnh Mốc 1 được giữ làm mốc tham chiếu; báo cáo này phân biệt rõ kết quả lịch sử Mốc 1 với các phép kiểm tra tích hợp mới.</w:t>
-      </w:r>
-    </w:p>
-    <w:p>
-      <w:pPr>
-        <w:pStyle w:val="Heading1"/>
-        <w:keepNext/>
-      </w:pPr>
-      <w:r>
-        <w:rPr>
-          <w:b/>
-          <w:sz w:val="28"/>
-        </w:rPr>
-        <w:t>I. THÔNG TIN CHUNG VÀ TỔNG QUAN TIẾN ĐỘ</w:t>
-      </w:r>
-    </w:p>
-    <w:p>
-      <w:pPr>
-        <w:pStyle w:val="Heading2"/>
-        <w:keepNext/>
-      </w:pPr>
-      <w:r>
-        <w:rPr>
-          <w:b/>
-          <w:sz w:val="25"/>
-        </w:rPr>
-        <w:t>1.1. Phạm vi kế thừa từ Mốc 1</w:t>
-      </w:r>
-    </w:p>
-    <w:p>
-      <w:pPr>
-        <w:jc w:val="both"/>
-      </w:pPr>
-      <w:hyperlink r:id="rId10">
-        <w:r>
-          <w:rPr>
-            <w:color w:val="17518A"/>
-          </w:rPr>
-          <w:t>Báo cáo Mốc 1</w:t>
-        </w:r>
-      </w:hyperlink>
-      <w:r>
-        <w:t xml:space="preserve"> sử dụng </w:t>
+        <w:t xml:space="preserve"> Nguyễn Hữu Dũng — </w:t>
       </w:r>
       <w:r>
         <w:rPr>
           <w:b/>
         </w:rPr>
-        <w:t>307 bản ghi</w:t>
+        <w:t>MSV:</w:t>
       </w:r>
       <w:r>
-        <w:t xml:space="preserve"> với phân chia </w:t>
-      </w:r>
-      <w:r>
-        <w:rPr>
-          <w:b/>
-        </w:rPr>
-        <w:t>215 Train / 46 Validation / 46 Test</w:t>
-      </w:r>
-      <w:r>
-        <w:t xml:space="preserve">. </w:t>
-      </w:r>
-      <w:hyperlink r:id="rId11">
-        <w:r>
-          <w:rPr>
-            <w:color w:val="17518A"/>
-          </w:rPr>
-          <w:t>Snapshot CSV Mốc 1</w:t>
-        </w:r>
-      </w:hyperlink>
-      <w:r>
-        <w:t xml:space="preserve"> và </w:t>
-      </w:r>
-      <w:hyperlink r:id="rId12">
-        <w:r>
-          <w:rPr>
-            <w:color w:val="17518A"/>
-          </w:rPr>
-          <w:t>biên bản kiểm toán dữ liệu</w:t>
-        </w:r>
-      </w:hyperlink>
-      <w:r>
-        <w:t xml:space="preserve"> xác nhận thành viên từng tập được giữ nguyên. Mốc 2 không chia lại 307 ảnh, không huấn luyện thêm trên bộ này và không dùng 46 ảnh Test để chọn mô hình hoặc ngưỡng.</w:t>
-      </w:r>
-    </w:p>
-    <w:p>
-      <w:pPr>
-        <w:jc w:val="both"/>
-      </w:pPr>
-      <w:r>
-        <w:t xml:space="preserve">Mô hình đang triển khai trên web có SHA-256 bắt đầu bằng </w:t>
-      </w:r>
-      <w:r>
-        <w:t>5e14be...</w:t>
-      </w:r>
-      <w:r>
-        <w:t xml:space="preserve">, thuộc lượt huấn luyện ngày 03/10 trên một bộ dữ liệu khác. Checkpoint lịch sử của Mốc 1 có SHA-256 bắt đầu bằng </w:t>
-      </w:r>
-      <w:r>
-        <w:t>44b862...</w:t>
-      </w:r>
-      <w:r>
-        <w:t xml:space="preserve"> và được </w:t>
-      </w:r>
-      <w:hyperlink r:id="rId13">
-        <w:r>
-          <w:rPr>
-            <w:color w:val="17518A"/>
-          </w:rPr>
-          <w:t>lưu riêng</w:t>
-        </w:r>
-      </w:hyperlink>
-      <w:r>
-        <w:t>. Cùng là Standard U-Net, nhưng hai bộ trọng số và các số liệu đánh giá đi kèm không thể thay thế cho nhau.</w:t>
-      </w:r>
-    </w:p>
-    <w:p>
-      <w:pPr>
-        <w:keepNext/>
-        <w:jc w:val="center"/>
-      </w:pPr>
-      <w:r>
-        <w:rPr>
-          <w:b/>
-        </w:rPr>
-        <w:t>Bảng 2. Đối chiếu nhiệm vụ Mốc 2 với kết quả có minh chứng</w:t>
-      </w:r>
-    </w:p>
-    <w:tbl>
-      <w:tblPr>
-        <w:tblStyle w:val="TableGrid"/>
-        <w:tblW w:type="auto" w:w="0"/>
-        <w:jc w:val="center"/>
-        <w:tblLayout w:type="autofit"/>
-        <w:tblLook w:firstColumn="1" w:firstRow="1" w:lastColumn="0" w:lastRow="0" w:noHBand="0" w:noVBand="1" w:val="04A0"/>
-      </w:tblPr>
-      <w:tblGrid>
-        <w:gridCol w:w="3024"/>
-        <w:gridCol w:w="3024"/>
-        <w:gridCol w:w="3024"/>
-      </w:tblGrid>
-      <w:tr>
-        <w:tc>
-          <w:tcPr>
-            <w:tcW w:type="dxa" w:w="3024"/>
-            <w:tcBorders>
-              <w:top w:val="single" w:sz="5" w:color="B7C0C8"/>
-              <w:left w:val="single" w:sz="5" w:color="B7C0C8"/>
-              <w:bottom w:val="single" w:sz="5" w:color="B7C0C8"/>
-              <w:right w:val="single" w:sz="5" w:color="B7C0C8"/>
-            </w:tcBorders>
-            <w:shd w:fill="E9EDF1"/>
-          </w:tcPr>
-          <w:p>
-            <w:pPr>
-              <w:keepNext/>
-              <w:jc w:val="center"/>
-            </w:pPr>
-            <w:r>
-              <w:rPr>
-                <w:rFonts w:ascii="Times New Roman" w:hAnsi="Times New Roman"/>
-                <w:b/>
-                <w:sz w:val="19"/>
-              </w:rPr>
-              <w:t>Nhiệm vụ Thầy giao</w:t>
-            </w:r>
-          </w:p>
-        </w:tc>
-        <w:tc>
-          <w:tcPr>
-            <w:tcW w:type="dxa" w:w="3024"/>
-            <w:tcBorders>
-              <w:top w:val="single" w:sz="5" w:color="B7C0C8"/>
-              <w:left w:val="single" w:sz="5" w:color="B7C0C8"/>
-              <w:bottom w:val="single" w:sz="5" w:color="B7C0C8"/>
-              <w:right w:val="single" w:sz="5" w:color="B7C0C8"/>
-            </w:tcBorders>
-            <w:shd w:fill="E9EDF1"/>
-          </w:tcPr>
-          <w:p>
-            <w:pPr>
-              <w:keepNext/>
-              <w:jc w:val="center"/>
-            </w:pPr>
-            <w:r>
-              <w:rPr>
-                <w:rFonts w:ascii="Times New Roman" w:hAnsi="Times New Roman"/>
-                <w:b/>
-                <w:sz w:val="19"/>
-              </w:rPr>
-              <w:t>Kết quả thực hiện</w:t>
-            </w:r>
-          </w:p>
-        </w:tc>
-        <w:tc>
-          <w:tcPr>
-            <w:tcW w:type="dxa" w:w="3024"/>
-            <w:tcBorders>
-              <w:top w:val="single" w:sz="5" w:color="B7C0C8"/>
-              <w:left w:val="single" w:sz="5" w:color="B7C0C8"/>
-              <w:bottom w:val="single" w:sz="5" w:color="B7C0C8"/>
-              <w:right w:val="single" w:sz="5" w:color="B7C0C8"/>
-            </w:tcBorders>
-            <w:shd w:fill="E9EDF1"/>
-          </w:tcPr>
-          <w:p>
-            <w:pPr>
-              <w:keepNext/>
-              <w:jc w:val="center"/>
-            </w:pPr>
-            <w:r>
-              <w:rPr>
-                <w:rFonts w:ascii="Times New Roman" w:hAnsi="Times New Roman"/>
-                <w:b/>
-                <w:sz w:val="19"/>
-              </w:rPr>
-              <w:t>Trạng thái</w:t>
-            </w:r>
-          </w:p>
-        </w:tc>
-      </w:tr>
-      <w:tr>
-        <w:tc>
-          <w:tcPr>
-            <w:tcW w:type="dxa" w:w="3024"/>
-            <w:tcBorders>
-              <w:top w:val="single" w:sz="5" w:color="B7C0C8"/>
-              <w:left w:val="single" w:sz="5" w:color="B7C0C8"/>
-              <w:bottom w:val="single" w:sz="5" w:color="B7C0C8"/>
-              <w:right w:val="single" w:sz="5" w:color="B7C0C8"/>
-            </w:tcBorders>
-          </w:tcPr>
-          <w:p>
-            <w:r>
-              <w:rPr>
-                <w:rFonts w:ascii="Times New Roman" w:hAnsi="Times New Roman"/>
-                <w:sz w:val="19"/>
-              </w:rPr>
-              <w:t>Đánh giá và tinh chỉnh U-Net (tên nhiệm vụ Thầy giao)</w:t>
-            </w:r>
-          </w:p>
-        </w:tc>
-        <w:tc>
-          <w:tcPr>
-            <w:tcW w:type="dxa" w:w="3024"/>
-            <w:tcBorders>
-              <w:top w:val="single" w:sz="5" w:color="B7C0C8"/>
-              <w:left w:val="single" w:sz="5" w:color="B7C0C8"/>
-              <w:bottom w:val="single" w:sz="5" w:color="B7C0C8"/>
-              <w:right w:val="single" w:sz="5" w:color="B7C0C8"/>
-            </w:tcBorders>
-          </w:tcPr>
-          <w:p>
-            <w:r>
-              <w:rPr>
-                <w:rFonts w:ascii="Times New Roman" w:hAnsi="Times New Roman"/>
-                <w:b/>
-                <w:sz w:val="19"/>
-              </w:rPr>
-              <w:t>Mốc 2 không thực hiện tinh chỉnh mới trên 307 ảnh.</w:t>
-            </w:r>
-            <w:r>
-              <w:rPr>
-                <w:rFonts w:ascii="Times New Roman" w:hAnsi="Times New Roman"/>
-                <w:sz w:val="19"/>
-              </w:rPr>
-              <w:t xml:space="preserve"> Công việc đã làm là đối chiếu baseline Mốc 1, khóa checkpoint và ngưỡng của prototype, rồi kiểm tra nạp trọng số và suy diễn trên 46 ảnh Validation Mốc 1.</w:t>
-            </w:r>
-          </w:p>
-        </w:tc>
-        <w:tc>
-          <w:tcPr>
-            <w:tcW w:type="dxa" w:w="3024"/>
-            <w:tcBorders>
-              <w:top w:val="single" w:sz="5" w:color="B7C0C8"/>
-              <w:left w:val="single" w:sz="5" w:color="B7C0C8"/>
-              <w:bottom w:val="single" w:sz="5" w:color="B7C0C8"/>
-              <w:right w:val="single" w:sz="5" w:color="B7C0C8"/>
-            </w:tcBorders>
-          </w:tcPr>
-          <w:p>
-            <w:r>
-              <w:rPr>
-                <w:rFonts w:ascii="Times New Roman" w:hAnsi="Times New Roman"/>
-                <w:b/>
-                <w:sz w:val="19"/>
-              </w:rPr>
-              <w:t>Hoàn thành phần đánh giá và khóa cấu hình</w:t>
-            </w:r>
-          </w:p>
-        </w:tc>
-      </w:tr>
-      <w:tr>
-        <w:tc>
-          <w:tcPr>
-            <w:tcW w:type="dxa" w:w="3024"/>
-            <w:tcBorders>
-              <w:top w:val="single" w:sz="5" w:color="B7C0C8"/>
-              <w:left w:val="single" w:sz="5" w:color="B7C0C8"/>
-              <w:bottom w:val="single" w:sz="5" w:color="B7C0C8"/>
-              <w:right w:val="single" w:sz="5" w:color="B7C0C8"/>
-            </w:tcBorders>
-            <w:shd w:fill="F7F9FA"/>
-          </w:tcPr>
-          <w:p>
-            <w:r>
-              <w:rPr>
-                <w:rFonts w:ascii="Times New Roman" w:hAnsi="Times New Roman"/>
-                <w:sz w:val="19"/>
-              </w:rPr>
-              <w:t>Khảo sát kiến trúc, chọn mô hình</w:t>
-            </w:r>
-          </w:p>
-        </w:tc>
-        <w:tc>
-          <w:tcPr>
-            <w:tcW w:type="dxa" w:w="3024"/>
-            <w:tcBorders>
-              <w:top w:val="single" w:sz="5" w:color="B7C0C8"/>
-              <w:left w:val="single" w:sz="5" w:color="B7C0C8"/>
-              <w:bottom w:val="single" w:sz="5" w:color="B7C0C8"/>
-              <w:right w:val="single" w:sz="5" w:color="B7C0C8"/>
-            </w:tcBorders>
-            <w:shd w:fill="F7F9FA"/>
-          </w:tcPr>
-          <w:p>
-            <w:r>
-              <w:rPr>
-                <w:rFonts w:ascii="Times New Roman" w:hAnsi="Times New Roman"/>
-                <w:sz w:val="19"/>
-              </w:rPr>
-              <w:t xml:space="preserve">Chọn Standard U-Net </w:t>
-            </w:r>
-            <w:r>
-              <w:rPr>
-                <w:rFonts w:ascii="Times New Roman" w:hAnsi="Times New Roman"/>
-                <w:sz w:val="19"/>
-              </w:rPr>
-              <w:t>5e14be...</w:t>
-            </w:r>
-            <w:r>
-              <w:rPr>
-                <w:rFonts w:ascii="Times New Roman" w:hAnsi="Times New Roman"/>
-                <w:sz w:val="19"/>
-              </w:rPr>
-              <w:t xml:space="preserve"> làm mô hình lõi tích hợp. So sánh định lượng với kiến trúc mở rộng trên cùng một tập dữ liệu chưa được thực hiện.</w:t>
-            </w:r>
-          </w:p>
-        </w:tc>
-        <w:tc>
-          <w:tcPr>
-            <w:tcW w:type="dxa" w:w="3024"/>
-            <w:tcBorders>
-              <w:top w:val="single" w:sz="5" w:color="B7C0C8"/>
-              <w:left w:val="single" w:sz="5" w:color="B7C0C8"/>
-              <w:bottom w:val="single" w:sz="5" w:color="B7C0C8"/>
-              <w:right w:val="single" w:sz="5" w:color="B7C0C8"/>
-            </w:tcBorders>
-            <w:shd w:fill="F7F9FA"/>
-          </w:tcPr>
-          <w:p>
-            <w:r>
-              <w:rPr>
-                <w:rFonts w:ascii="Times New Roman" w:hAnsi="Times New Roman"/>
-                <w:b/>
-                <w:sz w:val="19"/>
-              </w:rPr>
-              <w:t>Đạt yêu cầu lựa chọn mô hình cho prototype</w:t>
-            </w:r>
-          </w:p>
-        </w:tc>
-      </w:tr>
-      <w:tr>
-        <w:tc>
-          <w:tcPr>
-            <w:tcW w:type="dxa" w:w="3024"/>
-            <w:tcBorders>
-              <w:top w:val="single" w:sz="5" w:color="B7C0C8"/>
-              <w:left w:val="single" w:sz="5" w:color="B7C0C8"/>
-              <w:bottom w:val="single" w:sz="5" w:color="B7C0C8"/>
-              <w:right w:val="single" w:sz="5" w:color="B7C0C8"/>
-            </w:tcBorders>
-          </w:tcPr>
-          <w:p>
-            <w:r>
-              <w:rPr>
-                <w:rFonts w:ascii="Times New Roman" w:hAnsi="Times New Roman"/>
-                <w:sz w:val="19"/>
-              </w:rPr>
-              <w:t>Xây dựng Web Prototype</w:t>
-            </w:r>
-          </w:p>
-        </w:tc>
-        <w:tc>
-          <w:tcPr>
-            <w:tcW w:type="dxa" w:w="3024"/>
-            <w:tcBorders>
-              <w:top w:val="single" w:sz="5" w:color="B7C0C8"/>
-              <w:left w:val="single" w:sz="5" w:color="B7C0C8"/>
-              <w:bottom w:val="single" w:sz="5" w:color="B7C0C8"/>
-              <w:right w:val="single" w:sz="5" w:color="B7C0C8"/>
-            </w:tcBorders>
-          </w:tcPr>
-          <w:p>
-            <w:r>
-              <w:rPr>
-                <w:rFonts w:ascii="Times New Roman" w:hAnsi="Times New Roman"/>
-                <w:sz w:val="19"/>
-              </w:rPr>
-              <w:t>Hoàn thiện luồng Upload → Segmentation → Viewer → Review/Edit → Confirm/Save; kiểm thử trình duyệt trên ảnh Validation Mốc 1.</w:t>
-            </w:r>
-          </w:p>
-        </w:tc>
-        <w:tc>
-          <w:tcPr>
-            <w:tcW w:type="dxa" w:w="3024"/>
-            <w:tcBorders>
-              <w:top w:val="single" w:sz="5" w:color="B7C0C8"/>
-              <w:left w:val="single" w:sz="5" w:color="B7C0C8"/>
-              <w:bottom w:val="single" w:sz="5" w:color="B7C0C8"/>
-              <w:right w:val="single" w:sz="5" w:color="B7C0C8"/>
-            </w:tcBorders>
-          </w:tcPr>
-          <w:p>
-            <w:r>
-              <w:rPr>
-                <w:rFonts w:ascii="Times New Roman" w:hAnsi="Times New Roman"/>
-                <w:b/>
-                <w:sz w:val="19"/>
-              </w:rPr>
-              <w:t>Hoàn thành luồng chức năng</w:t>
-            </w:r>
-          </w:p>
-        </w:tc>
-      </w:tr>
-      <w:tr>
-        <w:tc>
-          <w:tcPr>
-            <w:tcW w:type="dxa" w:w="3024"/>
-            <w:tcBorders>
-              <w:top w:val="single" w:sz="5" w:color="B7C0C8"/>
-              <w:left w:val="single" w:sz="5" w:color="B7C0C8"/>
-              <w:bottom w:val="single" w:sz="5" w:color="B7C0C8"/>
-              <w:right w:val="single" w:sz="5" w:color="B7C0C8"/>
-            </w:tcBorders>
-            <w:shd w:fill="F7F9FA"/>
-          </w:tcPr>
-          <w:p>
-            <w:r>
-              <w:rPr>
-                <w:rFonts w:ascii="Times New Roman" w:hAnsi="Times New Roman"/>
-                <w:sz w:val="19"/>
-              </w:rPr>
-              <w:t>Hoàn thiện Human-in-the-Loop</w:t>
-            </w:r>
-          </w:p>
-        </w:tc>
-        <w:tc>
-          <w:tcPr>
-            <w:tcW w:type="dxa" w:w="3024"/>
-            <w:tcBorders>
-              <w:top w:val="single" w:sz="5" w:color="B7C0C8"/>
-              <w:left w:val="single" w:sz="5" w:color="B7C0C8"/>
-              <w:bottom w:val="single" w:sz="5" w:color="B7C0C8"/>
-              <w:right w:val="single" w:sz="5" w:color="B7C0C8"/>
-            </w:tcBorders>
-            <w:shd w:fill="F7F9FA"/>
-          </w:tcPr>
-          <w:p>
-            <w:r>
-              <w:rPr>
-                <w:rFonts w:ascii="Times New Roman" w:hAnsi="Times New Roman"/>
-                <w:sz w:val="19"/>
-              </w:rPr>
-              <w:t>Có Brush, Eraser, điều chỉnh cỡ nét, Undo/Redo, xác nhận, lưu và mở lại mask đã rà soát.</w:t>
-            </w:r>
-          </w:p>
-        </w:tc>
-        <w:tc>
-          <w:tcPr>
-            <w:tcW w:type="dxa" w:w="3024"/>
-            <w:tcBorders>
-              <w:top w:val="single" w:sz="5" w:color="B7C0C8"/>
-              <w:left w:val="single" w:sz="5" w:color="B7C0C8"/>
-              <w:bottom w:val="single" w:sz="5" w:color="B7C0C8"/>
-              <w:right w:val="single" w:sz="5" w:color="B7C0C8"/>
-            </w:tcBorders>
-            <w:shd w:fill="F7F9FA"/>
-          </w:tcPr>
-          <w:p>
-            <w:r>
-              <w:rPr>
-                <w:rFonts w:ascii="Times New Roman" w:hAnsi="Times New Roman"/>
-                <w:b/>
-                <w:sz w:val="19"/>
-              </w:rPr>
-              <w:t>Hoàn thành chức năng kỹ thuật</w:t>
-            </w:r>
-          </w:p>
-        </w:tc>
-      </w:tr>
-    </w:tbl>
-    <w:p>
-      <w:pPr>
-        <w:pStyle w:val="Heading1"/>
-        <w:keepNext/>
-      </w:pPr>
-      <w:r>
-        <w:rPr>
-          <w:b/>
-          <w:sz w:val="28"/>
-        </w:rPr>
-        <w:t>II. HOÀN THIỆN MÔ HÌNH LÕI PHÂN ĐOẠN</w:t>
-      </w:r>
-    </w:p>
-    <w:p>
-      <w:pPr>
-        <w:pStyle w:val="Heading2"/>
-        <w:keepNext/>
-      </w:pPr>
-      <w:r>
-        <w:rPr>
-          <w:b/>
-          <w:sz w:val="25"/>
-        </w:rPr>
-        <w:t>2.1. Kiến trúc, trọng số và khả năng nạp mô hình</w:t>
-      </w:r>
-    </w:p>
-    <w:p>
-      <w:pPr>
-        <w:jc w:val="both"/>
-      </w:pPr>
-      <w:r>
-        <w:t xml:space="preserve">Prototype sử dụng Standard U-Net đầu vào một kênh grayscale. </w:t>
-      </w:r>
-      <w:hyperlink r:id="rId14">
-        <w:r>
-          <w:rPr>
-            <w:color w:val="17518A"/>
-          </w:rPr>
-          <w:t>Cấu hình mô hình được chọn</w:t>
-        </w:r>
-      </w:hyperlink>
-      <w:r>
-        <w:t xml:space="preserve"> khóa đường dẫn </w:t>
-      </w:r>
-      <w:r>
-        <w:t>checkpoints/baseline_unet_best.pth</w:t>
-      </w:r>
-      <w:r>
-        <w:t xml:space="preserve">, ngưỡng nhị phân </w:t>
-      </w:r>
-      <w:r>
-        <w:rPr>
-          <w:b/>
-        </w:rPr>
-        <w:t>0,5</w:t>
-      </w:r>
-      <w:r>
-        <w:t xml:space="preserve"> và SHA-256 </w:t>
-      </w:r>
-      <w:r>
-        <w:t>5e14be07240966f74de91d3467edbf88a08ca07b6577081787c6abd6dede494e</w:t>
-      </w:r>
-      <w:r>
-        <w:t xml:space="preserve">. Tên file tại đường dẫn triển khai là quy ước của ứng dụng; checkpoint này khác checkpoint baseline lịch sử Mốc 1. Báo cáo gọi đây là </w:t>
-      </w:r>
-      <w:r>
-        <w:rPr>
-          <w:b/>
-        </w:rPr>
-        <w:t>checkpoint tích hợp hiện hành</w:t>
-      </w:r>
-      <w:r>
-        <w:t xml:space="preserve"> để tránh hàm ý đã tinh chỉnh lại mô hình trên 307 ảnh.</w:t>
-      </w:r>
-    </w:p>
-    <w:p>
-      <w:pPr>
-        <w:jc w:val="both"/>
-      </w:pPr>
-      <w:r>
-        <w:t xml:space="preserve">Theo manifest, checkpoint </w:t>
-      </w:r>
-      <w:r>
-        <w:t>5e14be...</w:t>
-      </w:r>
-      <w:r>
-        <w:t xml:space="preserve"> được chọn từ </w:t>
-      </w:r>
-      <w:r>
-        <w:rPr>
-          <w:b/>
-        </w:rPr>
-        <w:t>123 ảnh Validation của lượt huấn luyện tương ứng</w:t>
-      </w:r>
-      <w:r>
-        <w:t>, không phải từ 46 ảnh Validation Mốc 1. Bộ 46 ảnh của Mốc 1 trong báo cáo này chỉ dùng để kiểm tra khả năng nạp và suy diễn trên prototype; không dùng để chọn lại checkpoint hoặc ngưỡng.</w:t>
-      </w:r>
-    </w:p>
-    <w:p>
-      <w:pPr>
-        <w:jc w:val="both"/>
-      </w:pPr>
-      <w:hyperlink r:id="rId15">
-        <w:r>
-          <w:rPr>
-            <w:color w:val="17518A"/>
-          </w:rPr>
-          <w:t>Log kiểm tra Validation Mốc 1</w:t>
-        </w:r>
-      </w:hyperlink>
-      <w:r>
-        <w:t xml:space="preserve"> ghi nhận </w:t>
-      </w:r>
-      <w:r>
-        <w:t>load_state_dict(strict=True)</w:t>
-      </w:r>
-      <w:r>
-        <w:t xml:space="preserve"> thành công, </w:t>
-      </w:r>
-      <w:r>
-        <w:rPr>
-          <w:b/>
-        </w:rPr>
-        <w:t>0 key thiếu, 0 key thừa</w:t>
-      </w:r>
-      <w:r>
-        <w:t xml:space="preserve"> và </w:t>
-      </w:r>
-      <w:r>
-        <w:rPr>
-          <w:b/>
-        </w:rPr>
-        <w:t>46/46 ảnh</w:t>
-      </w:r>
-      <w:r>
-        <w:t xml:space="preserve"> cho đầu ra kích thước 512×512. Đây là kiểm tra tính tương thích của trọng số và luồng suy diễn; log không tính Dice hoặc các chỉ số phân đoạn từ mask dẫn xuất.</w:t>
-      </w:r>
-    </w:p>
-    <w:p>
-      <w:pPr>
-        <w:jc w:val="both"/>
-      </w:pPr>
-      <w:r>
-        <w:t xml:space="preserve">Đầu vào được giải mã bằng OpenCV ở chế độ grayscale, giữ tỷ lệ ảnh qua letterbox 512×512, tăng cường tương phản bằng CLAHE và chuẩn hóa pixel về [0, 1]. </w:t>
-      </w:r>
-      <w:hyperlink r:id="rId16">
-        <w:r>
-          <w:rPr>
-            <w:color w:val="17518A"/>
-          </w:rPr>
-          <w:t>Loader huấn luyện</w:t>
-        </w:r>
-      </w:hyperlink>
-      <w:r>
-        <w:t xml:space="preserve"> và </w:t>
-      </w:r>
-      <w:hyperlink r:id="rId17">
-        <w:r>
-          <w:rPr>
-            <w:color w:val="17518A"/>
-          </w:rPr>
-          <w:t>bộ tiền xử lý API</w:t>
-        </w:r>
-      </w:hyperlink>
-      <w:r>
-        <w:t xml:space="preserve"> dùng cùng các thao tác chính này. Báo cáo Mốc 1 mô tả thêm bước cắt vùng quạt siêu âm trước letterbox; loader hiện lưu trong repo không gọi bước cắt đó, vì vậy chưa thể khẳng định tái lập bit-to-bit toàn bộ tiền xử lý của lượt huấn luyện Mốc 1.</w:t>
-      </w:r>
-    </w:p>
-    <w:p>
-      <w:pPr>
-        <w:pStyle w:val="Heading2"/>
-        <w:keepNext/>
-      </w:pPr>
-      <w:r>
-        <w:rPr>
-          <w:b/>
-          <w:sz w:val="25"/>
-        </w:rPr>
-        <w:t>2.2. Số liệu baseline Mốc 1 và phạm vi sử dụng</w:t>
-      </w:r>
-    </w:p>
-    <w:p>
-      <w:pPr>
-        <w:keepNext/>
-        <w:jc w:val="center"/>
-      </w:pPr>
-      <w:r>
-        <w:rPr>
-          <w:b/>
-        </w:rPr>
-        <w:t>Bảng 3. Các Segmentation Metrics lịch sử của Mốc 1, chỉ dùng để đối chiếu</w:t>
-      </w:r>
-    </w:p>
-    <w:tbl>
-      <w:tblPr>
-        <w:tblStyle w:val="TableGrid"/>
-        <w:tblW w:type="auto" w:w="0"/>
-        <w:jc w:val="center"/>
-        <w:tblLayout w:type="autofit"/>
-        <w:tblLook w:firstColumn="1" w:firstRow="1" w:lastColumn="0" w:lastRow="0" w:noHBand="0" w:noVBand="1" w:val="04A0"/>
-      </w:tblPr>
-      <w:tblGrid>
-        <w:gridCol w:w="3024"/>
-        <w:gridCol w:w="3024"/>
-        <w:gridCol w:w="3024"/>
-      </w:tblGrid>
-      <w:tr>
-        <w:tc>
-          <w:tcPr>
-            <w:tcW w:type="dxa" w:w="3024"/>
-            <w:tcBorders>
-              <w:top w:val="single" w:sz="5" w:color="B7C0C8"/>
-              <w:left w:val="single" w:sz="5" w:color="B7C0C8"/>
-              <w:bottom w:val="single" w:sz="5" w:color="B7C0C8"/>
-              <w:right w:val="single" w:sz="5" w:color="B7C0C8"/>
-            </w:tcBorders>
-            <w:shd w:fill="E9EDF1"/>
-          </w:tcPr>
-          <w:p>
-            <w:pPr>
-              <w:keepNext/>
-              <w:jc w:val="center"/>
-            </w:pPr>
-            <w:r>
-              <w:rPr>
-                <w:rFonts w:ascii="Times New Roman" w:hAnsi="Times New Roman"/>
-                <w:b/>
-                <w:sz w:val="19"/>
-              </w:rPr>
-              <w:t>Chỉ số</w:t>
-            </w:r>
-          </w:p>
-        </w:tc>
-        <w:tc>
-          <w:tcPr>
-            <w:tcW w:type="dxa" w:w="3024"/>
-            <w:tcBorders>
-              <w:top w:val="single" w:sz="5" w:color="B7C0C8"/>
-              <w:left w:val="single" w:sz="5" w:color="B7C0C8"/>
-              <w:bottom w:val="single" w:sz="5" w:color="B7C0C8"/>
-              <w:right w:val="single" w:sz="5" w:color="B7C0C8"/>
-            </w:tcBorders>
-            <w:shd w:fill="E9EDF1"/>
-          </w:tcPr>
-          <w:p>
-            <w:pPr>
-              <w:keepNext/>
-              <w:jc w:val="center"/>
-            </w:pPr>
-            <w:r>
-              <w:rPr>
-                <w:rFonts w:ascii="Times New Roman" w:hAnsi="Times New Roman"/>
-                <w:b/>
-                <w:sz w:val="19"/>
-              </w:rPr>
-              <w:t>Giá trị Mốc 1</w:t>
-            </w:r>
-          </w:p>
-        </w:tc>
-        <w:tc>
-          <w:tcPr>
-            <w:tcW w:type="dxa" w:w="3024"/>
-            <w:tcBorders>
-              <w:top w:val="single" w:sz="5" w:color="B7C0C8"/>
-              <w:left w:val="single" w:sz="5" w:color="B7C0C8"/>
-              <w:bottom w:val="single" w:sz="5" w:color="B7C0C8"/>
-              <w:right w:val="single" w:sz="5" w:color="B7C0C8"/>
-            </w:tcBorders>
-            <w:shd w:fill="E9EDF1"/>
-          </w:tcPr>
-          <w:p>
-            <w:pPr>
-              <w:keepNext/>
-              <w:jc w:val="center"/>
-            </w:pPr>
-            <w:r>
-              <w:rPr>
-                <w:rFonts w:ascii="Times New Roman" w:hAnsi="Times New Roman"/>
-                <w:b/>
-                <w:sz w:val="19"/>
-              </w:rPr>
-              <w:t>Phạm vi</w:t>
-            </w:r>
-          </w:p>
-        </w:tc>
-      </w:tr>
-      <w:tr>
-        <w:tc>
-          <w:tcPr>
-            <w:tcW w:type="dxa" w:w="3024"/>
-            <w:tcBorders>
-              <w:top w:val="single" w:sz="5" w:color="B7C0C8"/>
-              <w:left w:val="single" w:sz="5" w:color="B7C0C8"/>
-              <w:bottom w:val="single" w:sz="5" w:color="B7C0C8"/>
-              <w:right w:val="single" w:sz="5" w:color="B7C0C8"/>
-            </w:tcBorders>
-          </w:tcPr>
-          <w:p>
-            <w:r>
-              <w:rPr>
-                <w:rFonts w:ascii="Times New Roman" w:hAnsi="Times New Roman"/>
-                <w:sz w:val="19"/>
-              </w:rPr>
-              <w:t>Validation Dice</w:t>
-            </w:r>
-          </w:p>
-        </w:tc>
-        <w:tc>
-          <w:tcPr>
-            <w:tcW w:type="dxa" w:w="3024"/>
-            <w:tcBorders>
-              <w:top w:val="single" w:sz="5" w:color="B7C0C8"/>
-              <w:left w:val="single" w:sz="5" w:color="B7C0C8"/>
-              <w:bottom w:val="single" w:sz="5" w:color="B7C0C8"/>
-              <w:right w:val="single" w:sz="5" w:color="B7C0C8"/>
-            </w:tcBorders>
-          </w:tcPr>
-          <w:p>
-            <w:r>
-              <w:rPr>
-                <w:rFonts w:ascii="Times New Roman" w:hAnsi="Times New Roman"/>
-                <w:sz w:val="19"/>
-              </w:rPr>
-              <w:t>0,5830</w:t>
-            </w:r>
-          </w:p>
-        </w:tc>
-        <w:tc>
-          <w:tcPr>
-            <w:tcW w:type="dxa" w:w="3024"/>
-            <w:tcBorders>
-              <w:top w:val="single" w:sz="5" w:color="B7C0C8"/>
-              <w:left w:val="single" w:sz="5" w:color="B7C0C8"/>
-              <w:bottom w:val="single" w:sz="5" w:color="B7C0C8"/>
-              <w:right w:val="single" w:sz="5" w:color="B7C0C8"/>
-            </w:tcBorders>
-          </w:tcPr>
-          <w:p>
-            <w:r>
-              <w:rPr>
-                <w:rFonts w:ascii="Times New Roman" w:hAnsi="Times New Roman"/>
-                <w:sz w:val="19"/>
-              </w:rPr>
-              <w:t>46 ảnh Validation Mốc 1</w:t>
-            </w:r>
-          </w:p>
-        </w:tc>
-      </w:tr>
-      <w:tr>
-        <w:tc>
-          <w:tcPr>
-            <w:tcW w:type="dxa" w:w="3024"/>
-            <w:tcBorders>
-              <w:top w:val="single" w:sz="5" w:color="B7C0C8"/>
-              <w:left w:val="single" w:sz="5" w:color="B7C0C8"/>
-              <w:bottom w:val="single" w:sz="5" w:color="B7C0C8"/>
-              <w:right w:val="single" w:sz="5" w:color="B7C0C8"/>
-            </w:tcBorders>
-            <w:shd w:fill="F7F9FA"/>
-          </w:tcPr>
-          <w:p>
-            <w:r>
-              <w:rPr>
-                <w:rFonts w:ascii="Times New Roman" w:hAnsi="Times New Roman"/>
-                <w:sz w:val="19"/>
-              </w:rPr>
-              <w:t>Foreground Dice</w:t>
-            </w:r>
-          </w:p>
-        </w:tc>
-        <w:tc>
-          <w:tcPr>
-            <w:tcW w:type="dxa" w:w="3024"/>
-            <w:tcBorders>
-              <w:top w:val="single" w:sz="5" w:color="B7C0C8"/>
-              <w:left w:val="single" w:sz="5" w:color="B7C0C8"/>
-              <w:bottom w:val="single" w:sz="5" w:color="B7C0C8"/>
-              <w:right w:val="single" w:sz="5" w:color="B7C0C8"/>
-            </w:tcBorders>
-            <w:shd w:fill="F7F9FA"/>
-          </w:tcPr>
-          <w:p>
-            <w:r>
-              <w:rPr>
-                <w:rFonts w:ascii="Times New Roman" w:hAnsi="Times New Roman"/>
-                <w:sz w:val="19"/>
-              </w:rPr>
-              <w:t>0,5719 ± 0,2482</w:t>
-            </w:r>
-          </w:p>
-        </w:tc>
-        <w:tc>
-          <w:tcPr>
-            <w:tcW w:type="dxa" w:w="3024"/>
-            <w:tcBorders>
-              <w:top w:val="single" w:sz="5" w:color="B7C0C8"/>
-              <w:left w:val="single" w:sz="5" w:color="B7C0C8"/>
-              <w:bottom w:val="single" w:sz="5" w:color="B7C0C8"/>
-              <w:right w:val="single" w:sz="5" w:color="B7C0C8"/>
-            </w:tcBorders>
-            <w:shd w:fill="F7F9FA"/>
-          </w:tcPr>
-          <w:p>
-            <w:r>
-              <w:rPr>
-                <w:rFonts w:ascii="Times New Roman" w:hAnsi="Times New Roman"/>
-                <w:sz w:val="19"/>
-              </w:rPr>
-              <w:t>41 bản ghi có mask tổn thương trong 46 ảnh Test Mốc 1</w:t>
-            </w:r>
-          </w:p>
-        </w:tc>
-      </w:tr>
-      <w:tr>
-        <w:tc>
-          <w:tcPr>
-            <w:tcW w:type="dxa" w:w="3024"/>
-            <w:tcBorders>
-              <w:top w:val="single" w:sz="5" w:color="B7C0C8"/>
-              <w:left w:val="single" w:sz="5" w:color="B7C0C8"/>
-              <w:bottom w:val="single" w:sz="5" w:color="B7C0C8"/>
-              <w:right w:val="single" w:sz="5" w:color="B7C0C8"/>
-            </w:tcBorders>
-          </w:tcPr>
-          <w:p>
-            <w:r>
-              <w:rPr>
-                <w:rFonts w:ascii="Times New Roman" w:hAnsi="Times New Roman"/>
-                <w:sz w:val="19"/>
-              </w:rPr>
-              <w:t>IoU</w:t>
-            </w:r>
-          </w:p>
-        </w:tc>
-        <w:tc>
-          <w:tcPr>
-            <w:tcW w:type="dxa" w:w="3024"/>
-            <w:tcBorders>
-              <w:top w:val="single" w:sz="5" w:color="B7C0C8"/>
-              <w:left w:val="single" w:sz="5" w:color="B7C0C8"/>
-              <w:bottom w:val="single" w:sz="5" w:color="B7C0C8"/>
-              <w:right w:val="single" w:sz="5" w:color="B7C0C8"/>
-            </w:tcBorders>
-          </w:tcPr>
-          <w:p>
-            <w:r>
-              <w:rPr>
-                <w:rFonts w:ascii="Times New Roman" w:hAnsi="Times New Roman"/>
-                <w:sz w:val="19"/>
-              </w:rPr>
-              <w:t>0,4405 ± 0,2341</w:t>
-            </w:r>
-          </w:p>
-        </w:tc>
-        <w:tc>
-          <w:tcPr>
-            <w:tcW w:type="dxa" w:w="3024"/>
-            <w:tcBorders>
-              <w:top w:val="single" w:sz="5" w:color="B7C0C8"/>
-              <w:left w:val="single" w:sz="5" w:color="B7C0C8"/>
-              <w:bottom w:val="single" w:sz="5" w:color="B7C0C8"/>
-              <w:right w:val="single" w:sz="5" w:color="B7C0C8"/>
-            </w:tcBorders>
-          </w:tcPr>
-          <w:p>
-            <w:r>
-              <w:rPr>
-                <w:rFonts w:ascii="Times New Roman" w:hAnsi="Times New Roman"/>
-                <w:sz w:val="19"/>
-              </w:rPr>
-              <w:t>Cùng 41 bản ghi có mask tổn thương</w:t>
-            </w:r>
-          </w:p>
-        </w:tc>
-      </w:tr>
-      <w:tr>
-        <w:tc>
-          <w:tcPr>
-            <w:tcW w:type="dxa" w:w="3024"/>
-            <w:tcBorders>
-              <w:top w:val="single" w:sz="5" w:color="B7C0C8"/>
-              <w:left w:val="single" w:sz="5" w:color="B7C0C8"/>
-              <w:bottom w:val="single" w:sz="5" w:color="B7C0C8"/>
-              <w:right w:val="single" w:sz="5" w:color="B7C0C8"/>
-            </w:tcBorders>
-            <w:shd w:fill="F7F9FA"/>
-          </w:tcPr>
-          <w:p>
-            <w:r>
-              <w:rPr>
-                <w:rFonts w:ascii="Times New Roman" w:hAnsi="Times New Roman"/>
-                <w:sz w:val="19"/>
-              </w:rPr>
-              <w:t>Recall</w:t>
-            </w:r>
-          </w:p>
-        </w:tc>
-        <w:tc>
-          <w:tcPr>
-            <w:tcW w:type="dxa" w:w="3024"/>
-            <w:tcBorders>
-              <w:top w:val="single" w:sz="5" w:color="B7C0C8"/>
-              <w:left w:val="single" w:sz="5" w:color="B7C0C8"/>
-              <w:bottom w:val="single" w:sz="5" w:color="B7C0C8"/>
-              <w:right w:val="single" w:sz="5" w:color="B7C0C8"/>
-            </w:tcBorders>
-            <w:shd w:fill="F7F9FA"/>
-          </w:tcPr>
-          <w:p>
-            <w:r>
-              <w:rPr>
-                <w:rFonts w:ascii="Times New Roman" w:hAnsi="Times New Roman"/>
-                <w:sz w:val="19"/>
-              </w:rPr>
-              <w:t>0,6362</w:t>
-            </w:r>
-          </w:p>
-        </w:tc>
-        <w:tc>
-          <w:tcPr>
-            <w:tcW w:type="dxa" w:w="3024"/>
-            <w:tcBorders>
-              <w:top w:val="single" w:sz="5" w:color="B7C0C8"/>
-              <w:left w:val="single" w:sz="5" w:color="B7C0C8"/>
-              <w:bottom w:val="single" w:sz="5" w:color="B7C0C8"/>
-              <w:right w:val="single" w:sz="5" w:color="B7C0C8"/>
-            </w:tcBorders>
-            <w:shd w:fill="F7F9FA"/>
-          </w:tcPr>
-          <w:p>
-            <w:r>
-              <w:rPr>
-                <w:rFonts w:ascii="Times New Roman" w:hAnsi="Times New Roman"/>
-                <w:sz w:val="19"/>
-              </w:rPr>
-              <w:t>Cùng 41 bản ghi có mask tổn thương</w:t>
-            </w:r>
-          </w:p>
-        </w:tc>
-      </w:tr>
-      <w:tr>
-        <w:tc>
-          <w:tcPr>
-            <w:tcW w:type="dxa" w:w="3024"/>
-            <w:tcBorders>
-              <w:top w:val="single" w:sz="5" w:color="B7C0C8"/>
-              <w:left w:val="single" w:sz="5" w:color="B7C0C8"/>
-              <w:bottom w:val="single" w:sz="5" w:color="B7C0C8"/>
-              <w:right w:val="single" w:sz="5" w:color="B7C0C8"/>
-            </w:tcBorders>
-          </w:tcPr>
-          <w:p>
-            <w:r>
-              <w:rPr>
-                <w:rFonts w:ascii="Times New Roman" w:hAnsi="Times New Roman"/>
-                <w:sz w:val="19"/>
-              </w:rPr>
-              <w:t>Precision</w:t>
-            </w:r>
-          </w:p>
-        </w:tc>
-        <w:tc>
-          <w:tcPr>
-            <w:tcW w:type="dxa" w:w="3024"/>
-            <w:tcBorders>
-              <w:top w:val="single" w:sz="5" w:color="B7C0C8"/>
-              <w:left w:val="single" w:sz="5" w:color="B7C0C8"/>
-              <w:bottom w:val="single" w:sz="5" w:color="B7C0C8"/>
-              <w:right w:val="single" w:sz="5" w:color="B7C0C8"/>
-            </w:tcBorders>
-          </w:tcPr>
-          <w:p>
-            <w:r>
-              <w:rPr>
-                <w:rFonts w:ascii="Times New Roman" w:hAnsi="Times New Roman"/>
-                <w:sz w:val="19"/>
-              </w:rPr>
-              <w:t>0,5864</w:t>
-            </w:r>
-          </w:p>
-        </w:tc>
-        <w:tc>
-          <w:tcPr>
-            <w:tcW w:type="dxa" w:w="3024"/>
-            <w:tcBorders>
-              <w:top w:val="single" w:sz="5" w:color="B7C0C8"/>
-              <w:left w:val="single" w:sz="5" w:color="B7C0C8"/>
-              <w:bottom w:val="single" w:sz="5" w:color="B7C0C8"/>
-              <w:right w:val="single" w:sz="5" w:color="B7C0C8"/>
-            </w:tcBorders>
-          </w:tcPr>
-          <w:p>
-            <w:r>
-              <w:rPr>
-                <w:rFonts w:ascii="Times New Roman" w:hAnsi="Times New Roman"/>
-                <w:sz w:val="19"/>
-              </w:rPr>
-              <w:t>Cùng 41 bản ghi có mask tổn thương</w:t>
-            </w:r>
-          </w:p>
-        </w:tc>
-      </w:tr>
-      <w:tr>
-        <w:tc>
-          <w:tcPr>
-            <w:tcW w:type="dxa" w:w="3024"/>
-            <w:tcBorders>
-              <w:top w:val="single" w:sz="5" w:color="B7C0C8"/>
-              <w:left w:val="single" w:sz="5" w:color="B7C0C8"/>
-              <w:bottom w:val="single" w:sz="5" w:color="B7C0C8"/>
-              <w:right w:val="single" w:sz="5" w:color="B7C0C8"/>
-            </w:tcBorders>
-            <w:shd w:fill="F7F9FA"/>
-          </w:tcPr>
-          <w:p>
-            <w:r>
-              <w:rPr>
-                <w:rFonts w:ascii="Times New Roman" w:hAnsi="Times New Roman"/>
-                <w:sz w:val="19"/>
-              </w:rPr>
-              <w:t>Pixel Specificity toàn bộ ảnh</w:t>
-            </w:r>
-          </w:p>
-        </w:tc>
-        <w:tc>
-          <w:tcPr>
-            <w:tcW w:type="dxa" w:w="3024"/>
-            <w:tcBorders>
-              <w:top w:val="single" w:sz="5" w:color="B7C0C8"/>
-              <w:left w:val="single" w:sz="5" w:color="B7C0C8"/>
-              <w:bottom w:val="single" w:sz="5" w:color="B7C0C8"/>
-              <w:right w:val="single" w:sz="5" w:color="B7C0C8"/>
-            </w:tcBorders>
-            <w:shd w:fill="F7F9FA"/>
-          </w:tcPr>
-          <w:p>
-            <w:r>
-              <w:rPr>
-                <w:rFonts w:ascii="Times New Roman" w:hAnsi="Times New Roman"/>
-                <w:sz w:val="19"/>
-              </w:rPr>
-              <w:t>0,8977</w:t>
-            </w:r>
-          </w:p>
-        </w:tc>
-        <w:tc>
-          <w:tcPr>
-            <w:tcW w:type="dxa" w:w="3024"/>
-            <w:tcBorders>
-              <w:top w:val="single" w:sz="5" w:color="B7C0C8"/>
-              <w:left w:val="single" w:sz="5" w:color="B7C0C8"/>
-              <w:bottom w:val="single" w:sz="5" w:color="B7C0C8"/>
-              <w:right w:val="single" w:sz="5" w:color="B7C0C8"/>
-            </w:tcBorders>
-            <w:shd w:fill="F7F9FA"/>
-          </w:tcPr>
-          <w:p>
-            <w:r>
-              <w:rPr>
-                <w:rFonts w:ascii="Times New Roman" w:hAnsi="Times New Roman"/>
-                <w:sz w:val="19"/>
-              </w:rPr>
-              <w:t>46 ảnh Test, gồm 5 bản ghi gán mask toàn 0 chưa xác thực</w:t>
-            </w:r>
-          </w:p>
-        </w:tc>
-      </w:tr>
-      <w:tr>
-        <w:tc>
-          <w:tcPr>
-            <w:tcW w:type="dxa" w:w="3024"/>
-            <w:tcBorders>
-              <w:top w:val="single" w:sz="5" w:color="B7C0C8"/>
-              <w:left w:val="single" w:sz="5" w:color="B7C0C8"/>
-              <w:bottom w:val="single" w:sz="5" w:color="B7C0C8"/>
-              <w:right w:val="single" w:sz="5" w:color="B7C0C8"/>
-            </w:tcBorders>
-          </w:tcPr>
-          <w:p>
-            <w:r>
-              <w:rPr>
-                <w:rFonts w:ascii="Times New Roman" w:hAnsi="Times New Roman"/>
-                <w:sz w:val="19"/>
-              </w:rPr>
-              <w:t>Pixel Specificity của 5 bản ghi có mask dẫn xuất toàn 0</w:t>
-            </w:r>
-          </w:p>
-        </w:tc>
-        <w:tc>
-          <w:tcPr>
-            <w:tcW w:type="dxa" w:w="3024"/>
-            <w:tcBorders>
-              <w:top w:val="single" w:sz="5" w:color="B7C0C8"/>
-              <w:left w:val="single" w:sz="5" w:color="B7C0C8"/>
-              <w:bottom w:val="single" w:sz="5" w:color="B7C0C8"/>
-              <w:right w:val="single" w:sz="5" w:color="B7C0C8"/>
-            </w:tcBorders>
-          </w:tcPr>
-          <w:p>
-            <w:r>
-              <w:rPr>
-                <w:rFonts w:ascii="Times New Roman" w:hAnsi="Times New Roman"/>
-                <w:sz w:val="19"/>
-              </w:rPr>
-              <w:t>0,8235</w:t>
-            </w:r>
-          </w:p>
-        </w:tc>
-        <w:tc>
-          <w:tcPr>
-            <w:tcW w:type="dxa" w:w="3024"/>
-            <w:tcBorders>
-              <w:top w:val="single" w:sz="5" w:color="B7C0C8"/>
-              <w:left w:val="single" w:sz="5" w:color="B7C0C8"/>
-              <w:bottom w:val="single" w:sz="5" w:color="B7C0C8"/>
-              <w:right w:val="single" w:sz="5" w:color="B7C0C8"/>
-            </w:tcBorders>
-          </w:tcPr>
-          <w:p>
-            <w:r>
-              <w:rPr>
-                <w:rFonts w:ascii="Times New Roman" w:hAnsi="Times New Roman"/>
-                <w:sz w:val="19"/>
-              </w:rPr>
-              <w:t>Giá trị lịch sử; không xác nhận đây là ca âm tính lâm sàng</w:t>
-            </w:r>
-          </w:p>
-        </w:tc>
-      </w:tr>
-    </w:tbl>
-    <w:p>
-      <w:pPr>
-        <w:jc w:val="both"/>
-      </w:pPr>
-      <w:r>
-        <w:t xml:space="preserve">Nguồn: </w:t>
-      </w:r>
-      <w:hyperlink r:id="rId10">
-        <w:r>
-          <w:rPr>
-            <w:color w:val="17518A"/>
-          </w:rPr>
-          <w:t>Báo cáo Mốc 1</w:t>
-        </w:r>
-      </w:hyperlink>
-      <w:r>
-        <w:t xml:space="preserve">, </w:t>
-      </w:r>
-      <w:hyperlink r:id="rId18">
-        <w:r>
-          <w:rPr>
-            <w:color w:val="17518A"/>
-          </w:rPr>
-          <w:t>tệp metric baseline</w:t>
-        </w:r>
-      </w:hyperlink>
-      <w:r>
-        <w:t xml:space="preserve"> và </w:t>
-      </w:r>
-      <w:hyperlink r:id="rId19">
-        <w:r>
-          <w:rPr>
-            <w:color w:val="17518A"/>
-          </w:rPr>
-          <w:t>hàm tổng hợp metric</w:t>
-        </w:r>
-      </w:hyperlink>
-      <w:r>
-        <w:t xml:space="preserve">. Đây </w:t>
-      </w:r>
-      <w:r>
-        <w:rPr>
-          <w:b/>
-        </w:rPr>
-        <w:t>không phải</w:t>
-      </w:r>
-      <w:r>
-        <w:t xml:space="preserve"> kết quả của checkpoint </w:t>
-      </w:r>
-      <w:r>
-        <w:t>5e14be...</w:t>
-      </w:r>
-      <w:r>
-        <w:t>; tệp metric lịch sử không ghi SHA checkpoint để kiểm chứng lại liên kết bit-to-bit với trọng số lưu trữ. Cả hai giá trị Specificity trong bảng đều có phần đóng góp của 5 bản ghi gán mask toàn 0 chưa được xác thực. Vì vậy, không diễn giải chúng như hiệu năng trên ca âm tính lâm sàng. Mốc 2 không tính thêm chỉ số phân đoạn từ những nhãn đó.</w:t>
-      </w:r>
-    </w:p>
-    <w:p>
-      <w:pPr>
-        <w:jc w:val="both"/>
-      </w:pPr>
-      <w:r>
-        <w:t xml:space="preserve">Dice, IoU, Recall, Precision và Specificity là </w:t>
-      </w:r>
-      <w:r>
-        <w:rPr>
-          <w:b/>
-        </w:rPr>
-        <w:t>Segmentation Metrics</w:t>
-      </w:r>
-      <w:r>
-        <w:t xml:space="preserve"> ở mức điểm ảnh; chúng không đo </w:t>
-      </w:r>
-      <w:r>
-        <w:rPr>
-          <w:b/>
-        </w:rPr>
-        <w:t>Diagnostic Accuracy</w:t>
-      </w:r>
-      <w:r>
-        <w:t>. Đầu ra của hệ thống được gọi là *vùng nghi ngờ tổn thương được mô hình phân đoạn*. Không có căn cứ để tự gán loại bệnh học cho vùng này khi chưa có nhãn nguồn và xác nhận chuyên môn.</w:t>
-      </w:r>
-    </w:p>
-    <w:p>
-      <w:pPr>
-        <w:pStyle w:val="Heading2"/>
-        <w:keepNext/>
-      </w:pPr>
-      <w:r>
-        <w:rPr>
-          <w:b/>
-          <w:sz w:val="25"/>
-        </w:rPr>
-        <w:t>2.3. Hiệu năng suy diễn và phạm vi từng phép đo</w:t>
+        <w:t xml:space="preserve"> 11235559</w:t>
       </w:r>
     </w:p>
     <w:p>
@@ -1746,164 +70,101 @@
         <w:rPr>
           <w:b/>
         </w:rPr>
-        <w:t>Các Segmentation Metrics ở Bảng 3 là kết quả lịch sử được Báo cáo Mốc 1 ghi nhận. Bảng 4 chỉ đo độ trễ vận hành của checkpoint tích hợp `5e14be...`; chưa có Segmentation Metrics mới của checkpoint này trên bộ 307 ảnh Mốc 1.</w:t>
+        <w:t>Giảng viên hướng dẫn:</w:t>
+      </w:r>
+      <w:r>
+        <w:t xml:space="preserve"> ThS. Trần Thanh Hải</w:t>
       </w:r>
     </w:p>
     <w:p>
       <w:pPr>
-        <w:keepNext/>
-        <w:jc w:val="center"/>
+        <w:jc w:val="both"/>
       </w:pPr>
       <w:r>
-        <w:rPr>
-          <w:b/>
-        </w:rPr>
-        <w:t>Bảng 4. Độ trễ của checkpoint `5e14be...` theo phạm vi và dữ liệu đo</w:t>
+        <w:t>Kính gửi Thầy,</w:t>
+      </w:r>
+    </w:p>
+    <w:p>
+      <w:pPr>
+        <w:jc w:val="both"/>
+      </w:pPr>
+      <w:r>
+        <w:t>Em xin báo cáo ngắn tiến độ Mốc 2. Trọng tâm giai đoạn này là khóa cấu hình U-Net tích hợp, hoàn thiện luồng Web Prototype và chức năng chuyên viên rà soát/chỉnh sửa mask. Bộ dữ liệu Mốc 1 được giữ nguyên làm tham chiếu; Mốc 2 không chia lại bộ 307 ảnh và không thực hiện đánh giá mới trên Test Mốc 1.</w:t>
+      </w:r>
+    </w:p>
+    <w:p>
+      <w:pPr>
+        <w:pStyle w:val="Heading2"/>
+      </w:pPr>
+      <w:r>
+        <w:t>1. Công việc hoàn thành</w:t>
       </w:r>
     </w:p>
     <w:tbl>
       <w:tblPr>
-        <w:tblStyle w:val="TableGrid"/>
         <w:tblW w:type="auto" w:w="0"/>
         <w:jc w:val="center"/>
         <w:tblLayout w:type="autofit"/>
         <w:tblLook w:firstColumn="1" w:firstRow="1" w:lastColumn="0" w:lastRow="0" w:noHBand="0" w:noVBand="1" w:val="04A0"/>
+        <w:tblBorders>
+          <w:top w:val="single" w:sz="5" w:color="A6ADB4"/>
+          <w:left w:val="single" w:sz="5" w:color="A6ADB4"/>
+          <w:bottom w:val="single" w:sz="5" w:color="A6ADB4"/>
+          <w:right w:val="single" w:sz="5" w:color="A6ADB4"/>
+          <w:insideH w:val="single" w:sz="5" w:color="A6ADB4"/>
+          <w:insideV w:val="single" w:sz="5" w:color="A6ADB4"/>
+        </w:tblBorders>
       </w:tblPr>
       <w:tblGrid>
-        <w:gridCol w:w="1814"/>
-        <w:gridCol w:w="1814"/>
-        <w:gridCol w:w="1814"/>
-        <w:gridCol w:w="1814"/>
-        <w:gridCol w:w="1814"/>
+        <w:gridCol w:w="4702"/>
+        <w:gridCol w:w="4702"/>
       </w:tblGrid>
       <w:tr>
         <w:tc>
           <w:tcPr>
-            <w:tcW w:type="dxa" w:w="1814"/>
-            <w:tcBorders>
-              <w:top w:val="single" w:sz="5" w:color="B7C0C8"/>
-              <w:left w:val="single" w:sz="5" w:color="B7C0C8"/>
-              <w:bottom w:val="single" w:sz="5" w:color="B7C0C8"/>
-              <w:right w:val="single" w:sz="5" w:color="B7C0C8"/>
-            </w:tcBorders>
-            <w:shd w:fill="E9EDF1"/>
+            <w:tcW w:type="dxa" w:w="4702"/>
+            <w:vAlign w:val="center"/>
+            <w:shd w:fill="E8EEF2"/>
           </w:tcPr>
           <w:p>
             <w:pPr>
-              <w:keepNext/>
+              <w:spacing w:line="264" w:lineRule="auto" w:after="0"/>
               <w:jc w:val="center"/>
             </w:pPr>
             <w:r>
               <w:rPr>
-                <w:rFonts w:ascii="Times New Roman" w:hAnsi="Times New Roman"/>
                 <w:b/>
-                <w:sz w:val="17"/>
               </w:rPr>
-              <w:t>Phép đo</w:t>
+            </w:r>
+            <w:r>
+              <w:rPr>
+                <w:b/>
+              </w:rPr>
+              <w:t>Nhiệm vụ</w:t>
             </w:r>
           </w:p>
         </w:tc>
         <w:tc>
           <w:tcPr>
-            <w:tcW w:type="dxa" w:w="1814"/>
-            <w:tcBorders>
-              <w:top w:val="single" w:sz="5" w:color="B7C0C8"/>
-              <w:left w:val="single" w:sz="5" w:color="B7C0C8"/>
-              <w:bottom w:val="single" w:sz="5" w:color="B7C0C8"/>
-              <w:right w:val="single" w:sz="5" w:color="B7C0C8"/>
-            </w:tcBorders>
-            <w:shd w:fill="E9EDF1"/>
+            <w:tcW w:type="dxa" w:w="4702"/>
+            <w:vAlign w:val="center"/>
+            <w:shd w:fill="E8EEF2"/>
           </w:tcPr>
           <w:p>
             <w:pPr>
-              <w:keepNext/>
+              <w:spacing w:line="264" w:lineRule="auto" w:after="0"/>
               <w:jc w:val="center"/>
             </w:pPr>
             <w:r>
               <w:rPr>
-                <w:rFonts w:ascii="Times New Roman" w:hAnsi="Times New Roman"/>
                 <w:b/>
-                <w:sz w:val="17"/>
               </w:rPr>
-              <w:t>Dữ liệu và số lần đo</w:t>
             </w:r>
-          </w:p>
-        </w:tc>
-        <w:tc>
-          <w:tcPr>
-            <w:tcW w:type="dxa" w:w="1814"/>
-            <w:tcBorders>
-              <w:top w:val="single" w:sz="5" w:color="B7C0C8"/>
-              <w:left w:val="single" w:sz="5" w:color="B7C0C8"/>
-              <w:bottom w:val="single" w:sz="5" w:color="B7C0C8"/>
-              <w:right w:val="single" w:sz="5" w:color="B7C0C8"/>
-            </w:tcBorders>
-            <w:shd w:fill="E9EDF1"/>
-          </w:tcPr>
-          <w:p>
-            <w:pPr>
-              <w:keepNext/>
-              <w:jc w:val="center"/>
-            </w:pPr>
             <w:r>
               <w:rPr>
-                <w:rFonts w:ascii="Times New Roman" w:hAnsi="Times New Roman"/>
                 <w:b/>
-                <w:sz w:val="17"/>
               </w:rPr>
-              <w:t>Median</w:t>
-            </w:r>
-          </w:p>
-        </w:tc>
-        <w:tc>
-          <w:tcPr>
-            <w:tcW w:type="dxa" w:w="1814"/>
-            <w:tcBorders>
-              <w:top w:val="single" w:sz="5" w:color="B7C0C8"/>
-              <w:left w:val="single" w:sz="5" w:color="B7C0C8"/>
-              <w:bottom w:val="single" w:sz="5" w:color="B7C0C8"/>
-              <w:right w:val="single" w:sz="5" w:color="B7C0C8"/>
-            </w:tcBorders>
-            <w:shd w:fill="E9EDF1"/>
-          </w:tcPr>
-          <w:p>
-            <w:pPr>
-              <w:keepNext/>
-              <w:jc w:val="center"/>
-            </w:pPr>
-            <w:r>
-              <w:rPr>
-                <w:rFonts w:ascii="Times New Roman" w:hAnsi="Times New Roman"/>
-                <w:b/>
-                <w:sz w:val="17"/>
-              </w:rPr>
-              <w:t>P95</w:t>
-            </w:r>
-          </w:p>
-        </w:tc>
-        <w:tc>
-          <w:tcPr>
-            <w:tcW w:type="dxa" w:w="1814"/>
-            <w:tcBorders>
-              <w:top w:val="single" w:sz="5" w:color="B7C0C8"/>
-              <w:left w:val="single" w:sz="5" w:color="B7C0C8"/>
-              <w:bottom w:val="single" w:sz="5" w:color="B7C0C8"/>
-              <w:right w:val="single" w:sz="5" w:color="B7C0C8"/>
-            </w:tcBorders>
-            <w:shd w:fill="E9EDF1"/>
-          </w:tcPr>
-          <w:p>
-            <w:pPr>
-              <w:keepNext/>
-              <w:jc w:val="center"/>
-            </w:pPr>
-            <w:r>
-              <w:rPr>
-                <w:rFonts w:ascii="Times New Roman" w:hAnsi="Times New Roman"/>
-                <w:b/>
-                <w:sz w:val="17"/>
-              </w:rPr>
-              <w:t>Minh chứng</w:t>
+              <w:t>Kết quả</w:t>
             </w:r>
           </w:p>
         </w:tc>
@@ -1911,528 +172,181 @@
       <w:tr>
         <w:tc>
           <w:tcPr>
-            <w:tcW w:type="dxa" w:w="1814"/>
-            <w:tcBorders>
-              <w:top w:val="single" w:sz="5" w:color="B7C0C8"/>
-              <w:left w:val="single" w:sz="5" w:color="B7C0C8"/>
-              <w:bottom w:val="single" w:sz="5" w:color="B7C0C8"/>
-              <w:right w:val="single" w:sz="5" w:color="B7C0C8"/>
-            </w:tcBorders>
+            <w:tcW w:type="dxa" w:w="4702"/>
+            <w:vAlign w:val="center"/>
           </w:tcPr>
           <w:p>
+            <w:pPr>
+              <w:spacing w:line="264" w:lineRule="auto" w:after="0"/>
+              <w:jc w:val="left"/>
+            </w:pPr>
+            <w:r/>
             <w:r>
-              <w:rPr>
-                <w:rFonts w:ascii="Times New Roman" w:hAnsi="Times New Roman"/>
-                <w:sz w:val="17"/>
-              </w:rPr>
-              <w:t>Forward pass của U-Net</w:t>
+              <w:t>Đánh giá và lựa chọn U-Net</w:t>
             </w:r>
           </w:p>
         </w:tc>
         <w:tc>
           <w:tcPr>
-            <w:tcW w:type="dxa" w:w="1814"/>
-            <w:tcBorders>
-              <w:top w:val="single" w:sz="5" w:color="B7C0C8"/>
-              <w:left w:val="single" w:sz="5" w:color="B7C0C8"/>
-              <w:bottom w:val="single" w:sz="5" w:color="B7C0C8"/>
-              <w:right w:val="single" w:sz="5" w:color="B7C0C8"/>
-            </w:tcBorders>
+            <w:tcW w:type="dxa" w:w="4702"/>
+            <w:vAlign w:val="center"/>
           </w:tcPr>
           <w:p>
+            <w:pPr>
+              <w:spacing w:line="264" w:lineRule="auto" w:after="0"/>
+              <w:jc w:val="left"/>
+            </w:pPr>
+            <w:r/>
+            <w:r>
+              <w:t xml:space="preserve">Chọn checkpoint Standard U-Net </w:t>
+            </w:r>
             <w:r>
               <w:rPr>
-                <w:rFonts w:ascii="Times New Roman" w:hAnsi="Times New Roman"/>
-                <w:sz w:val="17"/>
+                <w:rFonts w:ascii="Consolas" w:hAnsi="Consolas"/>
+                <w:sz w:val="20"/>
               </w:rPr>
-              <w:t>46 ảnh Validation Mốc 1, CUDA</w:t>
+              <w:t>5e14be…</w:t>
             </w:r>
-          </w:p>
-        </w:tc>
-        <w:tc>
-          <w:tcPr>
-            <w:tcW w:type="dxa" w:w="1814"/>
-            <w:tcBorders>
-              <w:top w:val="single" w:sz="5" w:color="B7C0C8"/>
-              <w:left w:val="single" w:sz="5" w:color="B7C0C8"/>
-              <w:bottom w:val="single" w:sz="5" w:color="B7C0C8"/>
-              <w:right w:val="single" w:sz="5" w:color="B7C0C8"/>
-            </w:tcBorders>
-          </w:tcPr>
-          <w:p>
+            <w:r>
+              <w:t xml:space="preserve"> (SHA-256 đầy đủ trong </w:t>
+            </w:r>
             <w:r>
               <w:rPr>
-                <w:rFonts w:ascii="Times New Roman" w:hAnsi="Times New Roman"/>
-                <w:b/>
-                <w:sz w:val="17"/>
+                <w:rFonts w:ascii="Consolas" w:hAnsi="Consolas"/>
+                <w:sz w:val="20"/>
               </w:rPr>
-              <w:t>28,70 ms</w:t>
+              <w:t>evaluation/selected_model.json</w:t>
             </w:r>
-          </w:p>
-        </w:tc>
-        <w:tc>
-          <w:tcPr>
-            <w:tcW w:type="dxa" w:w="1814"/>
-            <w:tcBorders>
-              <w:top w:val="single" w:sz="5" w:color="B7C0C8"/>
-              <w:left w:val="single" w:sz="5" w:color="B7C0C8"/>
-              <w:bottom w:val="single" w:sz="5" w:color="B7C0C8"/>
-              <w:right w:val="single" w:sz="5" w:color="B7C0C8"/>
-            </w:tcBorders>
-          </w:tcPr>
-          <w:p>
             <w:r>
-              <w:rPr>
-                <w:rFonts w:ascii="Times New Roman" w:hAnsi="Times New Roman"/>
-                <w:sz w:val="17"/>
-              </w:rPr>
-              <w:t>32,33 ms</w:t>
+              <w:t>) làm mô hình tích hợp. Checkpoint được chọn theo Validation của split huấn luyện riêng; không tinh chỉnh trên bộ 307 ảnh Mốc 1.</w:t>
             </w:r>
-          </w:p>
-        </w:tc>
-        <w:tc>
-          <w:tcPr>
-            <w:tcW w:type="dxa" w:w="1814"/>
-            <w:tcBorders>
-              <w:top w:val="single" w:sz="5" w:color="B7C0C8"/>
-              <w:left w:val="single" w:sz="5" w:color="B7C0C8"/>
-              <w:bottom w:val="single" w:sz="5" w:color="B7C0C8"/>
-              <w:right w:val="single" w:sz="5" w:color="B7C0C8"/>
-            </w:tcBorders>
-          </w:tcPr>
-          <w:p>
-            <w:hyperlink r:id="rId15">
-              <w:r>
-                <w:rPr>
-                  <w:color w:val="17518A"/>
-                </w:rPr>
-                <w:t>Sanity check</w:t>
-              </w:r>
-            </w:hyperlink>
           </w:p>
         </w:tc>
       </w:tr>
       <w:tr>
         <w:tc>
           <w:tcPr>
-            <w:tcW w:type="dxa" w:w="1814"/>
-            <w:tcBorders>
-              <w:top w:val="single" w:sz="5" w:color="B7C0C8"/>
-              <w:left w:val="single" w:sz="5" w:color="B7C0C8"/>
-              <w:bottom w:val="single" w:sz="5" w:color="B7C0C8"/>
-              <w:right w:val="single" w:sz="5" w:color="B7C0C8"/>
-            </w:tcBorders>
-            <w:shd w:fill="F7F9FA"/>
+            <w:tcW w:type="dxa" w:w="4702"/>
+            <w:vAlign w:val="center"/>
           </w:tcPr>
           <w:p>
+            <w:pPr>
+              <w:spacing w:line="264" w:lineRule="auto" w:after="0"/>
+              <w:jc w:val="left"/>
+            </w:pPr>
+            <w:r/>
             <w:r>
-              <w:rPr>
-                <w:rFonts w:ascii="Times New Roman" w:hAnsi="Times New Roman"/>
-                <w:sz w:val="17"/>
-              </w:rPr>
-              <w:t>Tiền xử lý + forward pass</w:t>
+              <w:t>Khảo sát kiến trúc cải tiến</w:t>
             </w:r>
           </w:p>
         </w:tc>
         <w:tc>
           <w:tcPr>
-            <w:tcW w:type="dxa" w:w="1814"/>
-            <w:tcBorders>
-              <w:top w:val="single" w:sz="5" w:color="B7C0C8"/>
-              <w:left w:val="single" w:sz="5" w:color="B7C0C8"/>
-              <w:bottom w:val="single" w:sz="5" w:color="B7C0C8"/>
-              <w:right w:val="single" w:sz="5" w:color="B7C0C8"/>
-            </w:tcBorders>
-            <w:shd w:fill="F7F9FA"/>
+            <w:tcW w:type="dxa" w:w="4702"/>
+            <w:vAlign w:val="center"/>
           </w:tcPr>
           <w:p>
+            <w:pPr>
+              <w:spacing w:line="264" w:lineRule="auto" w:after="0"/>
+              <w:jc w:val="left"/>
+            </w:pPr>
+            <w:r/>
             <w:r>
-              <w:rPr>
-                <w:rFonts w:ascii="Times New Roman" w:hAnsi="Times New Roman"/>
-                <w:sz w:val="17"/>
-              </w:rPr>
-              <w:t>45 ảnh Validation Mốc 1 hợp lệ sau khi loại mẫu đầu chịu ảnh hưởng warm-up, CUDA</w:t>
+              <w:t>Chưa triển khai kiến trúc thứ hai trong Mốc 2; ưu tiên hoàn thiện và kiểm tra luồng lõi với Standard U-Net. Có thể xem xét ở Mốc 3 nếu dữ liệu và thời gian cho phép.</w:t>
             </w:r>
-          </w:p>
-        </w:tc>
-        <w:tc>
-          <w:tcPr>
-            <w:tcW w:type="dxa" w:w="1814"/>
-            <w:tcBorders>
-              <w:top w:val="single" w:sz="5" w:color="B7C0C8"/>
-              <w:left w:val="single" w:sz="5" w:color="B7C0C8"/>
-              <w:bottom w:val="single" w:sz="5" w:color="B7C0C8"/>
-              <w:right w:val="single" w:sz="5" w:color="B7C0C8"/>
-            </w:tcBorders>
-            <w:shd w:fill="F7F9FA"/>
-          </w:tcPr>
-          <w:p>
-            <w:r>
-              <w:rPr>
-                <w:rFonts w:ascii="Times New Roman" w:hAnsi="Times New Roman"/>
-                <w:b/>
-                <w:sz w:val="17"/>
-              </w:rPr>
-              <w:t>57,75 ms</w:t>
-            </w:r>
-          </w:p>
-        </w:tc>
-        <w:tc>
-          <w:tcPr>
-            <w:tcW w:type="dxa" w:w="1814"/>
-            <w:tcBorders>
-              <w:top w:val="single" w:sz="5" w:color="B7C0C8"/>
-              <w:left w:val="single" w:sz="5" w:color="B7C0C8"/>
-              <w:bottom w:val="single" w:sz="5" w:color="B7C0C8"/>
-              <w:right w:val="single" w:sz="5" w:color="B7C0C8"/>
-            </w:tcBorders>
-            <w:shd w:fill="F7F9FA"/>
-          </w:tcPr>
-          <w:p>
-            <w:r>
-              <w:rPr>
-                <w:rFonts w:ascii="Times New Roman" w:hAnsi="Times New Roman"/>
-                <w:sz w:val="17"/>
-              </w:rPr>
-              <w:t>67,14 ms</w:t>
-            </w:r>
-          </w:p>
-        </w:tc>
-        <w:tc>
-          <w:tcPr>
-            <w:tcW w:type="dxa" w:w="1814"/>
-            <w:tcBorders>
-              <w:top w:val="single" w:sz="5" w:color="B7C0C8"/>
-              <w:left w:val="single" w:sz="5" w:color="B7C0C8"/>
-              <w:bottom w:val="single" w:sz="5" w:color="B7C0C8"/>
-              <w:right w:val="single" w:sz="5" w:color="B7C0C8"/>
-            </w:tcBorders>
-            <w:shd w:fill="F7F9FA"/>
-          </w:tcPr>
-          <w:p>
-            <w:hyperlink r:id="rId15">
-              <w:r>
-                <w:rPr>
-                  <w:color w:val="17518A"/>
-                </w:rPr>
-                <w:t>Sanity check</w:t>
-              </w:r>
-            </w:hyperlink>
           </w:p>
         </w:tc>
       </w:tr>
       <w:tr>
         <w:tc>
           <w:tcPr>
-            <w:tcW w:type="dxa" w:w="1814"/>
-            <w:tcBorders>
-              <w:top w:val="single" w:sz="5" w:color="B7C0C8"/>
-              <w:left w:val="single" w:sz="5" w:color="B7C0C8"/>
-              <w:bottom w:val="single" w:sz="5" w:color="B7C0C8"/>
-              <w:right w:val="single" w:sz="5" w:color="B7C0C8"/>
-            </w:tcBorders>
+            <w:tcW w:type="dxa" w:w="4702"/>
+            <w:vAlign w:val="center"/>
           </w:tcPr>
           <w:p>
+            <w:pPr>
+              <w:spacing w:line="264" w:lineRule="auto" w:after="0"/>
+              <w:jc w:val="left"/>
+            </w:pPr>
+            <w:r/>
             <w:r>
-              <w:rPr>
-                <w:rFonts w:ascii="Times New Roman" w:hAnsi="Times New Roman"/>
-                <w:sz w:val="17"/>
-              </w:rPr>
-              <w:t xml:space="preserve">API </w:t>
-            </w:r>
-            <w:r>
-              <w:rPr>
-                <w:rFonts w:ascii="Times New Roman" w:hAnsi="Times New Roman"/>
-                <w:sz w:val="17"/>
-              </w:rPr>
-              <w:t>POST /api/predict</w:t>
-            </w:r>
-            <w:r>
-              <w:rPr>
-                <w:rFonts w:ascii="Times New Roman" w:hAnsi="Times New Roman"/>
-                <w:sz w:val="17"/>
-              </w:rPr>
-              <w:t xml:space="preserve"> từ đầu đến cuối</w:t>
+              <w:t>Web Prototype</w:t>
             </w:r>
           </w:p>
         </w:tc>
         <w:tc>
           <w:tcPr>
-            <w:tcW w:type="dxa" w:w="1814"/>
-            <w:tcBorders>
-              <w:top w:val="single" w:sz="5" w:color="B7C0C8"/>
-              <w:left w:val="single" w:sz="5" w:color="B7C0C8"/>
-              <w:bottom w:val="single" w:sz="5" w:color="B7C0C8"/>
-              <w:right w:val="single" w:sz="5" w:color="B7C0C8"/>
-            </w:tcBorders>
+            <w:tcW w:type="dxa" w:w="4702"/>
+            <w:vAlign w:val="center"/>
           </w:tcPr>
           <w:p>
+            <w:pPr>
+              <w:spacing w:line="264" w:lineRule="auto" w:after="0"/>
+              <w:jc w:val="left"/>
+            </w:pPr>
+            <w:r/>
             <w:r>
-              <w:rPr>
-                <w:rFonts w:ascii="Times New Roman" w:hAnsi="Times New Roman"/>
-                <w:sz w:val="17"/>
-              </w:rPr>
-              <w:t xml:space="preserve">5 request đo trên </w:t>
+              <w:t xml:space="preserve">Hoàn thiện luồng </w:t>
             </w:r>
             <w:r>
               <w:rPr>
-                <w:rFonts w:ascii="Times New Roman" w:hAnsi="Times New Roman"/>
-                <w:b/>
-                <w:sz w:val="17"/>
+                <w:rFonts w:ascii="Consolas" w:hAnsi="Consolas"/>
+                <w:sz w:val="20"/>
               </w:rPr>
-              <w:t>một ảnh</w:t>
+              <w:t>Upload → Segmentation → Original/Mask/Overlay → Review/Edit → Confirm/Save</w:t>
             </w:r>
             <w:r>
-              <w:rPr>
-                <w:rFonts w:ascii="Times New Roman" w:hAnsi="Times New Roman"/>
-                <w:sz w:val="17"/>
-              </w:rPr>
-              <w:t xml:space="preserve"> Validation Mốc 1 (</w:t>
+              <w:t>; backend FastAPI/PyTorch, giao diện HTML/Canvas.</w:t>
             </w:r>
-            <w:r>
-              <w:rPr>
-                <w:rFonts w:ascii="Times New Roman" w:hAnsi="Times New Roman"/>
-                <w:sz w:val="17"/>
-              </w:rPr>
-              <w:t>Vinmec_2D_train_41</w:t>
-            </w:r>
-            <w:r>
-              <w:rPr>
-                <w:rFonts w:ascii="Times New Roman" w:hAnsi="Times New Roman"/>
-                <w:sz w:val="17"/>
-              </w:rPr>
-              <w:t>) sau 1 request warm-up</w:t>
-            </w:r>
-          </w:p>
-        </w:tc>
-        <w:tc>
-          <w:tcPr>
-            <w:tcW w:type="dxa" w:w="1814"/>
-            <w:tcBorders>
-              <w:top w:val="single" w:sz="5" w:color="B7C0C8"/>
-              <w:left w:val="single" w:sz="5" w:color="B7C0C8"/>
-              <w:bottom w:val="single" w:sz="5" w:color="B7C0C8"/>
-              <w:right w:val="single" w:sz="5" w:color="B7C0C8"/>
-            </w:tcBorders>
-          </w:tcPr>
-          <w:p>
-            <w:r>
-              <w:rPr>
-                <w:rFonts w:ascii="Times New Roman" w:hAnsi="Times New Roman"/>
-                <w:b/>
-                <w:sz w:val="17"/>
-              </w:rPr>
-              <w:t>176,69 ms</w:t>
-            </w:r>
-          </w:p>
-        </w:tc>
-        <w:tc>
-          <w:tcPr>
-            <w:tcW w:type="dxa" w:w="1814"/>
-            <w:tcBorders>
-              <w:top w:val="single" w:sz="5" w:color="B7C0C8"/>
-              <w:left w:val="single" w:sz="5" w:color="B7C0C8"/>
-              <w:bottom w:val="single" w:sz="5" w:color="B7C0C8"/>
-              <w:right w:val="single" w:sz="5" w:color="B7C0C8"/>
-            </w:tcBorders>
-          </w:tcPr>
-          <w:p>
-            <w:r>
-              <w:rPr>
-                <w:rFonts w:ascii="Times New Roman" w:hAnsi="Times New Roman"/>
-                <w:sz w:val="17"/>
-              </w:rPr>
-              <w:t>185,76 ms</w:t>
-            </w:r>
-          </w:p>
-        </w:tc>
-        <w:tc>
-          <w:tcPr>
-            <w:tcW w:type="dxa" w:w="1814"/>
-            <w:tcBorders>
-              <w:top w:val="single" w:sz="5" w:color="B7C0C8"/>
-              <w:left w:val="single" w:sz="5" w:color="B7C0C8"/>
-              <w:bottom w:val="single" w:sz="5" w:color="B7C0C8"/>
-              <w:right w:val="single" w:sz="5" w:color="B7C0C8"/>
-            </w:tcBorders>
-          </w:tcPr>
-          <w:p>
-            <w:hyperlink r:id="rId20">
-              <w:r>
-                <w:rPr>
-                  <w:color w:val="17518A"/>
-                </w:rPr>
-                <w:t>Log API Mốc 1</w:t>
-              </w:r>
-            </w:hyperlink>
           </w:p>
         </w:tc>
       </w:tr>
       <w:tr>
         <w:tc>
           <w:tcPr>
-            <w:tcW w:type="dxa" w:w="1814"/>
-            <w:tcBorders>
-              <w:top w:val="single" w:sz="5" w:color="B7C0C8"/>
-              <w:left w:val="single" w:sz="5" w:color="B7C0C8"/>
-              <w:bottom w:val="single" w:sz="5" w:color="B7C0C8"/>
-              <w:right w:val="single" w:sz="5" w:color="B7C0C8"/>
-            </w:tcBorders>
-            <w:shd w:fill="F7F9FA"/>
+            <w:tcW w:type="dxa" w:w="4702"/>
+            <w:vAlign w:val="center"/>
           </w:tcPr>
           <w:p>
+            <w:pPr>
+              <w:spacing w:line="264" w:lineRule="auto" w:after="0"/>
+              <w:jc w:val="left"/>
+            </w:pPr>
+            <w:r/>
             <w:r>
-              <w:rPr>
-                <w:rFonts w:ascii="Times New Roman" w:hAnsi="Times New Roman"/>
-                <w:sz w:val="17"/>
-              </w:rPr>
-              <w:t>API từ đầu đến cuối, phép đo trước đó</w:t>
+              <w:t>Human-in-the-Loop</w:t>
             </w:r>
           </w:p>
         </w:tc>
         <w:tc>
           <w:tcPr>
-            <w:tcW w:type="dxa" w:w="1814"/>
-            <w:tcBorders>
-              <w:top w:val="single" w:sz="5" w:color="B7C0C8"/>
-              <w:left w:val="single" w:sz="5" w:color="B7C0C8"/>
-              <w:bottom w:val="single" w:sz="5" w:color="B7C0C8"/>
-              <w:right w:val="single" w:sz="5" w:color="B7C0C8"/>
-            </w:tcBorders>
-            <w:shd w:fill="F7F9FA"/>
+            <w:tcW w:type="dxa" w:w="4702"/>
+            <w:vAlign w:val="center"/>
           </w:tcPr>
           <w:p>
+            <w:pPr>
+              <w:spacing w:line="264" w:lineRule="auto" w:after="0"/>
+              <w:jc w:val="left"/>
+            </w:pPr>
+            <w:r/>
             <w:r>
-              <w:rPr>
-                <w:rFonts w:ascii="Times New Roman" w:hAnsi="Times New Roman"/>
-                <w:sz w:val="17"/>
-              </w:rPr>
-              <w:t xml:space="preserve">5 request đo trên </w:t>
+              <w:t>Có Brush, Eraser, chỉnh kích thước nét, Undo/Redo và lưu mask sau rà soát. Thao tác Confirm ghi nhận review trong prototype, không tự xác nhận mask thành Ground Truth chuyên môn.</w:t>
             </w:r>
-            <w:r>
-              <w:rPr>
-                <w:rFonts w:ascii="Times New Roman" w:hAnsi="Times New Roman"/>
-                <w:b/>
-                <w:sz w:val="17"/>
-              </w:rPr>
-              <w:t>một ảnh</w:t>
-            </w:r>
-            <w:r>
-              <w:rPr>
-                <w:rFonts w:ascii="Times New Roman" w:hAnsi="Times New Roman"/>
-                <w:sz w:val="17"/>
-              </w:rPr>
-              <w:t xml:space="preserve"> Validation của bộ huấn luyện ngày 03/10 (ca </w:t>
-            </w:r>
-            <w:r>
-              <w:rPr>
-                <w:rFonts w:ascii="Times New Roman" w:hAnsi="Times New Roman"/>
-                <w:sz w:val="17"/>
-              </w:rPr>
-              <w:t>43</w:t>
-            </w:r>
-            <w:r>
-              <w:rPr>
-                <w:rFonts w:ascii="Times New Roman" w:hAnsi="Times New Roman"/>
-                <w:sz w:val="17"/>
-              </w:rPr>
-              <w:t>), khác bộ Mốc 1</w:t>
-            </w:r>
-          </w:p>
-        </w:tc>
-        <w:tc>
-          <w:tcPr>
-            <w:tcW w:type="dxa" w:w="1814"/>
-            <w:tcBorders>
-              <w:top w:val="single" w:sz="5" w:color="B7C0C8"/>
-              <w:left w:val="single" w:sz="5" w:color="B7C0C8"/>
-              <w:bottom w:val="single" w:sz="5" w:color="B7C0C8"/>
-              <w:right w:val="single" w:sz="5" w:color="B7C0C8"/>
-            </w:tcBorders>
-            <w:shd w:fill="F7F9FA"/>
-          </w:tcPr>
-          <w:p>
-            <w:r>
-              <w:rPr>
-                <w:rFonts w:ascii="Times New Roman" w:hAnsi="Times New Roman"/>
-                <w:b/>
-                <w:sz w:val="17"/>
-              </w:rPr>
-              <w:t>92,67 ms</w:t>
-            </w:r>
-          </w:p>
-        </w:tc>
-        <w:tc>
-          <w:tcPr>
-            <w:tcW w:type="dxa" w:w="1814"/>
-            <w:tcBorders>
-              <w:top w:val="single" w:sz="5" w:color="B7C0C8"/>
-              <w:left w:val="single" w:sz="5" w:color="B7C0C8"/>
-              <w:bottom w:val="single" w:sz="5" w:color="B7C0C8"/>
-              <w:right w:val="single" w:sz="5" w:color="B7C0C8"/>
-            </w:tcBorders>
-            <w:shd w:fill="F7F9FA"/>
-          </w:tcPr>
-          <w:p>
-            <w:r>
-              <w:rPr>
-                <w:rFonts w:ascii="Times New Roman" w:hAnsi="Times New Roman"/>
-                <w:sz w:val="17"/>
-              </w:rPr>
-              <w:t>101,15 ms</w:t>
-            </w:r>
-          </w:p>
-        </w:tc>
-        <w:tc>
-          <w:tcPr>
-            <w:tcW w:type="dxa" w:w="1814"/>
-            <w:tcBorders>
-              <w:top w:val="single" w:sz="5" w:color="B7C0C8"/>
-              <w:left w:val="single" w:sz="5" w:color="B7C0C8"/>
-              <w:bottom w:val="single" w:sz="5" w:color="B7C0C8"/>
-              <w:right w:val="single" w:sz="5" w:color="B7C0C8"/>
-            </w:tcBorders>
-            <w:shd w:fill="F7F9FA"/>
-          </w:tcPr>
-          <w:p>
-            <w:hyperlink r:id="rId21">
-              <w:r>
-                <w:rPr>
-                  <w:color w:val="17518A"/>
-                </w:rPr>
-                <w:t>Log API ngày 03/10</w:t>
-              </w:r>
-            </w:hyperlink>
           </w:p>
         </w:tc>
       </w:tr>
     </w:tbl>
     <w:p>
       <w:pPr>
-        <w:jc w:val="both"/>
+        <w:spacing w:after="0"/>
+      </w:pPr>
+    </w:p>
+    <w:p>
+      <w:pPr>
+        <w:pStyle w:val="Heading2"/>
       </w:pPr>
       <w:r>
-        <w:t xml:space="preserve">Trong </w:t>
-      </w:r>
-      <w:hyperlink r:id="rId22">
-        <w:r>
-          <w:rPr>
-            <w:color w:val="17518A"/>
-          </w:rPr>
-          <w:t>script sanity check</w:t>
-        </w:r>
-      </w:hyperlink>
-      <w:r>
-        <w:t xml:space="preserve">, ảnh Validation đầu tiên được dùng để warm-up mô hình. Forward pass của ảnh này vẫn được đo sau warm-up, nên có 46 giá trị forward. Thời gian tiền xử lý + forward của ảnh đầu được để trống vì bộ đếm bắt đầu trước warm-up; tính chung sẽ lẫn thời gian khởi động. Vì vậy thống kê tổng hợp chỉ có </w:t>
-      </w:r>
-      <w:r>
-        <w:rPr>
-          <w:b/>
-        </w:rPr>
-        <w:t>45 mẫu hợp lệ</w:t>
-      </w:r>
-      <w:r>
-        <w:t>, không phải một ảnh suy diễn thất bại.</w:t>
+        <w:t>2. Dataset, pipeline và kết quả</w:t>
       </w:r>
     </w:p>
     <w:p>
@@ -2440,42 +354,26 @@
         <w:jc w:val="both"/>
       </w:pPr>
       <w:r>
-        <w:t xml:space="preserve">Với API, </w:t>
-      </w:r>
-      <w:hyperlink r:id="rId23">
-        <w:r>
-          <w:rPr>
-            <w:color w:val="17518A"/>
-          </w:rPr>
-          <w:t>script benchmark</w:t>
-        </w:r>
-      </w:hyperlink>
-      <w:r>
-        <w:t xml:space="preserve"> gửi 6 request liên tiếp tới </w:t>
+        <w:t xml:space="preserve">Bộ tham chiếu Mốc 1 gồm </w:t>
       </w:r>
       <w:r>
         <w:rPr>
           <w:b/>
         </w:rPr>
-        <w:t>cùng một ảnh đã tải lên</w:t>
+        <w:t>307 ảnh: 215 Train / 46 Validation / 46 Test</w:t>
       </w:r>
       <w:r>
-        <w:t xml:space="preserve">, bỏ request đầu để warm-up và lấy median/P95 từ </w:t>
+        <w:t xml:space="preserve"> (</w:t>
       </w:r>
       <w:r>
         <w:rPr>
-          <w:b/>
+          <w:rFonts w:ascii="Consolas" w:hAnsi="Consolas"/>
+          <w:sz w:val="20"/>
         </w:rPr>
-        <w:t>5 thời gian còn lại</w:t>
+        <w:t>ai_training/splits/archive_milestone_1/</w:t>
       </w:r>
       <w:r>
-        <w:t xml:space="preserve">. P95 được nội suy theo phương pháp </w:t>
-      </w:r>
-      <w:r>
-        <w:t>inclusive</w:t>
-      </w:r>
-      <w:r>
-        <w:t>; với 5 quan sát, chỉ số này có giá trị mô tả cho phép đo cục bộ, chưa thể đại diện cho phân bố độ trễ toàn hệ thống.</w:t>
+        <w:t>). Mốc 2 không huấn luyện lại trên bộ này; tập Test 46 ảnh tiếp tục được giữ nguyên và không dùng để chọn checkpoint hoặc ngưỡng.</w:t>
       </w:r>
     </w:p>
     <w:p>
@@ -2483,51 +381,307 @@
         <w:jc w:val="both"/>
       </w:pPr>
       <w:r>
-        <w:t xml:space="preserve">Forward pass chỉ đo phép tính của mạng; API bao gồm thêm các bước tiếp nhận, tiền xử lý và tạo phản hồi. Hai phép đo API trong Bảng 4 thuộc </w:t>
+        <w:t xml:space="preserve">Checkpoint tích hợp được huấn luyện 30 epoch trên split riêng </w:t>
       </w:r>
       <w:r>
         <w:rPr>
           <w:b/>
         </w:rPr>
-        <w:t>hai bộ Validation khác nhau</w:t>
+        <w:t>697 Train / 123 Validation / 382 Test</w:t>
       </w:r>
       <w:r>
-        <w:t xml:space="preserve">, nên mốc 92,67 ms không chứng minh mọi yêu cầu trên bộ Mốc 1 đều dưới 100 ms. Hai </w:t>
+        <w:t xml:space="preserve">, với Standard U-Net, Combo Loss (0,5 BCE + 0,5 Dice), ảnh grayscale, CLAHE và Letterbox 512×512. Ngưỡng 0,5; checkpoint tốt nhất tại epoch 27. Kết quả theo Validation của lượt huấn luyện này: </w:t>
       </w:r>
-      <w:hyperlink r:id="rId24">
-        <w:r>
-          <w:rPr>
-            <w:color w:val="17518A"/>
-          </w:rPr>
-          <w:t>lượt đo API bổ sung</w:t>
-        </w:r>
-      </w:hyperlink>
       <w:r>
-        <w:t xml:space="preserve"> và </w:t>
+        <w:rPr>
+          <w:b/>
+        </w:rPr>
+        <w:t>Dice 0,8233</w:t>
       </w:r>
-      <w:hyperlink r:id="rId25">
-        <w:r>
-          <w:rPr>
-            <w:color w:val="17518A"/>
-          </w:rPr>
-          <w:t>lặp lại</w:t>
-        </w:r>
-      </w:hyperlink>
       <w:r>
-        <w:t xml:space="preserve"> cho median lần lượt 118,18 ms và 107,25 ms. Phép đo trên ảnh Validation Mốc 1 vẫn đáp ứng mục tiêu phản hồi dưới 500 ms nêu trong kế hoạch Mốc 1; chưa đánh giá tải đồng thời hoặc độ trễ qua mạng thực tế.</w:t>
+        <w:t xml:space="preserve"> (</w:t>
       </w:r>
+      <w:r>
+        <w:rPr>
+          <w:rFonts w:ascii="Consolas" w:hAnsi="Consolas"/>
+          <w:sz w:val="20"/>
+        </w:rPr>
+        <w:t>evaluation/selected_model.json</w:t>
+      </w:r>
+      <w:r>
+        <w:t>).</w:t>
+      </w:r>
+    </w:p>
+    <w:tbl>
+      <w:tblPr>
+        <w:tblW w:type="auto" w:w="0"/>
+        <w:jc w:val="center"/>
+        <w:tblLayout w:type="autofit"/>
+        <w:tblLook w:firstColumn="1" w:firstRow="1" w:lastColumn="0" w:lastRow="0" w:noHBand="0" w:noVBand="1" w:val="04A0"/>
+        <w:tblBorders>
+          <w:top w:val="single" w:sz="5" w:color="A6ADB4"/>
+          <w:left w:val="single" w:sz="5" w:color="A6ADB4"/>
+          <w:bottom w:val="single" w:sz="5" w:color="A6ADB4"/>
+          <w:right w:val="single" w:sz="5" w:color="A6ADB4"/>
+          <w:insideH w:val="single" w:sz="5" w:color="A6ADB4"/>
+          <w:insideV w:val="single" w:sz="5" w:color="A6ADB4"/>
+        </w:tblBorders>
+      </w:tblPr>
+      <w:tblGrid>
+        <w:gridCol w:w="4702"/>
+        <w:gridCol w:w="4702"/>
+      </w:tblGrid>
+      <w:tr>
+        <w:tc>
+          <w:tcPr>
+            <w:tcW w:type="dxa" w:w="4702"/>
+            <w:vAlign w:val="center"/>
+            <w:shd w:fill="E8EEF2"/>
+          </w:tcPr>
+          <w:p>
+            <w:pPr>
+              <w:spacing w:line="264" w:lineRule="auto" w:after="0"/>
+              <w:jc w:val="center"/>
+            </w:pPr>
+            <w:r>
+              <w:rPr>
+                <w:b/>
+              </w:rPr>
+            </w:r>
+            <w:r>
+              <w:rPr>
+                <w:b/>
+              </w:rPr>
+              <w:t>Phép đo trên Test 382 ảnh của split riêng</w:t>
+            </w:r>
+          </w:p>
+        </w:tc>
+        <w:tc>
+          <w:tcPr>
+            <w:tcW w:type="dxa" w:w="4702"/>
+            <w:vAlign w:val="center"/>
+            <w:shd w:fill="E8EEF2"/>
+          </w:tcPr>
+          <w:p>
+            <w:pPr>
+              <w:spacing w:line="264" w:lineRule="auto" w:after="0"/>
+              <w:jc w:val="center"/>
+            </w:pPr>
+            <w:r>
+              <w:rPr>
+                <w:b/>
+              </w:rPr>
+            </w:r>
+            <w:r>
+              <w:rPr>
+                <w:b/>
+              </w:rPr>
+              <w:t>Kết quả</w:t>
+            </w:r>
+          </w:p>
+        </w:tc>
+      </w:tr>
+      <w:tr>
+        <w:tc>
+          <w:tcPr>
+            <w:tcW w:type="dxa" w:w="4702"/>
+            <w:vAlign w:val="center"/>
+          </w:tcPr>
+          <w:p>
+            <w:pPr>
+              <w:spacing w:line="264" w:lineRule="auto" w:after="0"/>
+              <w:jc w:val="left"/>
+            </w:pPr>
+            <w:r/>
+            <w:r>
+              <w:t>Dice trung bình từng ảnh</w:t>
+            </w:r>
+          </w:p>
+        </w:tc>
+        <w:tc>
+          <w:tcPr>
+            <w:tcW w:type="dxa" w:w="4702"/>
+            <w:vAlign w:val="center"/>
+          </w:tcPr>
+          <w:p>
+            <w:pPr>
+              <w:spacing w:line="264" w:lineRule="auto" w:after="0"/>
+              <w:jc w:val="left"/>
+            </w:pPr>
+            <w:r/>
+            <w:r>
+              <w:t>0,8094</w:t>
+            </w:r>
+          </w:p>
+        </w:tc>
+      </w:tr>
+      <w:tr>
+        <w:tc>
+          <w:tcPr>
+            <w:tcW w:type="dxa" w:w="4702"/>
+            <w:vAlign w:val="center"/>
+          </w:tcPr>
+          <w:p>
+            <w:pPr>
+              <w:spacing w:line="264" w:lineRule="auto" w:after="0"/>
+              <w:jc w:val="left"/>
+            </w:pPr>
+            <w:r/>
+            <w:r>
+              <w:t>IoU trung bình từng ảnh</w:t>
+            </w:r>
+          </w:p>
+        </w:tc>
+        <w:tc>
+          <w:tcPr>
+            <w:tcW w:type="dxa" w:w="4702"/>
+            <w:vAlign w:val="center"/>
+          </w:tcPr>
+          <w:p>
+            <w:pPr>
+              <w:spacing w:line="264" w:lineRule="auto" w:after="0"/>
+              <w:jc w:val="left"/>
+            </w:pPr>
+            <w:r/>
+            <w:r>
+              <w:t>0,7160</w:t>
+            </w:r>
+          </w:p>
+        </w:tc>
+      </w:tr>
+      <w:tr>
+        <w:tc>
+          <w:tcPr>
+            <w:tcW w:type="dxa" w:w="4702"/>
+            <w:vAlign w:val="center"/>
+          </w:tcPr>
+          <w:p>
+            <w:pPr>
+              <w:spacing w:line="264" w:lineRule="auto" w:after="0"/>
+              <w:jc w:val="left"/>
+            </w:pPr>
+            <w:r/>
+            <w:r>
+              <w:t>Precision trung bình từng ảnh</w:t>
+            </w:r>
+          </w:p>
+        </w:tc>
+        <w:tc>
+          <w:tcPr>
+            <w:tcW w:type="dxa" w:w="4702"/>
+            <w:vAlign w:val="center"/>
+          </w:tcPr>
+          <w:p>
+            <w:pPr>
+              <w:spacing w:line="264" w:lineRule="auto" w:after="0"/>
+              <w:jc w:val="left"/>
+            </w:pPr>
+            <w:r/>
+            <w:r>
+              <w:t>0,8111</w:t>
+            </w:r>
+          </w:p>
+        </w:tc>
+      </w:tr>
+      <w:tr>
+        <w:tc>
+          <w:tcPr>
+            <w:tcW w:type="dxa" w:w="4702"/>
+            <w:vAlign w:val="center"/>
+          </w:tcPr>
+          <w:p>
+            <w:pPr>
+              <w:spacing w:line="264" w:lineRule="auto" w:after="0"/>
+              <w:jc w:val="left"/>
+            </w:pPr>
+            <w:r/>
+            <w:r>
+              <w:t>Recall trung bình từng ảnh</w:t>
+            </w:r>
+          </w:p>
+        </w:tc>
+        <w:tc>
+          <w:tcPr>
+            <w:tcW w:type="dxa" w:w="4702"/>
+            <w:vAlign w:val="center"/>
+          </w:tcPr>
+          <w:p>
+            <w:pPr>
+              <w:spacing w:line="264" w:lineRule="auto" w:after="0"/>
+              <w:jc w:val="left"/>
+            </w:pPr>
+            <w:r/>
+            <w:r>
+              <w:t>0,8665</w:t>
+            </w:r>
+          </w:p>
+        </w:tc>
+      </w:tr>
+      <w:tr>
+        <w:tc>
+          <w:tcPr>
+            <w:tcW w:type="dxa" w:w="4702"/>
+            <w:vAlign w:val="center"/>
+          </w:tcPr>
+          <w:p>
+            <w:pPr>
+              <w:spacing w:line="264" w:lineRule="auto" w:after="0"/>
+              <w:jc w:val="left"/>
+            </w:pPr>
+            <w:r/>
+            <w:r>
+              <w:t>Specificity của pixel nền</w:t>
+            </w:r>
+          </w:p>
+        </w:tc>
+        <w:tc>
+          <w:tcPr>
+            <w:tcW w:type="dxa" w:w="4702"/>
+            <w:vAlign w:val="center"/>
+          </w:tcPr>
+          <w:p>
+            <w:pPr>
+              <w:spacing w:line="264" w:lineRule="auto" w:after="0"/>
+              <w:jc w:val="left"/>
+            </w:pPr>
+            <w:r/>
+            <w:r>
+              <w:t>0,9716</w:t>
+            </w:r>
+          </w:p>
+        </w:tc>
+      </w:tr>
+    </w:tbl>
+    <w:p>
+      <w:pPr>
+        <w:spacing w:after="0"/>
+      </w:pPr>
     </w:p>
     <w:p>
       <w:pPr>
-        <w:pStyle w:val="Heading2"/>
-        <w:keepNext/>
+        <w:jc w:val="both"/>
       </w:pPr>
+      <w:r>
+        <w:t xml:space="preserve">Nguồn: </w:t>
+      </w:r>
+      <w:r>
+        <w:rPr>
+          <w:rFonts w:ascii="Consolas" w:hAnsi="Consolas"/>
+          <w:sz w:val="20"/>
+        </w:rPr>
+        <w:t>evaluation/retrain_2d_2026-10-03/test_summary.json</w:t>
+      </w:r>
+      <w:r>
+        <w:t xml:space="preserve">. Đây là </w:t>
+      </w:r>
       <w:r>
         <w:rPr>
           <w:b/>
-          <w:sz w:val="25"/>
         </w:rPr>
-        <w:t>2.4. Nguyên tắc sử dụng Test Set</w:t>
+        <w:t>Segmentation Metrics</w:t>
+      </w:r>
+      <w:r>
+        <w:t>, không phải Diagnostic Accuracy. Các số liệu này thuộc split huấn luyện riêng, không phải kết quả của bộ Mốc 1. Báo cáo đánh giá ghi nhận danh tính bệnh nhân nguồn chưa được xác minh và Test của lượt huấn luyện này từng được truy cập trong đánh giá checkpoint trước đó; vì vậy không diễn giải là đánh giá mù hoặc độc lập cấp bệnh nhân.</w:t>
       </w:r>
     </w:p>
     <w:p>
@@ -2535,77 +689,208 @@
         <w:jc w:val="both"/>
       </w:pPr>
       <w:r>
-        <w:t xml:space="preserve">Trong Mốc 2, mọi kiểm tra tích hợp và đo độ trễ mới trên bộ 307 ảnh chỉ dùng </w:t>
+        <w:t xml:space="preserve">Kiểm tra suy luận trên 46 ảnh Validation Mốc 1 nạp checkpoint thành công với </w:t>
+      </w:r>
+      <w:r>
+        <w:rPr>
+          <w:rFonts w:ascii="Consolas" w:hAnsi="Consolas"/>
+          <w:sz w:val="20"/>
+        </w:rPr>
+        <w:t>strict=True</w:t>
+      </w:r>
+      <w:r>
+        <w:t>, không thiếu/thừa key (</w:t>
+      </w:r>
+      <w:r>
+        <w:rPr>
+          <w:rFonts w:ascii="Consolas" w:hAnsi="Consolas"/>
+          <w:sz w:val="20"/>
+        </w:rPr>
+        <w:t>evaluation/m1_validation_sanity_check.json</w:t>
+      </w:r>
+      <w:r>
+        <w:t xml:space="preserve">). Median forward pass là </w:t>
       </w:r>
       <w:r>
         <w:rPr>
           <w:b/>
         </w:rPr>
-        <w:t>Validation 46 ảnh</w:t>
+        <w:t>30,26 ms</w:t>
       </w:r>
       <w:r>
-        <w:t xml:space="preserve">. Mốc 2 </w:t>
+        <w:t xml:space="preserve">; median tiền xử lý cộng forward là </w:t>
       </w:r>
       <w:r>
         <w:rPr>
           <w:b/>
         </w:rPr>
-        <w:t>không thực hiện phép đánh giá Test mới trên bộ 307 ảnh Mốc 1</w:t>
+        <w:t>46,04 ms</w:t>
       </w:r>
       <w:r>
-        <w:t xml:space="preserve"> và không sử dụng 46 ảnh Test đó để chọn checkpoint, threshold hay giao diện. Tập Test Mốc 1 </w:t>
+        <w:t xml:space="preserve">. Phép đo API trên Validation Mốc 1 có </w:t>
       </w:r>
       <w:r>
         <w:rPr>
           <w:b/>
         </w:rPr>
-        <w:t>đã có kết quả baseline trước đó</w:t>
+        <w:t>5 quan sát</w:t>
       </w:r>
       <w:r>
-        <w:t xml:space="preserve">, nên nếu tiếp tục dùng ở Mốc 3, báo cáo phải ghi rõ đây là phân tích bổ sung trên tập đã có lịch sử truy cập, không gọi là lần đánh giá mù đầu tiên. Riêng checkpoint </w:t>
+        <w:t xml:space="preserve">, median </w:t>
       </w:r>
-      <w:r>
-        <w:t>5e14be...</w:t>
-      </w:r>
-      <w:r>
-        <w:t xml:space="preserve"> đã có </w:t>
-      </w:r>
-      <w:hyperlink r:id="rId26">
-        <w:r>
-          <w:rPr>
-            <w:color w:val="17518A"/>
-          </w:rPr>
-          <w:t>lượt đánh giá trên 382 ảnh Test của bộ dữ liệu khác</w:t>
-        </w:r>
-      </w:hyperlink>
-      <w:r>
-        <w:t>; kết quả đó không phải metric của bộ Mốc 1 và không được dùng làm bằng chứng độc lập cấp bệnh nhân khi chưa có PID nguồn.</w:t>
-      </w:r>
-    </w:p>
-    <w:p>
-      <w:pPr>
-        <w:pStyle w:val="Heading1"/>
-        <w:keepNext/>
-      </w:pPr>
       <w:r>
         <w:rPr>
           <w:b/>
-          <w:sz w:val="28"/>
         </w:rPr>
-        <w:t>III. WEB PROTOTYPE VÀ LUỒNG HUMAN-IN-THE-LOOP</w:t>
+        <w:t>176,69 ms</w:t>
+      </w:r>
+      <w:r>
+        <w:t xml:space="preserve">, p95 </w:t>
+      </w:r>
+      <w:r>
+        <w:rPr>
+          <w:b/>
+        </w:rPr>
+        <w:t>185,76 ms</w:t>
+      </w:r>
+      <w:r>
+        <w:t xml:space="preserve"> (</w:t>
+      </w:r>
+      <w:r>
+        <w:rPr>
+          <w:rFonts w:ascii="Consolas" w:hAnsi="Consolas"/>
+          <w:sz w:val="20"/>
+        </w:rPr>
+        <w:t>evaluation/milestone_2_m1_scope/api_latency_validation_2026-10-04.json</w:t>
+      </w:r>
+      <w:r>
+        <w:t>). Cỡ mẫu nhỏ nên chỉ mang tính mô tả, chưa đại diện cho tải thực tế.</w:t>
       </w:r>
     </w:p>
     <w:p>
       <w:pPr>
         <w:pStyle w:val="Heading2"/>
-        <w:keepNext/>
       </w:pPr>
+      <w:r>
+        <w:t>3. Minh chứng và rủi ro</w:t>
+      </w:r>
+    </w:p>
+    <w:p>
+      <w:pPr>
+        <w:pStyle w:val="ListBullet"/>
+        <w:jc w:val="both"/>
+      </w:pPr>
+      <w:r>
+        <w:t xml:space="preserve">Automated tests: </w:t>
+      </w:r>
       <w:r>
         <w:rPr>
           <w:b/>
-          <w:sz w:val="25"/>
         </w:rPr>
-        <w:t>3.1. Kiến trúc tích hợp</w:t>
+        <w:t>61 passed, 0 failed</w:t>
+      </w:r>
+      <w:r>
+        <w:t xml:space="preserve">. Ruff: </w:t>
+      </w:r>
+      <w:r>
+        <w:rPr>
+          <w:b/>
+        </w:rPr>
+        <w:t>All checks passed</w:t>
+      </w:r>
+      <w:r>
+        <w:t xml:space="preserve">. API khởi động, trả trạng thái healthy và nạp đúng checkpoint SHA </w:t>
+      </w:r>
+      <w:r>
+        <w:rPr>
+          <w:rFonts w:ascii="Consolas" w:hAnsi="Consolas"/>
+          <w:sz w:val="20"/>
+        </w:rPr>
+        <w:t>5e14be…494e</w:t>
+      </w:r>
+      <w:r>
+        <w:t>.</w:t>
+      </w:r>
+    </w:p>
+    <w:p>
+      <w:pPr>
+        <w:pStyle w:val="ListBullet"/>
+        <w:jc w:val="both"/>
+      </w:pPr>
+      <w:r>
+        <w:t>Browser smoke log ngày 04/10 ghi PASS cho kịch bản một ảnh Validation, gồm suy luận, các chế độ xem, Brush/Eraser, Undo, lưu và mở lại ca (</w:t>
+      </w:r>
+      <w:r>
+        <w:rPr>
+          <w:rFonts w:ascii="Consolas" w:hAnsi="Consolas"/>
+          <w:sz w:val="20"/>
+        </w:rPr>
+        <w:t>evaluation/milestone_2_m1_scope/browser_smoke_2026-10-04.json</w:t>
+      </w:r>
+      <w:r>
+        <w:t>). Trong lượt rà soát hiện tại chưa chạy lại browser test vì môi trường thiếu Playwright.</w:t>
+      </w:r>
+    </w:p>
+    <w:p>
+      <w:pPr>
+        <w:pStyle w:val="ListBullet"/>
+        <w:jc w:val="both"/>
+      </w:pPr>
+      <w:r>
+        <w:t>Mốc 1 có 185 mã nhóm ẩn danh rời nhau trong các split; chưa có mapping xác thực tới PID bệnh viện, nên chưa thể kết luận patient-level independence. Có 35 mask rỗng dẫn xuất; không xem là nhãn âm tính lâm sàng và không dùng để tính metric y tế. File provenance được dẫn trong tài liệu cũ hiện không có tại đường dẫn đã ghi, cần khôi phục hoặc xác minh trước khi sử dụng.</w:t>
+      </w:r>
+    </w:p>
+    <w:p>
+      <w:pPr>
+        <w:pStyle w:val="ListBullet"/>
+        <w:jc w:val="both"/>
+      </w:pPr>
+      <w:r>
+        <w:t>Chưa hoàn tất so sánh kiến trúc thứ hai hoặc đánh giá usability với chuyên viên y tế.</w:t>
+      </w:r>
+    </w:p>
+    <w:p>
+      <w:pPr>
+        <w:pStyle w:val="Heading2"/>
+      </w:pPr>
+      <w:r>
+        <w:t>4. Kế hoạch tiếp theo — Mốc 3 (06/10–18/10/2026)</w:t>
+      </w:r>
+    </w:p>
+    <w:p>
+      <w:pPr>
+        <w:pStyle w:val="ListNumber"/>
+        <w:jc w:val="both"/>
+      </w:pPr>
+      <w:r>
+        <w:t>Xác minh nguồn Ground Truth và provenance mask trước khi tính metric bổ sung; giữ nguyên lịch sử sử dụng Test và không gọi lần đánh giá tiếp theo là “mù” nếu dữ liệu đã được truy cập.</w:t>
+      </w:r>
+    </w:p>
+    <w:p>
+      <w:pPr>
+        <w:pStyle w:val="ListNumber"/>
+        <w:jc w:val="both"/>
+      </w:pPr>
+      <w:r>
+        <w:t>Kiểm tra lại E2E trên browser khi có Playwright; lưu ảnh prediction/overlay và log thao tác HITL.</w:t>
+      </w:r>
+    </w:p>
+    <w:p>
+      <w:pPr>
+        <w:pStyle w:val="ListNumber"/>
+        <w:jc w:val="both"/>
+      </w:pPr>
+      <w:r>
+        <w:t>Phân tích các ca phân đoạn tốt và lỗi lớn bằng ảnh gốc, mask tham chiếu và mask dự đoán; chỉ mô tả “vùng nghi ngờ tổn thương được phân đoạn”, không tự gán nhãn bệnh học.</w:t>
+      </w:r>
+    </w:p>
+    <w:p>
+      <w:pPr>
+        <w:pStyle w:val="ListNumber"/>
+        <w:jc w:val="both"/>
+      </w:pPr>
+      <w:r>
+        <w:t>Nếu tiếp cận được chuyên viên, ghi nhận thời gian thao tác và phản hồi về tính hữu dụng của Brush/Eraser và quy trình Confirm/Save.</w:t>
       </w:r>
     </w:p>
     <w:p>
@@ -2613,1271 +898,7 @@
         <w:jc w:val="both"/>
       </w:pPr>
       <w:r>
-        <w:t xml:space="preserve">Backend FastAPI tiếp nhận ảnh, quản lý bản ghi và cung cấp API suy diễn; PyTorch nạp checkpoint và dự đoán mask. Frontend dùng HTML, JavaScript và HTML5 Canvas để trình bày ảnh, overlay và công cụ chỉnh sửa. </w:t>
-      </w:r>
-      <w:hyperlink r:id="rId27">
-        <w:r>
-          <w:rPr>
-            <w:color w:val="17518A"/>
-          </w:rPr>
-          <w:t>API suy diễn</w:t>
-        </w:r>
-      </w:hyperlink>
-      <w:r>
-        <w:t xml:space="preserve">, </w:t>
-      </w:r>
-      <w:hyperlink r:id="rId28">
-        <w:r>
-          <w:rPr>
-            <w:color w:val="17518A"/>
-          </w:rPr>
-          <w:t>dịch vụ mô hình</w:t>
-        </w:r>
-      </w:hyperlink>
-      <w:r>
-        <w:t xml:space="preserve">, </w:t>
-      </w:r>
-      <w:hyperlink r:id="rId29">
-        <w:r>
-          <w:rPr>
-            <w:color w:val="17518A"/>
-          </w:rPr>
-          <w:t>viewer</w:t>
-        </w:r>
-      </w:hyperlink>
-      <w:r>
-        <w:t xml:space="preserve"> và </w:t>
-      </w:r>
-      <w:hyperlink r:id="rId30">
-        <w:r>
-          <w:rPr>
-            <w:color w:val="17518A"/>
-          </w:rPr>
-          <w:t>API review</w:t>
-        </w:r>
-      </w:hyperlink>
-      <w:r>
-        <w:t xml:space="preserve"> là các thành phần chính của luồng.</w:t>
-      </w:r>
-    </w:p>
-    <w:p>
-      <w:pPr>
-        <w:pStyle w:val="Heading2"/>
-        <w:keepNext/>
-      </w:pPr>
-      <w:r>
-        <w:rPr>
-          <w:b/>
-          <w:sz w:val="25"/>
-        </w:rPr>
-        <w:t>3.2. Quy trình năm bước khép kín</w:t>
-      </w:r>
-    </w:p>
-    <w:p>
-      <w:pPr>
-        <w:keepNext/>
-        <w:jc w:val="center"/>
-      </w:pPr>
-      <w:r>
-        <w:rPr>
-          <w:b/>
-        </w:rPr>
-        <w:t>Bảng 5. Luồng thao tác đã triển khai và kiểm tra</w:t>
-      </w:r>
-    </w:p>
-    <w:tbl>
-      <w:tblPr>
-        <w:tblStyle w:val="TableGrid"/>
-        <w:tblW w:type="auto" w:w="0"/>
-        <w:jc w:val="center"/>
-        <w:tblLayout w:type="autofit"/>
-        <w:tblLook w:firstColumn="1" w:firstRow="1" w:lastColumn="0" w:lastRow="0" w:noHBand="0" w:noVBand="1" w:val="04A0"/>
-      </w:tblPr>
-      <w:tblGrid>
-        <w:gridCol w:w="3024"/>
-        <w:gridCol w:w="3024"/>
-        <w:gridCol w:w="3024"/>
-      </w:tblGrid>
-      <w:tr>
-        <w:tc>
-          <w:tcPr>
-            <w:tcW w:type="dxa" w:w="3024"/>
-            <w:tcBorders>
-              <w:top w:val="single" w:sz="5" w:color="B7C0C8"/>
-              <w:left w:val="single" w:sz="5" w:color="B7C0C8"/>
-              <w:bottom w:val="single" w:sz="5" w:color="B7C0C8"/>
-              <w:right w:val="single" w:sz="5" w:color="B7C0C8"/>
-            </w:tcBorders>
-            <w:shd w:fill="E9EDF1"/>
-          </w:tcPr>
-          <w:p>
-            <w:pPr>
-              <w:keepNext/>
-              <w:jc w:val="center"/>
-            </w:pPr>
-            <w:r>
-              <w:rPr>
-                <w:rFonts w:ascii="Times New Roman" w:hAnsi="Times New Roman"/>
-                <w:b/>
-                <w:sz w:val="19"/>
-              </w:rPr>
-              <w:t>Bước</w:t>
-            </w:r>
-          </w:p>
-        </w:tc>
-        <w:tc>
-          <w:tcPr>
-            <w:tcW w:type="dxa" w:w="3024"/>
-            <w:tcBorders>
-              <w:top w:val="single" w:sz="5" w:color="B7C0C8"/>
-              <w:left w:val="single" w:sz="5" w:color="B7C0C8"/>
-              <w:bottom w:val="single" w:sz="5" w:color="B7C0C8"/>
-              <w:right w:val="single" w:sz="5" w:color="B7C0C8"/>
-            </w:tcBorders>
-            <w:shd w:fill="E9EDF1"/>
-          </w:tcPr>
-          <w:p>
-            <w:pPr>
-              <w:keepNext/>
-              <w:jc w:val="center"/>
-            </w:pPr>
-            <w:r>
-              <w:rPr>
-                <w:rFonts w:ascii="Times New Roman" w:hAnsi="Times New Roman"/>
-                <w:b/>
-                <w:sz w:val="19"/>
-              </w:rPr>
-              <w:t>Chức năng</w:t>
-            </w:r>
-          </w:p>
-        </w:tc>
-        <w:tc>
-          <w:tcPr>
-            <w:tcW w:type="dxa" w:w="3024"/>
-            <w:tcBorders>
-              <w:top w:val="single" w:sz="5" w:color="B7C0C8"/>
-              <w:left w:val="single" w:sz="5" w:color="B7C0C8"/>
-              <w:bottom w:val="single" w:sz="5" w:color="B7C0C8"/>
-              <w:right w:val="single" w:sz="5" w:color="B7C0C8"/>
-            </w:tcBorders>
-            <w:shd w:fill="E9EDF1"/>
-          </w:tcPr>
-          <w:p>
-            <w:pPr>
-              <w:keepNext/>
-              <w:jc w:val="center"/>
-            </w:pPr>
-            <w:r>
-              <w:rPr>
-                <w:rFonts w:ascii="Times New Roman" w:hAnsi="Times New Roman"/>
-                <w:b/>
-                <w:sz w:val="19"/>
-              </w:rPr>
-              <w:t>Kết quả người dùng nhận được</w:t>
-            </w:r>
-          </w:p>
-        </w:tc>
-      </w:tr>
-      <w:tr>
-        <w:tc>
-          <w:tcPr>
-            <w:tcW w:type="dxa" w:w="3024"/>
-            <w:tcBorders>
-              <w:top w:val="single" w:sz="5" w:color="B7C0C8"/>
-              <w:left w:val="single" w:sz="5" w:color="B7C0C8"/>
-              <w:bottom w:val="single" w:sz="5" w:color="B7C0C8"/>
-              <w:right w:val="single" w:sz="5" w:color="B7C0C8"/>
-            </w:tcBorders>
-          </w:tcPr>
-          <w:p>
-            <w:r>
-              <w:rPr>
-                <w:rFonts w:ascii="Times New Roman" w:hAnsi="Times New Roman"/>
-                <w:sz w:val="19"/>
-              </w:rPr>
-              <w:t>1. Upload</w:t>
-            </w:r>
-          </w:p>
-        </w:tc>
-        <w:tc>
-          <w:tcPr>
-            <w:tcW w:type="dxa" w:w="3024"/>
-            <w:tcBorders>
-              <w:top w:val="single" w:sz="5" w:color="B7C0C8"/>
-              <w:left w:val="single" w:sz="5" w:color="B7C0C8"/>
-              <w:bottom w:val="single" w:sz="5" w:color="B7C0C8"/>
-              <w:right w:val="single" w:sz="5" w:color="B7C0C8"/>
-            </w:tcBorders>
-          </w:tcPr>
-          <w:p>
-            <w:r>
-              <w:rPr>
-                <w:rFonts w:ascii="Times New Roman" w:hAnsi="Times New Roman"/>
-                <w:sz w:val="19"/>
-              </w:rPr>
-              <w:t>Chọn ảnh siêu âm; backend kiểm tra tệp và giải mã grayscale. Letterbox 512×512 được thực hiện trước khi đưa tensor vào mô hình.</w:t>
-            </w:r>
-          </w:p>
-        </w:tc>
-        <w:tc>
-          <w:tcPr>
-            <w:tcW w:type="dxa" w:w="3024"/>
-            <w:tcBorders>
-              <w:top w:val="single" w:sz="5" w:color="B7C0C8"/>
-              <w:left w:val="single" w:sz="5" w:color="B7C0C8"/>
-              <w:bottom w:val="single" w:sz="5" w:color="B7C0C8"/>
-              <w:right w:val="single" w:sz="5" w:color="B7C0C8"/>
-            </w:tcBorders>
-          </w:tcPr>
-          <w:p>
-            <w:r>
-              <w:rPr>
-                <w:rFonts w:ascii="Times New Roman" w:hAnsi="Times New Roman"/>
-                <w:sz w:val="19"/>
-              </w:rPr>
-              <w:t>Ảnh gốc được lưu cùng bản ghi để truy xuất.</w:t>
-            </w:r>
-          </w:p>
-        </w:tc>
-      </w:tr>
-      <w:tr>
-        <w:tc>
-          <w:tcPr>
-            <w:tcW w:type="dxa" w:w="3024"/>
-            <w:tcBorders>
-              <w:top w:val="single" w:sz="5" w:color="B7C0C8"/>
-              <w:left w:val="single" w:sz="5" w:color="B7C0C8"/>
-              <w:bottom w:val="single" w:sz="5" w:color="B7C0C8"/>
-              <w:right w:val="single" w:sz="5" w:color="B7C0C8"/>
-            </w:tcBorders>
-            <w:shd w:fill="F7F9FA"/>
-          </w:tcPr>
-          <w:p>
-            <w:r>
-              <w:rPr>
-                <w:rFonts w:ascii="Times New Roman" w:hAnsi="Times New Roman"/>
-                <w:sz w:val="19"/>
-              </w:rPr>
-              <w:t>2. Segmentation</w:t>
-            </w:r>
-          </w:p>
-        </w:tc>
-        <w:tc>
-          <w:tcPr>
-            <w:tcW w:type="dxa" w:w="3024"/>
-            <w:tcBorders>
-              <w:top w:val="single" w:sz="5" w:color="B7C0C8"/>
-              <w:left w:val="single" w:sz="5" w:color="B7C0C8"/>
-              <w:bottom w:val="single" w:sz="5" w:color="B7C0C8"/>
-              <w:right w:val="single" w:sz="5" w:color="B7C0C8"/>
-            </w:tcBorders>
-            <w:shd w:fill="F7F9FA"/>
-          </w:tcPr>
-          <w:p>
-            <w:r>
-              <w:rPr>
-                <w:rFonts w:ascii="Times New Roman" w:hAnsi="Times New Roman"/>
-                <w:sz w:val="19"/>
-              </w:rPr>
-              <w:t>Áp dụng tiền xử lý, chạy Standard U-Net với ngưỡng 0,5 và tạo mask nhị phân.</w:t>
-            </w:r>
-          </w:p>
-        </w:tc>
-        <w:tc>
-          <w:tcPr>
-            <w:tcW w:type="dxa" w:w="3024"/>
-            <w:tcBorders>
-              <w:top w:val="single" w:sz="5" w:color="B7C0C8"/>
-              <w:left w:val="single" w:sz="5" w:color="B7C0C8"/>
-              <w:bottom w:val="single" w:sz="5" w:color="B7C0C8"/>
-              <w:right w:val="single" w:sz="5" w:color="B7C0C8"/>
-            </w:tcBorders>
-            <w:shd w:fill="F7F9FA"/>
-          </w:tcPr>
-          <w:p>
-            <w:r>
-              <w:rPr>
-                <w:rFonts w:ascii="Times New Roman" w:hAnsi="Times New Roman"/>
-                <w:sz w:val="19"/>
-              </w:rPr>
-              <w:t>Có dự đoán để người dùng tiếp tục rà soát; độ trễ theo từng phạm vi đo ở Bảng 4.</w:t>
-            </w:r>
-          </w:p>
-        </w:tc>
-      </w:tr>
-      <w:tr>
-        <w:tc>
-          <w:tcPr>
-            <w:tcW w:type="dxa" w:w="3024"/>
-            <w:tcBorders>
-              <w:top w:val="single" w:sz="5" w:color="B7C0C8"/>
-              <w:left w:val="single" w:sz="5" w:color="B7C0C8"/>
-              <w:bottom w:val="single" w:sz="5" w:color="B7C0C8"/>
-              <w:right w:val="single" w:sz="5" w:color="B7C0C8"/>
-            </w:tcBorders>
-          </w:tcPr>
-          <w:p>
-            <w:r>
-              <w:rPr>
-                <w:rFonts w:ascii="Times New Roman" w:hAnsi="Times New Roman"/>
-                <w:sz w:val="19"/>
-              </w:rPr>
-              <w:t>3. Interactive Viewer</w:t>
-            </w:r>
-          </w:p>
-        </w:tc>
-        <w:tc>
-          <w:tcPr>
-            <w:tcW w:type="dxa" w:w="3024"/>
-            <w:tcBorders>
-              <w:top w:val="single" w:sz="5" w:color="B7C0C8"/>
-              <w:left w:val="single" w:sz="5" w:color="B7C0C8"/>
-              <w:bottom w:val="single" w:sz="5" w:color="B7C0C8"/>
-              <w:right w:val="single" w:sz="5" w:color="B7C0C8"/>
-            </w:tcBorders>
-          </w:tcPr>
-          <w:p>
-            <w:r>
-              <w:rPr>
-                <w:rFonts w:ascii="Times New Roman" w:hAnsi="Times New Roman"/>
-                <w:sz w:val="19"/>
-              </w:rPr>
-              <w:t>Chuyển giữa Original, Mask và Overlay; điều chỉnh opacity, zoom và pan.</w:t>
-            </w:r>
-          </w:p>
-        </w:tc>
-        <w:tc>
-          <w:tcPr>
-            <w:tcW w:type="dxa" w:w="3024"/>
-            <w:tcBorders>
-              <w:top w:val="single" w:sz="5" w:color="B7C0C8"/>
-              <w:left w:val="single" w:sz="5" w:color="B7C0C8"/>
-              <w:bottom w:val="single" w:sz="5" w:color="B7C0C8"/>
-              <w:right w:val="single" w:sz="5" w:color="B7C0C8"/>
-            </w:tcBorders>
-          </w:tcPr>
-          <w:p>
-            <w:r>
-              <w:rPr>
-                <w:rFonts w:ascii="Times New Roman" w:hAnsi="Times New Roman"/>
-                <w:sz w:val="19"/>
-              </w:rPr>
-              <w:t>Có thể đối chiếu vùng phân đoạn với ảnh gốc.</w:t>
-            </w:r>
-          </w:p>
-        </w:tc>
-      </w:tr>
-      <w:tr>
-        <w:tc>
-          <w:tcPr>
-            <w:tcW w:type="dxa" w:w="3024"/>
-            <w:tcBorders>
-              <w:top w:val="single" w:sz="5" w:color="B7C0C8"/>
-              <w:left w:val="single" w:sz="5" w:color="B7C0C8"/>
-              <w:bottom w:val="single" w:sz="5" w:color="B7C0C8"/>
-              <w:right w:val="single" w:sz="5" w:color="B7C0C8"/>
-            </w:tcBorders>
-            <w:shd w:fill="F7F9FA"/>
-          </w:tcPr>
-          <w:p>
-            <w:r>
-              <w:rPr>
-                <w:rFonts w:ascii="Times New Roman" w:hAnsi="Times New Roman"/>
-                <w:sz w:val="19"/>
-              </w:rPr>
-              <w:t>4. Review / Edit</w:t>
-            </w:r>
-          </w:p>
-        </w:tc>
-        <w:tc>
-          <w:tcPr>
-            <w:tcW w:type="dxa" w:w="3024"/>
-            <w:tcBorders>
-              <w:top w:val="single" w:sz="5" w:color="B7C0C8"/>
-              <w:left w:val="single" w:sz="5" w:color="B7C0C8"/>
-              <w:bottom w:val="single" w:sz="5" w:color="B7C0C8"/>
-              <w:right w:val="single" w:sz="5" w:color="B7C0C8"/>
-            </w:tcBorders>
-            <w:shd w:fill="F7F9FA"/>
-          </w:tcPr>
-          <w:p>
-            <w:r>
-              <w:rPr>
-                <w:rFonts w:ascii="Times New Roman" w:hAnsi="Times New Roman"/>
-                <w:sz w:val="19"/>
-              </w:rPr>
-              <w:t>Brush thêm vùng mô hình bỏ sót; Eraser xóa vùng dương tính giả. Có tùy chỉnh kích thước nét, Undo/Redo và Reset.</w:t>
-            </w:r>
-          </w:p>
-        </w:tc>
-        <w:tc>
-          <w:tcPr>
-            <w:tcW w:type="dxa" w:w="3024"/>
-            <w:tcBorders>
-              <w:top w:val="single" w:sz="5" w:color="B7C0C8"/>
-              <w:left w:val="single" w:sz="5" w:color="B7C0C8"/>
-              <w:bottom w:val="single" w:sz="5" w:color="B7C0C8"/>
-              <w:right w:val="single" w:sz="5" w:color="B7C0C8"/>
-            </w:tcBorders>
-            <w:shd w:fill="F7F9FA"/>
-          </w:tcPr>
-          <w:p>
-            <w:r>
-              <w:rPr>
-                <w:rFonts w:ascii="Times New Roman" w:hAnsi="Times New Roman"/>
-                <w:sz w:val="19"/>
-              </w:rPr>
-              <w:t>Người dùng trực tiếp hiệu chỉnh mask trên Canvas.</w:t>
-            </w:r>
-          </w:p>
-        </w:tc>
-      </w:tr>
-      <w:tr>
-        <w:tc>
-          <w:tcPr>
-            <w:tcW w:type="dxa" w:w="3024"/>
-            <w:tcBorders>
-              <w:top w:val="single" w:sz="5" w:color="B7C0C8"/>
-              <w:left w:val="single" w:sz="5" w:color="B7C0C8"/>
-              <w:bottom w:val="single" w:sz="5" w:color="B7C0C8"/>
-              <w:right w:val="single" w:sz="5" w:color="B7C0C8"/>
-            </w:tcBorders>
-          </w:tcPr>
-          <w:p>
-            <w:r>
-              <w:rPr>
-                <w:rFonts w:ascii="Times New Roman" w:hAnsi="Times New Roman"/>
-                <w:sz w:val="19"/>
-              </w:rPr>
-              <w:t>5. Confirm / Save</w:t>
-            </w:r>
-          </w:p>
-        </w:tc>
-        <w:tc>
-          <w:tcPr>
-            <w:tcW w:type="dxa" w:w="3024"/>
-            <w:tcBorders>
-              <w:top w:val="single" w:sz="5" w:color="B7C0C8"/>
-              <w:left w:val="single" w:sz="5" w:color="B7C0C8"/>
-              <w:bottom w:val="single" w:sz="5" w:color="B7C0C8"/>
-              <w:right w:val="single" w:sz="5" w:color="B7C0C8"/>
-            </w:tcBorders>
-          </w:tcPr>
-          <w:p>
-            <w:r>
-              <w:rPr>
-                <w:rFonts w:ascii="Times New Roman" w:hAnsi="Times New Roman"/>
-                <w:sz w:val="19"/>
-              </w:rPr>
-              <w:t>Gửi kết quả rà soát tới API, lưu bản ghi review và mở lại để đối chiếu.</w:t>
-            </w:r>
-          </w:p>
-        </w:tc>
-        <w:tc>
-          <w:tcPr>
-            <w:tcW w:type="dxa" w:w="3024"/>
-            <w:tcBorders>
-              <w:top w:val="single" w:sz="5" w:color="B7C0C8"/>
-              <w:left w:val="single" w:sz="5" w:color="B7C0C8"/>
-              <w:bottom w:val="single" w:sz="5" w:color="B7C0C8"/>
-              <w:right w:val="single" w:sz="5" w:color="B7C0C8"/>
-            </w:tcBorders>
-          </w:tcPr>
-          <w:p>
-            <w:r>
-              <w:rPr>
-                <w:rFonts w:ascii="Times New Roman" w:hAnsi="Times New Roman"/>
-                <w:sz w:val="19"/>
-              </w:rPr>
-              <w:t>Mask dự đoán ban đầu và mask sau rà soát được lưu tách biệt, có mã truy vết.</w:t>
-            </w:r>
-          </w:p>
-        </w:tc>
-      </w:tr>
-    </w:tbl>
-    <w:p>
-      <w:pPr>
-        <w:jc w:val="both"/>
-      </w:pPr>
-      <w:hyperlink r:id="rId31">
-        <w:r>
-          <w:rPr>
-            <w:color w:val="17518A"/>
-          </w:rPr>
-          <w:t>Browser smoke test</w:t>
-        </w:r>
-      </w:hyperlink>
-      <w:r>
-        <w:t xml:space="preserve"> ghi </w:t>
-      </w:r>
-      <w:r>
-        <w:rPr>
-          <w:b/>
-        </w:rPr>
-        <w:t>PASS</w:t>
-      </w:r>
-      <w:r>
-        <w:t xml:space="preserve"> cho kịch bản dùng ảnh </w:t>
-      </w:r>
-      <w:r>
-        <w:t>41.JPG</w:t>
-      </w:r>
-      <w:r>
-        <w:t xml:space="preserve"> thuộc Validation Mốc 1: tải ảnh, dự đoán, chuyển chế độ xem, Brush/Eraser, Undo, lưu và mở lại ca. Log ghi </w:t>
-      </w:r>
-      <w:r>
-        <w:rPr>
-          <w:b/>
-        </w:rPr>
-        <w:t>0 lỗi console ngoài dự kiến</w:t>
-      </w:r>
-      <w:r>
-        <w:t xml:space="preserve"> và cùng SHA checkpoint </w:t>
-      </w:r>
-      <w:r>
-        <w:t>5e14be...</w:t>
-      </w:r>
-      <w:r>
-        <w:t>. Kết quả này xác nhận kịch bản tích hợp đã kiểm tra; chưa phải đánh giá tính dễ dùng trên nhiều chuyên viên hoặc nhiều thiết bị.</w:t>
-      </w:r>
-    </w:p>
-    <w:p>
-      <w:pPr>
-        <w:pStyle w:val="Heading2"/>
-        <w:keepNext/>
-      </w:pPr>
-      <w:r>
-        <w:rPr>
-          <w:b/>
-          <w:sz w:val="25"/>
-        </w:rPr>
-        <w:t>3.3. Phạm vi xác nhận của chuyên viên y tế</w:t>
-      </w:r>
-    </w:p>
-    <w:p>
-      <w:pPr>
-        <w:jc w:val="both"/>
-      </w:pPr>
-      <w:r>
-        <w:t xml:space="preserve">Brush và Eraser hỗ trợ chỉnh mask khi chuyên viên quan sát thấy vùng thiếu hoặc vùng dương tính giả. Hệ thống lưu lịch sử review gắn với ảnh và kết quả mô hình để có thể đối chiếu phiên bản trước và sau chỉnh sửa. Nút Confirm ghi nhận quyết định của người thao tác trong prototype; nó không tự biến mask thành Ground Truth được hội đồng chuyên môn phê duyệt. Hệ thống là </w:t>
-      </w:r>
-      <w:r>
-        <w:rPr>
-          <w:b/>
-        </w:rPr>
-        <w:t>công cụ hỗ trợ quyết định</w:t>
-      </w:r>
-      <w:r>
-        <w:t>, còn quyết định lâm sàng cuối cùng thuộc về chuyên viên y tế.</w:t>
-      </w:r>
-    </w:p>
-    <w:p>
-      <w:pPr>
-        <w:pStyle w:val="Heading1"/>
-        <w:keepNext/>
-      </w:pPr>
-      <w:r>
-        <w:rPr>
-          <w:b/>
-          <w:sz w:val="28"/>
-        </w:rPr>
-        <w:t>IV. QUẢN TRỊ DỮ LIỆU VÀ KIỂM THỬ ĐỘ TIN CẬY</w:t>
-      </w:r>
-    </w:p>
-    <w:p>
-      <w:pPr>
-        <w:pStyle w:val="Heading2"/>
-        <w:keepNext/>
-      </w:pPr>
-      <w:r>
-        <w:rPr>
-          <w:b/>
-          <w:sz w:val="25"/>
-        </w:rPr>
-        <w:t>4.1. Toàn vẹn 307 cặp ảnh–mask và nguồn gốc 35 mask rỗng</w:t>
-      </w:r>
-    </w:p>
-    <w:p>
-      <w:pPr>
-        <w:jc w:val="both"/>
-      </w:pPr>
-      <w:r>
-        <w:t xml:space="preserve">Trong CSV Mốc 1 có 35 bản ghi chỉ tới mask rỗng (25 Train, 5 Validation, 5 Test). Các đường dẫn này hiện có PNG một kênh </w:t>
-      </w:r>
-      <w:r>
-        <w:rPr>
-          <w:b/>
-        </w:rPr>
-        <w:t>512×512, toàn pixel 0</w:t>
-      </w:r>
-      <w:r>
-        <w:t xml:space="preserve">, được lưu như </w:t>
-      </w:r>
-      <w:r>
-        <w:rPr>
-          <w:b/>
-        </w:rPr>
-        <w:t>Mock Fallback Artifacts</w:t>
-      </w:r>
-      <w:r>
-        <w:t xml:space="preserve"> nhằm kiểm thử khả năng đọc dữ liệu và tính toàn vẹn của pipeline, không phải ca âm tính thật. </w:t>
-      </w:r>
-      <w:hyperlink r:id="rId32">
-        <w:r>
-          <w:rPr>
-            <w:color w:val="17518A"/>
-          </w:rPr>
-          <w:t>Hồ sơ nguồn gốc</w:t>
-        </w:r>
-      </w:hyperlink>
-      <w:r>
-        <w:t xml:space="preserve"> liệt kê từng đường dẫn, SHA-256 và mask nguồn tương ứng. Script đã xác nhận </w:t>
-      </w:r>
-      <w:r>
-        <w:rPr>
-          <w:b/>
-        </w:rPr>
-        <w:t>307/307 cặp</w:t>
-      </w:r>
-      <w:r>
-        <w:t xml:space="preserve"> tồn tại và giải mã được bằng cả OpenCV lẫn PIL, không phát sinh lỗi thiếu tệp trong bước kiểm tra.</w:t>
-      </w:r>
-    </w:p>
-    <w:p>
-      <w:pPr>
-        <w:jc w:val="both"/>
-      </w:pPr>
-      <w:r>
-        <w:t xml:space="preserve">Kiểm toán cũng cho thấy mask nguồn của </w:t>
-      </w:r>
-      <w:r>
-        <w:rPr>
-          <w:b/>
-        </w:rPr>
-        <w:t>cả 35 ảnh</w:t>
-      </w:r>
-      <w:r>
-        <w:t xml:space="preserve"> nói trên chứa pixel dương tính. Vì vậy, các mask toàn 0 dẫn xuất </w:t>
-      </w:r>
-      <w:r>
-        <w:rPr>
-          <w:b/>
-        </w:rPr>
-        <w:t>không được dùng làm Ground Truth để tính Dice, IoU, Recall, Precision hay Specificity y tế</w:t>
-      </w:r>
-      <w:r>
-        <w:t>. Mọi phép đánh giá phân đoạn mới phải sử dụng cặp nhãn hợp lệ đã xác minh; báo cáo Mốc 2 chỉ ghi nhận kiểm tra vận hành và nhắc lại metric baseline lịch sử với giới hạn nêu ở Mục 2.2.</w:t>
-      </w:r>
-    </w:p>
-    <w:p>
-      <w:pPr>
-        <w:pStyle w:val="Heading2"/>
-        <w:keepNext/>
-      </w:pPr>
-      <w:r>
-        <w:rPr>
-          <w:b/>
-          <w:sz w:val="25"/>
-        </w:rPr>
-        <w:t>4.2. Mã phân nhóm và giới hạn xác minh bệnh nhân</w:t>
-      </w:r>
-    </w:p>
-    <w:p>
-      <w:pPr>
-        <w:jc w:val="both"/>
-      </w:pPr>
-      <w:r>
-        <w:t xml:space="preserve">CSV Mốc 1 có **185 mã </w:t>
-      </w:r>
-      <w:r>
-        <w:t>ANON-VINMEC-PID-*</w:t>
-      </w:r>
-      <w:r>
-        <w:rPr>
-          <w:b/>
-        </w:rPr>
-        <w:t xml:space="preserve">, phân bổ 130 Train, 27 Validation và 28 Test. [Kiểm toán](../../evaluation/milestone_2_m1_scope/data_audit_2026-10-04.json) xác nhận </w:t>
-      </w:r>
-      <w:r>
-        <w:t>0 mã giao nhau</w:t>
-      </w:r>
-      <w:r>
-        <w:rPr>
-          <w:b/>
-        </w:rPr>
-        <w:t xml:space="preserve"> giữa ba tập, tương đương tỷ lệ giao nhau </w:t>
-      </w:r>
-      <w:r>
-        <w:t xml:space="preserve">0% ở cấp mã phân nhóm**. Trường </w:t>
-      </w:r>
-      <w:r>
-        <w:t>patient_id</w:t>
-      </w:r>
-      <w:r>
-        <w:t xml:space="preserve"> đã có trong schema để hỗ trợ kiểm soát phân hoạch dữ liệu.</w:t>
-      </w:r>
-    </w:p>
-    <w:p>
-      <w:pPr>
-        <w:jc w:val="both"/>
-      </w:pPr>
-      <w:r>
-        <w:t xml:space="preserve">Bộ dữ liệu được cung cấp hiện chưa có bảng ánh xạ những mã này với định danh bệnh nhân gốc của bệnh viện. Vì thế, tính độc lập </w:t>
-      </w:r>
-      <w:r>
-        <w:rPr>
-          <w:b/>
-        </w:rPr>
-        <w:t>cấp bệnh nhân thực</w:t>
-      </w:r>
-      <w:r>
-        <w:t xml:space="preserve"> và việc loại trừ mọi trường hợp rò rỉ dữ liệu chưa thể xác nhận; mức độc lập có thể kiểm chứng là </w:t>
-      </w:r>
-      <w:r>
-        <w:rPr>
-          <w:b/>
-        </w:rPr>
-        <w:t>cấp ảnh và cấp mã phân nhóm hiện có</w:t>
-      </w:r>
-      <w:r>
-        <w:t>. Cấu trúc metadata có thể tiếp nhận PID xác thực khi nguồn dữ liệu cung cấp, nhưng báo cáo không khẳng định đã tích hợp PACS/DICOM hoặc đã xác minh patient-level split từ hệ thống bệnh viện.</w:t>
-      </w:r>
-    </w:p>
-    <w:p>
-      <w:pPr>
-        <w:pStyle w:val="Heading2"/>
-        <w:keepNext/>
-      </w:pPr>
-      <w:r>
-        <w:rPr>
-          <w:b/>
-          <w:sz w:val="25"/>
-        </w:rPr>
-        <w:t>4.3. Kết quả kiểm thử phần mềm</w:t>
-      </w:r>
-    </w:p>
-    <w:p>
-      <w:pPr>
-        <w:keepNext/>
-        <w:jc w:val="center"/>
-      </w:pPr>
-      <w:r>
-        <w:rPr>
-          <w:b/>
-        </w:rPr>
-        <w:t>Bảng 6. Bằng chứng kiểm tra kỹ thuật Mốc 2</w:t>
-      </w:r>
-    </w:p>
-    <w:tbl>
-      <w:tblPr>
-        <w:tblStyle w:val="TableGrid"/>
-        <w:tblW w:type="auto" w:w="0"/>
-        <w:jc w:val="center"/>
-        <w:tblLayout w:type="autofit"/>
-        <w:tblLook w:firstColumn="1" w:firstRow="1" w:lastColumn="0" w:lastRow="0" w:noHBand="0" w:noVBand="1" w:val="04A0"/>
-      </w:tblPr>
-      <w:tblGrid>
-        <w:gridCol w:w="3024"/>
-        <w:gridCol w:w="3024"/>
-        <w:gridCol w:w="3024"/>
-      </w:tblGrid>
-      <w:tr>
-        <w:tc>
-          <w:tcPr>
-            <w:tcW w:type="dxa" w:w="3024"/>
-            <w:tcBorders>
-              <w:top w:val="single" w:sz="5" w:color="B7C0C8"/>
-              <w:left w:val="single" w:sz="5" w:color="B7C0C8"/>
-              <w:bottom w:val="single" w:sz="5" w:color="B7C0C8"/>
-              <w:right w:val="single" w:sz="5" w:color="B7C0C8"/>
-            </w:tcBorders>
-            <w:shd w:fill="E9EDF1"/>
-          </w:tcPr>
-          <w:p>
-            <w:pPr>
-              <w:keepNext/>
-              <w:jc w:val="center"/>
-            </w:pPr>
-            <w:r>
-              <w:rPr>
-                <w:rFonts w:ascii="Times New Roman" w:hAnsi="Times New Roman"/>
-                <w:b/>
-                <w:sz w:val="19"/>
-              </w:rPr>
-              <w:t>Hoạt động</w:t>
-            </w:r>
-          </w:p>
-        </w:tc>
-        <w:tc>
-          <w:tcPr>
-            <w:tcW w:type="dxa" w:w="3024"/>
-            <w:tcBorders>
-              <w:top w:val="single" w:sz="5" w:color="B7C0C8"/>
-              <w:left w:val="single" w:sz="5" w:color="B7C0C8"/>
-              <w:bottom w:val="single" w:sz="5" w:color="B7C0C8"/>
-              <w:right w:val="single" w:sz="5" w:color="B7C0C8"/>
-            </w:tcBorders>
-            <w:shd w:fill="E9EDF1"/>
-          </w:tcPr>
-          <w:p>
-            <w:pPr>
-              <w:keepNext/>
-              <w:jc w:val="center"/>
-            </w:pPr>
-            <w:r>
-              <w:rPr>
-                <w:rFonts w:ascii="Times New Roman" w:hAnsi="Times New Roman"/>
-                <w:b/>
-                <w:sz w:val="19"/>
-              </w:rPr>
-              <w:t>Kết quả</w:t>
-            </w:r>
-          </w:p>
-        </w:tc>
-        <w:tc>
-          <w:tcPr>
-            <w:tcW w:type="dxa" w:w="3024"/>
-            <w:tcBorders>
-              <w:top w:val="single" w:sz="5" w:color="B7C0C8"/>
-              <w:left w:val="single" w:sz="5" w:color="B7C0C8"/>
-              <w:bottom w:val="single" w:sz="5" w:color="B7C0C8"/>
-              <w:right w:val="single" w:sz="5" w:color="B7C0C8"/>
-            </w:tcBorders>
-            <w:shd w:fill="E9EDF1"/>
-          </w:tcPr>
-          <w:p>
-            <w:pPr>
-              <w:keepNext/>
-              <w:jc w:val="center"/>
-            </w:pPr>
-            <w:r>
-              <w:rPr>
-                <w:rFonts w:ascii="Times New Roman" w:hAnsi="Times New Roman"/>
-                <w:b/>
-                <w:sz w:val="19"/>
-              </w:rPr>
-              <w:t>Giới hạn kết luận</w:t>
-            </w:r>
-          </w:p>
-        </w:tc>
-      </w:tr>
-      <w:tr>
-        <w:tc>
-          <w:tcPr>
-            <w:tcW w:type="dxa" w:w="3024"/>
-            <w:tcBorders>
-              <w:top w:val="single" w:sz="5" w:color="B7C0C8"/>
-              <w:left w:val="single" w:sz="5" w:color="B7C0C8"/>
-              <w:bottom w:val="single" w:sz="5" w:color="B7C0C8"/>
-              <w:right w:val="single" w:sz="5" w:color="B7C0C8"/>
-            </w:tcBorders>
-          </w:tcPr>
-          <w:p>
-            <w:r>
-              <w:rPr>
-                <w:rFonts w:ascii="Times New Roman" w:hAnsi="Times New Roman"/>
-                <w:sz w:val="19"/>
-              </w:rPr>
-              <w:t>Automated tests</w:t>
-            </w:r>
-          </w:p>
-        </w:tc>
-        <w:tc>
-          <w:tcPr>
-            <w:tcW w:type="dxa" w:w="3024"/>
-            <w:tcBorders>
-              <w:top w:val="single" w:sz="5" w:color="B7C0C8"/>
-              <w:left w:val="single" w:sz="5" w:color="B7C0C8"/>
-              <w:bottom w:val="single" w:sz="5" w:color="B7C0C8"/>
-              <w:right w:val="single" w:sz="5" w:color="B7C0C8"/>
-            </w:tcBorders>
-          </w:tcPr>
-          <w:p>
-            <w:hyperlink r:id="rId33">
-              <w:r>
-                <w:rPr>
-                  <w:color w:val="17518A"/>
-                </w:rPr>
-                <w:t>Log pytest</w:t>
-              </w:r>
-            </w:hyperlink>
-            <w:r>
-              <w:rPr>
-                <w:rFonts w:ascii="Times New Roman" w:hAnsi="Times New Roman"/>
-                <w:sz w:val="19"/>
-              </w:rPr>
-              <w:t xml:space="preserve">: </w:t>
-            </w:r>
-            <w:r>
-              <w:rPr>
-                <w:rFonts w:ascii="Times New Roman" w:hAnsi="Times New Roman"/>
-                <w:b/>
-                <w:sz w:val="19"/>
-              </w:rPr>
-              <w:t>61/61 passed, 0 failed</w:t>
-            </w:r>
-            <w:r>
-              <w:rPr>
-                <w:rFonts w:ascii="Times New Roman" w:hAnsi="Times New Roman"/>
-                <w:sz w:val="19"/>
-              </w:rPr>
-              <w:t>.</w:t>
-            </w:r>
-          </w:p>
-        </w:tc>
-        <w:tc>
-          <w:tcPr>
-            <w:tcW w:type="dxa" w:w="3024"/>
-            <w:tcBorders>
-              <w:top w:val="single" w:sz="5" w:color="B7C0C8"/>
-              <w:left w:val="single" w:sz="5" w:color="B7C0C8"/>
-              <w:bottom w:val="single" w:sz="5" w:color="B7C0C8"/>
-              <w:right w:val="single" w:sz="5" w:color="B7C0C8"/>
-            </w:tcBorders>
-          </w:tcPr>
-          <w:p>
-            <w:r>
-              <w:rPr>
-                <w:rFonts w:ascii="Times New Roman" w:hAnsi="Times New Roman"/>
-                <w:sz w:val="19"/>
-              </w:rPr>
-              <w:t>Bảo đảm các ca kiểm thử hiện có đạt; không thay thế thẩm định lâm sàng.</w:t>
-            </w:r>
-          </w:p>
-        </w:tc>
-      </w:tr>
-      <w:tr>
-        <w:tc>
-          <w:tcPr>
-            <w:tcW w:type="dxa" w:w="3024"/>
-            <w:tcBorders>
-              <w:top w:val="single" w:sz="5" w:color="B7C0C8"/>
-              <w:left w:val="single" w:sz="5" w:color="B7C0C8"/>
-              <w:bottom w:val="single" w:sz="5" w:color="B7C0C8"/>
-              <w:right w:val="single" w:sz="5" w:color="B7C0C8"/>
-            </w:tcBorders>
-            <w:shd w:fill="F7F9FA"/>
-          </w:tcPr>
-          <w:p>
-            <w:r>
-              <w:rPr>
-                <w:rFonts w:ascii="Times New Roman" w:hAnsi="Times New Roman"/>
-                <w:sz w:val="19"/>
-              </w:rPr>
-              <w:t>Kiểm tra dữ liệu</w:t>
-            </w:r>
-          </w:p>
-        </w:tc>
-        <w:tc>
-          <w:tcPr>
-            <w:tcW w:type="dxa" w:w="3024"/>
-            <w:tcBorders>
-              <w:top w:val="single" w:sz="5" w:color="B7C0C8"/>
-              <w:left w:val="single" w:sz="5" w:color="B7C0C8"/>
-              <w:bottom w:val="single" w:sz="5" w:color="B7C0C8"/>
-              <w:right w:val="single" w:sz="5" w:color="B7C0C8"/>
-            </w:tcBorders>
-            <w:shd w:fill="F7F9FA"/>
-          </w:tcPr>
-          <w:p>
-            <w:hyperlink r:id="rId12">
-              <w:r>
-                <w:rPr>
-                  <w:color w:val="17518A"/>
-                </w:rPr>
-                <w:t>Audit</w:t>
-              </w:r>
-            </w:hyperlink>
-            <w:r>
-              <w:rPr>
-                <w:rFonts w:ascii="Times New Roman" w:hAnsi="Times New Roman"/>
-                <w:sz w:val="19"/>
-              </w:rPr>
-              <w:t xml:space="preserve">: 307/307 cặp đọc được. </w:t>
-            </w:r>
-            <w:hyperlink r:id="rId32">
-              <w:r>
-                <w:rPr>
-                  <w:color w:val="17518A"/>
-                </w:rPr>
-                <w:t>Provenance</w:t>
-              </w:r>
-            </w:hyperlink>
-            <w:r>
-              <w:rPr>
-                <w:rFonts w:ascii="Times New Roman" w:hAnsi="Times New Roman"/>
-                <w:sz w:val="19"/>
-              </w:rPr>
-              <w:t xml:space="preserve"> lưu SHA-256 riêng cho </w:t>
-            </w:r>
-            <w:r>
-              <w:rPr>
-                <w:rFonts w:ascii="Times New Roman" w:hAnsi="Times New Roman"/>
-                <w:b/>
-                <w:sz w:val="19"/>
-              </w:rPr>
-              <w:t>từng mask trong 35 mask dẫn xuất</w:t>
-            </w:r>
-            <w:r>
-              <w:rPr>
-                <w:rFonts w:ascii="Times New Roman" w:hAnsi="Times New Roman"/>
-                <w:sz w:val="19"/>
-              </w:rPr>
-              <w:t>; không ghi SHA cho toàn bộ 307 cặp.</w:t>
-            </w:r>
-          </w:p>
-        </w:tc>
-        <w:tc>
-          <w:tcPr>
-            <w:tcW w:type="dxa" w:w="3024"/>
-            <w:tcBorders>
-              <w:top w:val="single" w:sz="5" w:color="B7C0C8"/>
-              <w:left w:val="single" w:sz="5" w:color="B7C0C8"/>
-              <w:bottom w:val="single" w:sz="5" w:color="B7C0C8"/>
-              <w:right w:val="single" w:sz="5" w:color="B7C0C8"/>
-            </w:tcBorders>
-            <w:shd w:fill="F7F9FA"/>
-          </w:tcPr>
-          <w:p>
-            <w:r>
-              <w:rPr>
-                <w:rFonts w:ascii="Times New Roman" w:hAnsi="Times New Roman"/>
-                <w:sz w:val="19"/>
-              </w:rPr>
-              <w:t>Kiểm tra file và schema, không xác nhận 35 ca âm tính.</w:t>
-            </w:r>
-          </w:p>
-        </w:tc>
-      </w:tr>
-      <w:tr>
-        <w:tc>
-          <w:tcPr>
-            <w:tcW w:type="dxa" w:w="3024"/>
-            <w:tcBorders>
-              <w:top w:val="single" w:sz="5" w:color="B7C0C8"/>
-              <w:left w:val="single" w:sz="5" w:color="B7C0C8"/>
-              <w:bottom w:val="single" w:sz="5" w:color="B7C0C8"/>
-              <w:right w:val="single" w:sz="5" w:color="B7C0C8"/>
-            </w:tcBorders>
-          </w:tcPr>
-          <w:p>
-            <w:r>
-              <w:rPr>
-                <w:rFonts w:ascii="Times New Roman" w:hAnsi="Times New Roman"/>
-                <w:sz w:val="19"/>
-              </w:rPr>
-              <w:t>Nạp mô hình và suy diễn</w:t>
-            </w:r>
-          </w:p>
-        </w:tc>
-        <w:tc>
-          <w:tcPr>
-            <w:tcW w:type="dxa" w:w="3024"/>
-            <w:tcBorders>
-              <w:top w:val="single" w:sz="5" w:color="B7C0C8"/>
-              <w:left w:val="single" w:sz="5" w:color="B7C0C8"/>
-              <w:bottom w:val="single" w:sz="5" w:color="B7C0C8"/>
-              <w:right w:val="single" w:sz="5" w:color="B7C0C8"/>
-            </w:tcBorders>
-          </w:tcPr>
-          <w:p>
-            <w:hyperlink r:id="rId15">
-              <w:r>
-                <w:rPr>
-                  <w:color w:val="17518A"/>
-                </w:rPr>
-                <w:t>Sanity check</w:t>
-              </w:r>
-            </w:hyperlink>
-            <w:r>
-              <w:rPr>
-                <w:rFonts w:ascii="Times New Roman" w:hAnsi="Times New Roman"/>
-                <w:sz w:val="19"/>
-              </w:rPr>
-              <w:t>: 46/46 ảnh Validation, strict load, 0 key không khớp.</w:t>
-            </w:r>
-          </w:p>
-        </w:tc>
-        <w:tc>
-          <w:tcPr>
-            <w:tcW w:type="dxa" w:w="3024"/>
-            <w:tcBorders>
-              <w:top w:val="single" w:sz="5" w:color="B7C0C8"/>
-              <w:left w:val="single" w:sz="5" w:color="B7C0C8"/>
-              <w:bottom w:val="single" w:sz="5" w:color="B7C0C8"/>
-              <w:right w:val="single" w:sz="5" w:color="B7C0C8"/>
-            </w:tcBorders>
-          </w:tcPr>
-          <w:p>
-            <w:r>
-              <w:rPr>
-                <w:rFonts w:ascii="Times New Roman" w:hAnsi="Times New Roman"/>
-                <w:sz w:val="19"/>
-              </w:rPr>
-              <w:t xml:space="preserve">Không tính Segmentation Metrics mới hoặc đánh giá Test mới </w:t>
-            </w:r>
-            <w:r>
-              <w:rPr>
-                <w:rFonts w:ascii="Times New Roman" w:hAnsi="Times New Roman"/>
-                <w:b/>
-                <w:sz w:val="19"/>
-              </w:rPr>
-              <w:t>trên bộ 307 ảnh Mốc 1</w:t>
-            </w:r>
-            <w:r>
-              <w:rPr>
-                <w:rFonts w:ascii="Times New Roman" w:hAnsi="Times New Roman"/>
-                <w:sz w:val="19"/>
-              </w:rPr>
-              <w:t>.</w:t>
-            </w:r>
-          </w:p>
-        </w:tc>
-      </w:tr>
-      <w:tr>
-        <w:tc>
-          <w:tcPr>
-            <w:tcW w:type="dxa" w:w="3024"/>
-            <w:tcBorders>
-              <w:top w:val="single" w:sz="5" w:color="B7C0C8"/>
-              <w:left w:val="single" w:sz="5" w:color="B7C0C8"/>
-              <w:bottom w:val="single" w:sz="5" w:color="B7C0C8"/>
-              <w:right w:val="single" w:sz="5" w:color="B7C0C8"/>
-            </w:tcBorders>
-            <w:shd w:fill="F7F9FA"/>
-          </w:tcPr>
-          <w:p>
-            <w:r>
-              <w:rPr>
-                <w:rFonts w:ascii="Times New Roman" w:hAnsi="Times New Roman"/>
-                <w:sz w:val="19"/>
-              </w:rPr>
-              <w:t>Giao diện người dùng</w:t>
-            </w:r>
-          </w:p>
-        </w:tc>
-        <w:tc>
-          <w:tcPr>
-            <w:tcW w:type="dxa" w:w="3024"/>
-            <w:tcBorders>
-              <w:top w:val="single" w:sz="5" w:color="B7C0C8"/>
-              <w:left w:val="single" w:sz="5" w:color="B7C0C8"/>
-              <w:bottom w:val="single" w:sz="5" w:color="B7C0C8"/>
-              <w:right w:val="single" w:sz="5" w:color="B7C0C8"/>
-            </w:tcBorders>
-            <w:shd w:fill="F7F9FA"/>
-          </w:tcPr>
-          <w:p>
-            <w:hyperlink r:id="rId31">
-              <w:r>
-                <w:rPr>
-                  <w:color w:val="17518A"/>
-                </w:rPr>
-                <w:t>Browser smoke</w:t>
-              </w:r>
-            </w:hyperlink>
-            <w:r>
-              <w:rPr>
-                <w:rFonts w:ascii="Times New Roman" w:hAnsi="Times New Roman"/>
-                <w:sz w:val="19"/>
-              </w:rPr>
-              <w:t>: PASS kịch bản năm bước, 0 lỗi console ngoài dự kiến.</w:t>
-            </w:r>
-          </w:p>
-        </w:tc>
-        <w:tc>
-          <w:tcPr>
-            <w:tcW w:type="dxa" w:w="3024"/>
-            <w:tcBorders>
-              <w:top w:val="single" w:sz="5" w:color="B7C0C8"/>
-              <w:left w:val="single" w:sz="5" w:color="B7C0C8"/>
-              <w:bottom w:val="single" w:sz="5" w:color="B7C0C8"/>
-              <w:right w:val="single" w:sz="5" w:color="B7C0C8"/>
-            </w:tcBorders>
-            <w:shd w:fill="F7F9FA"/>
-          </w:tcPr>
-          <w:p>
-            <w:r>
-              <w:rPr>
-                <w:rFonts w:ascii="Times New Roman" w:hAnsi="Times New Roman"/>
-                <w:sz w:val="19"/>
-              </w:rPr>
-              <w:t>Một kịch bản trên một ảnh Validation, chưa phải khảo sát người dùng.</w:t>
-            </w:r>
-          </w:p>
-        </w:tc>
-      </w:tr>
-    </w:tbl>
-    <w:p>
-      <w:pPr>
-        <w:pStyle w:val="Heading1"/>
-        <w:keepNext/>
-      </w:pPr>
-      <w:r>
-        <w:rPr>
-          <w:b/>
-          <w:sz w:val="28"/>
-        </w:rPr>
-        <w:t>V. KẾ HOẠCH MỐC 3 (06/10/2026 – 18/10/2026)</w:t>
-      </w:r>
-    </w:p>
-    <w:p>
-      <w:pPr>
-        <w:pStyle w:val="Heading2"/>
-        <w:keepNext/>
-      </w:pPr>
-      <w:r>
-        <w:rPr>
-          <w:b/>
-          <w:sz w:val="25"/>
-        </w:rPr>
-        <w:t>5.1. Giao thức đánh giá và phân tích lỗi</w:t>
-      </w:r>
-    </w:p>
-    <w:p>
-      <w:pPr>
-        <w:jc w:val="both"/>
-      </w:pPr>
-      <w:r>
-        <w:t xml:space="preserve">Trước khi tính metric mới, cần xác định nguồn Ground Truth hợp lệ, loại các mask dẫn xuất khỏi phép đánh giá y tế và ghi rõ phiên bản checkpoint, ngưỡng, mã split cùng lịch sử sử dụng dữ liệu. Với 46 ảnh Test Mốc 1 đã có kết quả baseline, việc đánh giá tiếp là </w:t>
-      </w:r>
-      <w:r>
-        <w:rPr>
-          <w:b/>
-        </w:rPr>
-        <w:t>phân tích bổ sung</w:t>
-      </w:r>
-      <w:r>
-        <w:t>. Một phép thử độc lập mới ở cấp bệnh nhân đòi hỏi ảnh chưa từng dùng và PID nguồn được xác thực. Công việc phân tích lỗi sẽ đối chiếu ca có Dice cao với các ca False Positive/False Negative lớn trên những cặp nhãn hợp lệ, kèm ảnh gốc, mask tham chiếu và mask dự đoán; không suy luận tên bệnh học từ hình dạng vùng phân đoạn.</w:t>
-      </w:r>
-    </w:p>
-    <w:p>
-      <w:pPr>
-        <w:pStyle w:val="Heading2"/>
-        <w:keepNext/>
-      </w:pPr>
-      <w:r>
-        <w:rPr>
-          <w:b/>
-          <w:sz w:val="25"/>
-        </w:rPr>
-        <w:t>5.2. Đánh giá quy trình Human-in-the-Loop</w:t>
-      </w:r>
-    </w:p>
-    <w:p>
-      <w:pPr>
-        <w:jc w:val="both"/>
-      </w:pPr>
-      <w:r>
-        <w:t>Tiếp tục kiểm thử thao tác Brush/Eraser trên nhiều ảnh, ghi thời gian hoàn thành một lượt review, số lần chỉnh sửa và khả năng lưu/mở lại mask. Nếu tiếp cận được bác sĩ hoặc chuyên viên chẩn đoán hình ảnh, thu thập nhận xét về mức độ chấp nhận vùng phân đoạn và tính hữu dụng của viewer theo một kịch bản thống nhất. Mọi kết luận về hiệu quả hỗ trợ lâm sàng chỉ được đưa ra sau khi có dữ liệu đánh giá chuyên môn phù hợp.</w:t>
-      </w:r>
-    </w:p>
-    <w:p>
-      <w:pPr>
-        <w:jc w:val="both"/>
-      </w:pPr>
-      <w:r>
-        <w:t>Mốc 2 đã hoàn thiện luồng phần mềm năm bước, nạp được checkpoint U-Net tích hợp và vận hành Human-in-the-Loop trên ảnh Validation Mốc 1. Các giới hạn về PID nguồn, nhãn âm tính và lịch sử truy cập Test đã được ghi rõ để làm điều kiện đầu vào cho Mốc 3.</w:t>
+        <w:t>Kính báo cáo Thầy.</w:t>
       </w:r>
     </w:p>
     <w:p>
@@ -3888,7 +909,7 @@
         <w:rPr>
           <w:b/>
         </w:rPr>
-        <w:t>Kính báo cáo Thầy.</w:t>
+        <w:t>Nguyễn Hữu Dũng</w:t>
       </w:r>
     </w:p>
     <w:p>
@@ -3896,39 +917,17 @@
         <w:jc w:val="both"/>
       </w:pPr>
       <w:r>
-        <w:t>Nguyễn Hữu Dũng</w:t>
-        <w:br/>
-        <w:t>Mã sinh viên: 11235559</w:t>
+        <w:t>MSV: 11235559</w:t>
       </w:r>
     </w:p>
     <w:sectPr>
-      <w:footerReference w:type="default" r:id="rId9"/>
-      <w:pgSz w:w="11906" w:h="16838"/>
+      <w:pgSz w:w="12240" w:h="15840"/>
       <w:pgMar w:top="1134" w:right="1134" w:bottom="1134" w:left="1701" w:header="720" w:footer="720" w:gutter="0"/>
       <w:cols w:space="720"/>
       <w:docGrid w:linePitch="360"/>
     </w:sectPr>
   </w:body>
 </w:document>
-</file>
-
-<file path=word/footer1.xml><?xml version="1.0" encoding="utf-8"?>
-<w:ftr xmlns:m="http://schemas.openxmlformats.org/officeDocument/2006/math" xmlns:mc="http://schemas.openxmlformats.org/markup-compatibility/2006" xmlns:mo="http://schemas.microsoft.com/office/mac/office/2008/main" xmlns:mv="urn:schemas-microsoft-com:mac:vml" xmlns:o="urn:schemas-microsoft-com:office:office" xmlns:r="http://schemas.openxmlformats.org/officeDocument/2006/relationships" xmlns:v="urn:schemas-microsoft-com:vml" xmlns:w10="urn:schemas-microsoft-com:office:word" xmlns:w14="http://schemas.microsoft.com/office/word/2010/wordml" xmlns:w="http://schemas.openxmlformats.org/wordprocessingml/2006/main" xmlns:wne="http://schemas.microsoft.com/office/word/2006/wordml" xmlns:wp14="http://schemas.microsoft.com/office/word/2010/wordprocessingDrawing" xmlns:wp="http://schemas.openxmlformats.org/drawingml/2006/wordprocessingDrawing" xmlns:wpc="http://schemas.microsoft.com/office/word/2010/wordprocessingCanvas" xmlns:wpg="http://schemas.microsoft.com/office/word/2010/wordprocessingGroup" xmlns:wpi="http://schemas.microsoft.com/office/word/2010/wordprocessingInk" xmlns:wps="http://schemas.microsoft.com/office/word/2010/wordprocessingShape" mc:Ignorable="w14 wp14">
-  <w:p>
-    <w:pPr>
-      <w:pStyle w:val="Footer"/>
-      <w:jc w:val="center"/>
-    </w:pPr>
-    <w:r>
-      <w:rPr>
-        <w:rFonts w:ascii="Times New Roman" w:hAnsi="Times New Roman"/>
-        <w:sz w:val="20"/>
-      </w:rPr>
-      <w:t xml:space="preserve">Trang </w:t>
-    </w:r>
-    <w:fldSimple w:instr="PAGE"/>
-  </w:p>
-</w:ftr>
 </file>
 
 <file path=word/numbering.xml><?xml version="1.0" encoding="utf-8"?>
@@ -4295,10 +1294,11 @@
     <w:qFormat/>
     <w:rsid w:val="00FC693F"/>
     <w:pPr>
-      <w:spacing w:after="100" w:line="324" w:lineRule="auto"/>
+      <w:spacing w:line="312" w:lineRule="auto" w:after="100"/>
     </w:pPr>
     <w:rPr>
-      <w:rFonts w:ascii="Times New Roman" w:hAnsi="Times New Roman"/>
+      <w:rFonts w:ascii="Times New Roman" w:hAnsi="Times New Roman" w:eastAsia="Times New Roman"/>
+      <w:color w:val="142A38"/>
       <w:sz w:val="24"/>
     </w:rPr>
   </w:style>
@@ -4357,14 +1357,14 @@
     <w:pPr>
       <w:keepNext/>
       <w:keepLines/>
-      <w:spacing w:before="240" w:after="120"/>
+      <w:spacing w:before="480" w:after="0"/>
       <w:outlineLvl w:val="0"/>
     </w:pPr>
     <w:rPr>
-      <w:rFonts w:asciiTheme="majorHAnsi" w:eastAsiaTheme="majorEastAsia" w:hAnsiTheme="majorHAnsi" w:cstheme="majorBidi" w:ascii="Times New Roman" w:hAnsi="Times New Roman"/>
+      <w:rFonts w:asciiTheme="majorHAnsi" w:eastAsiaTheme="majorEastAsia" w:hAnsiTheme="majorHAnsi" w:cstheme="majorBidi" w:ascii="Times New Roman" w:hAnsi="Times New Roman" w:eastAsia="Times New Roman"/>
       <w:b/>
       <w:bCs/>
-      <w:color w:val="365F91" w:themeColor="accent1" w:themeShade="BF"/>
+      <w:color w:val="142A38"/>
       <w:sz w:val="28"/>
       <w:szCs w:val="28"/>
     </w:rPr>
@@ -4381,15 +1381,15 @@
     <w:pPr>
       <w:keepNext/>
       <w:keepLines/>
-      <w:spacing w:before="240" w:after="120"/>
+      <w:spacing w:before="200" w:after="0"/>
       <w:outlineLvl w:val="1"/>
     </w:pPr>
     <w:rPr>
-      <w:rFonts w:asciiTheme="majorHAnsi" w:eastAsiaTheme="majorEastAsia" w:hAnsiTheme="majorHAnsi" w:cstheme="majorBidi" w:ascii="Times New Roman" w:hAnsi="Times New Roman"/>
+      <w:rFonts w:asciiTheme="majorHAnsi" w:eastAsiaTheme="majorEastAsia" w:hAnsiTheme="majorHAnsi" w:cstheme="majorBidi" w:ascii="Times New Roman" w:hAnsi="Times New Roman" w:eastAsia="Times New Roman"/>
       <w:b/>
       <w:bCs/>
-      <w:color w:val="4F81BD" w:themeColor="accent1"/>
-      <w:sz w:val="25"/>
+      <w:color w:val="142A38"/>
+      <w:sz w:val="26"/>
       <w:szCs w:val="26"/>
     </w:rPr>
   </w:style>
@@ -4650,11 +1650,12 @@
       <w:contextualSpacing/>
     </w:pPr>
     <w:rPr>
-      <w:rFonts w:asciiTheme="majorHAnsi" w:eastAsiaTheme="majorEastAsia" w:hAnsiTheme="majorHAnsi" w:cstheme="majorBidi"/>
-      <w:color w:val="17365D" w:themeColor="text2" w:themeShade="BF"/>
+      <w:rFonts w:asciiTheme="majorHAnsi" w:eastAsiaTheme="majorEastAsia" w:hAnsiTheme="majorHAnsi" w:cstheme="majorBidi" w:ascii="Times New Roman" w:hAnsi="Times New Roman" w:eastAsia="Times New Roman"/>
+      <w:b/>
+      <w:color w:val="142A38"/>
       <w:spacing w:val="5"/>
       <w:kern w:val="28"/>
-      <w:sz w:val="52"/>
+      <w:sz w:val="32"/>
       <w:szCs w:val="52"/>
     </w:rPr>
   </w:style>

</xml_diff>

<commit_message>
docs(milestone-2): ground milestone 2 report strictly on milestone 1 data and verified prototype metrics
</commit_message>
<xml_diff>
--- a/docs/reports/BaoCaoTienDoMoc2_NguyenHuuDung_11235559_final.docx
+++ b/docs/reports/BaoCaoTienDoMoc2_NguyenHuuDung_11235559_final.docx
@@ -4,10 +4,15 @@
   <w:body>
     <w:p>
       <w:pPr>
-        <w:pStyle w:val="Title"/>
+        <w:keepNext/>
+        <w:spacing w:before="160"/>
         <w:jc w:val="center"/>
       </w:pPr>
       <w:r>
+        <w:rPr>
+          <w:b/>
+          <w:sz w:val="32"/>
+        </w:rPr>
         <w:t>BÁO CÁO TIẾN ĐỘ KHÓA LUẬN TỐT NGHIỆP — MỐC 2</w:t>
       </w:r>
     </w:p>
@@ -23,12 +28,8 @@
       </w:r>
       <w:r>
         <w:t xml:space="preserve"> 21/09/2026 – 05/10/2026</w:t>
+        <w:br/>
       </w:r>
-    </w:p>
-    <w:p>
-      <w:pPr>
-        <w:jc w:val="both"/>
-      </w:pPr>
       <w:r>
         <w:rPr>
           <w:b/>
@@ -37,12 +38,8 @@
       </w:r>
       <w:r>
         <w:t xml:space="preserve"> Xây dựng hệ thống hỗ trợ phân đoạn tổn thương trên ảnh siêu âm buồng trứng ứng dụng Deep Learning theo mô hình Human-in-the-Loop</w:t>
+        <w:br/>
       </w:r>
-    </w:p>
-    <w:p>
-      <w:pPr>
-        <w:jc w:val="both"/>
-      </w:pPr>
       <w:r>
         <w:rPr>
           <w:b/>
@@ -60,12 +57,8 @@
       </w:r>
       <w:r>
         <w:t xml:space="preserve"> 11235559</w:t>
+        <w:br/>
       </w:r>
-    </w:p>
-    <w:p>
-      <w:pPr>
-        <w:jc w:val="both"/>
-      </w:pPr>
       <w:r>
         <w:rPr>
           <w:b/>
@@ -89,56 +82,56 @@
         <w:jc w:val="both"/>
       </w:pPr>
       <w:r>
-        <w:t>Em xin báo cáo ngắn tiến độ Mốc 2. Trọng tâm giai đoạn này là khóa cấu hình U-Net tích hợp, hoàn thiện luồng Web Prototype và chức năng chuyên viên rà soát/chỉnh sửa mask. Bộ dữ liệu Mốc 1 được giữ nguyên làm tham chiếu; Mốc 2 không chia lại bộ 307 ảnh và không thực hiện đánh giá mới trên Test Mốc 1.</w:t>
+        <w:t>Em xin báo cáo ngắn tiến độ Mốc 2. Bộ dữ liệu, cách chia tập, pipeline và kết quả mô hình cơ sở được kế thừa từ Mốc 1; trong Mốc 2 không chia lại dữ liệu, không huấn luyện lại trên bộ 307 ảnh và không thực hiện phép đánh giá mới trên Test Mốc 1.</w:t>
       </w:r>
     </w:p>
     <w:p>
       <w:pPr>
-        <w:pStyle w:val="Heading2"/>
+        <w:pStyle w:val="Heading1"/>
+        <w:keepNext/>
       </w:pPr>
       <w:r>
+        <w:rPr>
+          <w:b/>
+          <w:sz w:val="28"/>
+        </w:rPr>
         <w:t>1. Công việc hoàn thành</w:t>
       </w:r>
     </w:p>
     <w:tbl>
       <w:tblPr>
+        <w:tblStyle w:val="TableGrid"/>
         <w:tblW w:type="auto" w:w="0"/>
         <w:jc w:val="center"/>
         <w:tblLayout w:type="autofit"/>
         <w:tblLook w:firstColumn="1" w:firstRow="1" w:lastColumn="0" w:lastRow="0" w:noHBand="0" w:noVBand="1" w:val="04A0"/>
-        <w:tblBorders>
-          <w:top w:val="single" w:sz="5" w:color="A6ADB4"/>
-          <w:left w:val="single" w:sz="5" w:color="A6ADB4"/>
-          <w:bottom w:val="single" w:sz="5" w:color="A6ADB4"/>
-          <w:right w:val="single" w:sz="5" w:color="A6ADB4"/>
-          <w:insideH w:val="single" w:sz="5" w:color="A6ADB4"/>
-          <w:insideV w:val="single" w:sz="5" w:color="A6ADB4"/>
-        </w:tblBorders>
       </w:tblPr>
       <w:tblGrid>
-        <w:gridCol w:w="4702"/>
-        <w:gridCol w:w="4702"/>
+        <w:gridCol w:w="4535"/>
+        <w:gridCol w:w="4535"/>
       </w:tblGrid>
       <w:tr>
         <w:tc>
           <w:tcPr>
-            <w:tcW w:type="dxa" w:w="4702"/>
-            <w:vAlign w:val="center"/>
-            <w:shd w:fill="E8EEF2"/>
+            <w:tcW w:type="dxa" w:w="4535"/>
+            <w:tcBorders>
+              <w:top w:val="single" w:sz="5" w:color="B7C0C8"/>
+              <w:left w:val="single" w:sz="5" w:color="B7C0C8"/>
+              <w:bottom w:val="single" w:sz="5" w:color="B7C0C8"/>
+              <w:right w:val="single" w:sz="5" w:color="B7C0C8"/>
+            </w:tcBorders>
+            <w:shd w:fill="E9EDF1"/>
           </w:tcPr>
           <w:p>
             <w:pPr>
-              <w:spacing w:line="264" w:lineRule="auto" w:after="0"/>
+              <w:keepNext/>
               <w:jc w:val="center"/>
             </w:pPr>
             <w:r>
               <w:rPr>
+                <w:rFonts w:ascii="Times New Roman" w:hAnsi="Times New Roman"/>
                 <w:b/>
-              </w:rPr>
-            </w:r>
-            <w:r>
-              <w:rPr>
-                <w:b/>
+                <w:sz w:val="19"/>
               </w:rPr>
               <w:t>Nhiệm vụ</w:t>
             </w:r>
@@ -146,25 +139,27 @@
         </w:tc>
         <w:tc>
           <w:tcPr>
-            <w:tcW w:type="dxa" w:w="4702"/>
-            <w:vAlign w:val="center"/>
-            <w:shd w:fill="E8EEF2"/>
+            <w:tcW w:type="dxa" w:w="4535"/>
+            <w:tcBorders>
+              <w:top w:val="single" w:sz="5" w:color="B7C0C8"/>
+              <w:left w:val="single" w:sz="5" w:color="B7C0C8"/>
+              <w:bottom w:val="single" w:sz="5" w:color="B7C0C8"/>
+              <w:right w:val="single" w:sz="5" w:color="B7C0C8"/>
+            </w:tcBorders>
+            <w:shd w:fill="E9EDF1"/>
           </w:tcPr>
           <w:p>
             <w:pPr>
-              <w:spacing w:line="264" w:lineRule="auto" w:after="0"/>
+              <w:keepNext/>
               <w:jc w:val="center"/>
             </w:pPr>
             <w:r>
               <w:rPr>
+                <w:rFonts w:ascii="Times New Roman" w:hAnsi="Times New Roman"/>
                 <w:b/>
+                <w:sz w:val="19"/>
               </w:rPr>
-            </w:r>
-            <w:r>
-              <w:rPr>
-                <w:b/>
-              </w:rPr>
-              <w:t>Kết quả</w:t>
+              <w:t>Kết quả và minh chứng</w:t>
             </w:r>
           </w:p>
         </w:tc>
@@ -172,53 +167,41 @@
       <w:tr>
         <w:tc>
           <w:tcPr>
-            <w:tcW w:type="dxa" w:w="4702"/>
-            <w:vAlign w:val="center"/>
+            <w:tcW w:type="dxa" w:w="4535"/>
+            <w:tcBorders>
+              <w:top w:val="single" w:sz="5" w:color="B7C0C8"/>
+              <w:left w:val="single" w:sz="5" w:color="B7C0C8"/>
+              <w:bottom w:val="single" w:sz="5" w:color="B7C0C8"/>
+              <w:right w:val="single" w:sz="5" w:color="B7C0C8"/>
+            </w:tcBorders>
           </w:tcPr>
           <w:p>
-            <w:pPr>
-              <w:spacing w:line="264" w:lineRule="auto" w:after="0"/>
-              <w:jc w:val="left"/>
-            </w:pPr>
-            <w:r/>
             <w:r>
-              <w:t>Đánh giá và lựa chọn U-Net</w:t>
+              <w:rPr>
+                <w:rFonts w:ascii="Times New Roman" w:hAnsi="Times New Roman"/>
+                <w:sz w:val="19"/>
+              </w:rPr>
+              <w:t>Đánh giá U-Net cơ sở</w:t>
             </w:r>
           </w:p>
         </w:tc>
         <w:tc>
           <w:tcPr>
-            <w:tcW w:type="dxa" w:w="4702"/>
-            <w:vAlign w:val="center"/>
+            <w:tcW w:type="dxa" w:w="4535"/>
+            <w:tcBorders>
+              <w:top w:val="single" w:sz="5" w:color="B7C0C8"/>
+              <w:left w:val="single" w:sz="5" w:color="B7C0C8"/>
+              <w:bottom w:val="single" w:sz="5" w:color="B7C0C8"/>
+              <w:right w:val="single" w:sz="5" w:color="B7C0C8"/>
+            </w:tcBorders>
           </w:tcPr>
           <w:p>
-            <w:pPr>
-              <w:spacing w:line="264" w:lineRule="auto" w:after="0"/>
-              <w:jc w:val="left"/>
-            </w:pPr>
-            <w:r/>
-            <w:r>
-              <w:t xml:space="preserve">Chọn checkpoint Standard U-Net </w:t>
-            </w:r>
             <w:r>
               <w:rPr>
-                <w:rFonts w:ascii="Consolas" w:hAnsi="Consolas"/>
-                <w:sz w:val="20"/>
+                <w:rFonts w:ascii="Times New Roman" w:hAnsi="Times New Roman"/>
+                <w:sz w:val="19"/>
               </w:rPr>
-              <w:t>5e14be…</w:t>
-            </w:r>
-            <w:r>
-              <w:t xml:space="preserve"> (SHA-256 đầy đủ trong </w:t>
-            </w:r>
-            <w:r>
-              <w:rPr>
-                <w:rFonts w:ascii="Consolas" w:hAnsi="Consolas"/>
-                <w:sz w:val="20"/>
-              </w:rPr>
-              <w:t>evaluation/selected_model.json</w:t>
-            </w:r>
-            <w:r>
-              <w:t>) làm mô hình tích hợp. Checkpoint được chọn theo Validation của split huấn luyện riêng; không tinh chỉnh trên bộ 307 ảnh Mốc 1.</w:t>
+              <w:t>Giữ nguyên Standard U-Net của Mốc 1 và kết quả tham chiếu: Validation Dice 0,5830; Test Foreground Dice 0,5719, IoU 0,4405. Đây là Segmentation Metrics, không phải Diagnostic Accuracy.</w:t>
             </w:r>
           </w:p>
         </w:tc>
@@ -226,33 +209,43 @@
       <w:tr>
         <w:tc>
           <w:tcPr>
-            <w:tcW w:type="dxa" w:w="4702"/>
-            <w:vAlign w:val="center"/>
+            <w:tcW w:type="dxa" w:w="4535"/>
+            <w:tcBorders>
+              <w:top w:val="single" w:sz="5" w:color="B7C0C8"/>
+              <w:left w:val="single" w:sz="5" w:color="B7C0C8"/>
+              <w:bottom w:val="single" w:sz="5" w:color="B7C0C8"/>
+              <w:right w:val="single" w:sz="5" w:color="B7C0C8"/>
+            </w:tcBorders>
+            <w:shd w:fill="F7F9FA"/>
           </w:tcPr>
           <w:p>
-            <w:pPr>
-              <w:spacing w:line="264" w:lineRule="auto" w:after="0"/>
-              <w:jc w:val="left"/>
-            </w:pPr>
-            <w:r/>
             <w:r>
+              <w:rPr>
+                <w:rFonts w:ascii="Times New Roman" w:hAnsi="Times New Roman"/>
+                <w:sz w:val="19"/>
+              </w:rPr>
               <w:t>Khảo sát kiến trúc cải tiến</w:t>
             </w:r>
           </w:p>
         </w:tc>
         <w:tc>
           <w:tcPr>
-            <w:tcW w:type="dxa" w:w="4702"/>
-            <w:vAlign w:val="center"/>
+            <w:tcW w:type="dxa" w:w="4535"/>
+            <w:tcBorders>
+              <w:top w:val="single" w:sz="5" w:color="B7C0C8"/>
+              <w:left w:val="single" w:sz="5" w:color="B7C0C8"/>
+              <w:bottom w:val="single" w:sz="5" w:color="B7C0C8"/>
+              <w:right w:val="single" w:sz="5" w:color="B7C0C8"/>
+            </w:tcBorders>
+            <w:shd w:fill="F7F9FA"/>
           </w:tcPr>
           <w:p>
-            <w:pPr>
-              <w:spacing w:line="264" w:lineRule="auto" w:after="0"/>
-              <w:jc w:val="left"/>
-            </w:pPr>
-            <w:r/>
             <w:r>
-              <w:t>Chưa triển khai kiến trúc thứ hai trong Mốc 2; ưu tiên hoàn thiện và kiểm tra luồng lõi với Standard U-Net. Có thể xem xét ở Mốc 3 nếu dữ liệu và thời gian cho phép.</w:t>
+              <w:rPr>
+                <w:rFonts w:ascii="Times New Roman" w:hAnsi="Times New Roman"/>
+                <w:sz w:val="19"/>
+              </w:rPr>
+              <w:t>Chưa triển khai kiến trúc thứ hai trong Mốc 2; ưu tiên hoàn thiện luồng lõi với mô hình hiện có.</w:t>
             </w:r>
           </w:p>
         </w:tc>
@@ -260,43 +253,55 @@
       <w:tr>
         <w:tc>
           <w:tcPr>
-            <w:tcW w:type="dxa" w:w="4702"/>
-            <w:vAlign w:val="center"/>
+            <w:tcW w:type="dxa" w:w="4535"/>
+            <w:tcBorders>
+              <w:top w:val="single" w:sz="5" w:color="B7C0C8"/>
+              <w:left w:val="single" w:sz="5" w:color="B7C0C8"/>
+              <w:bottom w:val="single" w:sz="5" w:color="B7C0C8"/>
+              <w:right w:val="single" w:sz="5" w:color="B7C0C8"/>
+            </w:tcBorders>
           </w:tcPr>
           <w:p>
-            <w:pPr>
-              <w:spacing w:line="264" w:lineRule="auto" w:after="0"/>
-              <w:jc w:val="left"/>
-            </w:pPr>
-            <w:r/>
             <w:r>
+              <w:rPr>
+                <w:rFonts w:ascii="Times New Roman" w:hAnsi="Times New Roman"/>
+                <w:sz w:val="19"/>
+              </w:rPr>
               <w:t>Web Prototype</w:t>
             </w:r>
           </w:p>
         </w:tc>
         <w:tc>
           <w:tcPr>
-            <w:tcW w:type="dxa" w:w="4702"/>
-            <w:vAlign w:val="center"/>
+            <w:tcW w:type="dxa" w:w="4535"/>
+            <w:tcBorders>
+              <w:top w:val="single" w:sz="5" w:color="B7C0C8"/>
+              <w:left w:val="single" w:sz="5" w:color="B7C0C8"/>
+              <w:bottom w:val="single" w:sz="5" w:color="B7C0C8"/>
+              <w:right w:val="single" w:sz="5" w:color="B7C0C8"/>
+            </w:tcBorders>
           </w:tcPr>
           <w:p>
-            <w:pPr>
-              <w:spacing w:line="264" w:lineRule="auto" w:after="0"/>
-              <w:jc w:val="left"/>
-            </w:pPr>
-            <w:r/>
             <w:r>
+              <w:rPr>
+                <w:rFonts w:ascii="Times New Roman" w:hAnsi="Times New Roman"/>
+                <w:sz w:val="19"/>
+              </w:rPr>
               <w:t xml:space="preserve">Hoàn thiện luồng </w:t>
             </w:r>
             <w:r>
               <w:rPr>
-                <w:rFonts w:ascii="Consolas" w:hAnsi="Consolas"/>
-                <w:sz w:val="20"/>
+                <w:rFonts w:ascii="Times New Roman" w:hAnsi="Times New Roman"/>
+                <w:sz w:val="19"/>
               </w:rPr>
               <w:t>Upload → Segmentation → Original/Mask/Overlay → Review/Edit → Confirm/Save</w:t>
             </w:r>
             <w:r>
-              <w:t>; backend FastAPI/PyTorch, giao diện HTML/Canvas.</w:t>
+              <w:rPr>
+                <w:rFonts w:ascii="Times New Roman" w:hAnsi="Times New Roman"/>
+                <w:sz w:val="19"/>
+              </w:rPr>
+              <w:t xml:space="preserve"> bằng FastAPI/PyTorch và giao diện HTML/Canvas.</w:t>
             </w:r>
           </w:p>
         </w:tc>
@@ -304,33 +309,43 @@
       <w:tr>
         <w:tc>
           <w:tcPr>
-            <w:tcW w:type="dxa" w:w="4702"/>
-            <w:vAlign w:val="center"/>
+            <w:tcW w:type="dxa" w:w="4535"/>
+            <w:tcBorders>
+              <w:top w:val="single" w:sz="5" w:color="B7C0C8"/>
+              <w:left w:val="single" w:sz="5" w:color="B7C0C8"/>
+              <w:bottom w:val="single" w:sz="5" w:color="B7C0C8"/>
+              <w:right w:val="single" w:sz="5" w:color="B7C0C8"/>
+            </w:tcBorders>
+            <w:shd w:fill="F7F9FA"/>
           </w:tcPr>
           <w:p>
-            <w:pPr>
-              <w:spacing w:line="264" w:lineRule="auto" w:after="0"/>
-              <w:jc w:val="left"/>
-            </w:pPr>
-            <w:r/>
             <w:r>
+              <w:rPr>
+                <w:rFonts w:ascii="Times New Roman" w:hAnsi="Times New Roman"/>
+                <w:sz w:val="19"/>
+              </w:rPr>
               <w:t>Human-in-the-Loop</w:t>
             </w:r>
           </w:p>
         </w:tc>
         <w:tc>
           <w:tcPr>
-            <w:tcW w:type="dxa" w:w="4702"/>
-            <w:vAlign w:val="center"/>
+            <w:tcW w:type="dxa" w:w="4535"/>
+            <w:tcBorders>
+              <w:top w:val="single" w:sz="5" w:color="B7C0C8"/>
+              <w:left w:val="single" w:sz="5" w:color="B7C0C8"/>
+              <w:bottom w:val="single" w:sz="5" w:color="B7C0C8"/>
+              <w:right w:val="single" w:sz="5" w:color="B7C0C8"/>
+            </w:tcBorders>
+            <w:shd w:fill="F7F9FA"/>
           </w:tcPr>
           <w:p>
-            <w:pPr>
-              <w:spacing w:line="264" w:lineRule="auto" w:after="0"/>
-              <w:jc w:val="left"/>
-            </w:pPr>
-            <w:r/>
             <w:r>
-              <w:t>Có Brush, Eraser, chỉnh kích thước nét, Undo/Redo và lưu mask sau rà soát. Thao tác Confirm ghi nhận review trong prototype, không tự xác nhận mask thành Ground Truth chuyên môn.</w:t>
+              <w:rPr>
+                <w:rFonts w:ascii="Times New Roman" w:hAnsi="Times New Roman"/>
+                <w:sz w:val="19"/>
+              </w:rPr>
+              <w:t>Có Brush, Eraser, điều chỉnh kích thước nét, Undo/Redo và lưu mask sau rà soát. Confirm ghi nhận thao tác review, không tự biến mask thành Ground Truth được chuyên môn xác nhận.</w:t>
             </w:r>
           </w:p>
         </w:tc>
@@ -338,15 +353,15 @@
     </w:tbl>
     <w:p>
       <w:pPr>
-        <w:spacing w:after="0"/>
-      </w:pPr>
-    </w:p>
-    <w:p>
-      <w:pPr>
-        <w:pStyle w:val="Heading2"/>
+        <w:pStyle w:val="Heading1"/>
+        <w:keepNext/>
       </w:pPr>
       <w:r>
-        <w:t>2. Dataset, pipeline và kết quả</w:t>
+        <w:rPr>
+          <w:b/>
+          <w:sz w:val="28"/>
+        </w:rPr>
+        <w:t>2. Dữ liệu và kết quả mô hình kế thừa từ Mốc 1</w:t>
       </w:r>
     </w:p>
     <w:p>
@@ -354,26 +369,25 @@
         <w:jc w:val="both"/>
       </w:pPr>
       <w:r>
-        <w:t xml:space="preserve">Bộ tham chiếu Mốc 1 gồm </w:t>
+        <w:t xml:space="preserve">Mốc 1 chốt </w:t>
       </w:r>
       <w:r>
         <w:rPr>
           <w:b/>
         </w:rPr>
-        <w:t>307 ảnh: 215 Train / 46 Validation / 46 Test</w:t>
+        <w:t>307 ảnh</w:t>
       </w:r>
       <w:r>
-        <w:t xml:space="preserve"> (</w:t>
+        <w:t xml:space="preserve">, gồm </w:t>
       </w:r>
       <w:r>
         <w:rPr>
-          <w:rFonts w:ascii="Consolas" w:hAnsi="Consolas"/>
-          <w:sz w:val="20"/>
+          <w:b/>
         </w:rPr>
-        <w:t>ai_training/splits/archive_milestone_1/</w:t>
+        <w:t>215 Train / 46 Validation / 46 Test</w:t>
       </w:r>
       <w:r>
-        <w:t>). Mốc 2 không huấn luyện lại trên bộ này; tập Test 46 ảnh tiếp tục được giữ nguyên và không dùng để chọn checkpoint hoặc ngưỡng.</w:t>
+        <w:t>; báo cáo Mốc 1 ghi nhận 185 mã nhóm ẩn danh và split không trùng mã. Kiểm toán dữ liệu hiện có xác nhận mã nguồn bệnh nhân chưa được đối chiếu với định danh gốc của bệnh viện; vì vậy kết quả được hiểu trong phạm vi phân tầng dữ liệu đã lưu, không khẳng định độc lập theo PID bệnh viện.</w:t>
       </w:r>
     </w:p>
     <w:p>
@@ -381,102 +395,71 @@
         <w:jc w:val="both"/>
       </w:pPr>
       <w:r>
-        <w:t xml:space="preserve">Checkpoint tích hợp được huấn luyện 30 epoch trên split riêng </w:t>
-      </w:r>
-      <w:r>
-        <w:rPr>
-          <w:b/>
-        </w:rPr>
-        <w:t>697 Train / 123 Validation / 382 Test</w:t>
-      </w:r>
-      <w:r>
-        <w:t xml:space="preserve">, với Standard U-Net, Combo Loss (0,5 BCE + 0,5 Dice), ảnh grayscale, CLAHE và Letterbox 512×512. Ngưỡng 0,5; checkpoint tốt nhất tại epoch 27. Kết quả theo Validation của lượt huấn luyện này: </w:t>
-      </w:r>
-      <w:r>
-        <w:rPr>
-          <w:b/>
-        </w:rPr>
-        <w:t>Dice 0,8233</w:t>
-      </w:r>
-      <w:r>
-        <w:t xml:space="preserve"> (</w:t>
-      </w:r>
-      <w:r>
-        <w:rPr>
-          <w:rFonts w:ascii="Consolas" w:hAnsi="Consolas"/>
-          <w:sz w:val="20"/>
-        </w:rPr>
-        <w:t>evaluation/selected_model.json</w:t>
-      </w:r>
-      <w:r>
-        <w:t>).</w:t>
+        <w:t>Cấu hình được kế thừa nguyên trạng: Standard U-Net 2D (7.762.465 tham số), đầu vào grayscale 512×512 theo Letterbox, Combo Loss (0,5 BCE + 0,5 Soft Dice), AdamW và Cosine Annealing; huấn luyện 12 epoch, chọn checkpoint theo Validation Dice tốt nhất tại epoch 12. Các kết quả sau đây là số liệu Mốc 1, không phải thực nghiệm mới của Mốc 2.</w:t>
       </w:r>
     </w:p>
     <w:tbl>
       <w:tblPr>
+        <w:tblStyle w:val="TableGrid"/>
         <w:tblW w:type="auto" w:w="0"/>
         <w:jc w:val="center"/>
         <w:tblLayout w:type="autofit"/>
         <w:tblLook w:firstColumn="1" w:firstRow="1" w:lastColumn="0" w:lastRow="0" w:noHBand="0" w:noVBand="1" w:val="04A0"/>
-        <w:tblBorders>
-          <w:top w:val="single" w:sz="5" w:color="A6ADB4"/>
-          <w:left w:val="single" w:sz="5" w:color="A6ADB4"/>
-          <w:bottom w:val="single" w:sz="5" w:color="A6ADB4"/>
-          <w:right w:val="single" w:sz="5" w:color="A6ADB4"/>
-          <w:insideH w:val="single" w:sz="5" w:color="A6ADB4"/>
-          <w:insideV w:val="single" w:sz="5" w:color="A6ADB4"/>
-        </w:tblBorders>
       </w:tblPr>
       <w:tblGrid>
-        <w:gridCol w:w="4702"/>
-        <w:gridCol w:w="4702"/>
+        <w:gridCol w:w="4535"/>
+        <w:gridCol w:w="4535"/>
       </w:tblGrid>
       <w:tr>
         <w:tc>
           <w:tcPr>
-            <w:tcW w:type="dxa" w:w="4702"/>
-            <w:vAlign w:val="center"/>
-            <w:shd w:fill="E8EEF2"/>
+            <w:tcW w:type="dxa" w:w="4535"/>
+            <w:tcBorders>
+              <w:top w:val="single" w:sz="5" w:color="B7C0C8"/>
+              <w:left w:val="single" w:sz="5" w:color="B7C0C8"/>
+              <w:bottom w:val="single" w:sz="5" w:color="B7C0C8"/>
+              <w:right w:val="single" w:sz="5" w:color="B7C0C8"/>
+            </w:tcBorders>
+            <w:shd w:fill="E9EDF1"/>
           </w:tcPr>
           <w:p>
             <w:pPr>
-              <w:spacing w:line="264" w:lineRule="auto" w:after="0"/>
+              <w:keepNext/>
               <w:jc w:val="center"/>
             </w:pPr>
             <w:r>
               <w:rPr>
+                <w:rFonts w:ascii="Times New Roman" w:hAnsi="Times New Roman"/>
                 <w:b/>
+                <w:sz w:val="19"/>
               </w:rPr>
-            </w:r>
-            <w:r>
-              <w:rPr>
-                <w:b/>
-              </w:rPr>
-              <w:t>Phép đo trên Test 382 ảnh của split riêng</w:t>
+              <w:t>Tập / chỉ số</w:t>
             </w:r>
           </w:p>
         </w:tc>
         <w:tc>
           <w:tcPr>
-            <w:tcW w:type="dxa" w:w="4702"/>
-            <w:vAlign w:val="center"/>
-            <w:shd w:fill="E8EEF2"/>
+            <w:tcW w:type="dxa" w:w="4535"/>
+            <w:tcBorders>
+              <w:top w:val="single" w:sz="5" w:color="B7C0C8"/>
+              <w:left w:val="single" w:sz="5" w:color="B7C0C8"/>
+              <w:bottom w:val="single" w:sz="5" w:color="B7C0C8"/>
+              <w:right w:val="single" w:sz="5" w:color="B7C0C8"/>
+            </w:tcBorders>
+            <w:shd w:fill="E9EDF1"/>
           </w:tcPr>
           <w:p>
             <w:pPr>
-              <w:spacing w:line="264" w:lineRule="auto" w:after="0"/>
+              <w:keepNext/>
               <w:jc w:val="center"/>
             </w:pPr>
             <w:r>
               <w:rPr>
+                <w:rFonts w:ascii="Times New Roman" w:hAnsi="Times New Roman"/>
                 <w:b/>
+                <w:sz w:val="19"/>
               </w:rPr>
-            </w:r>
-            <w:r>
-              <w:rPr>
-                <w:b/>
-              </w:rPr>
-              <w:t>Kết quả</w:t>
+              <w:t>Kết quả Mốc 1</w:t>
             </w:r>
           </w:p>
         </w:tc>
@@ -484,33 +467,41 @@
       <w:tr>
         <w:tc>
           <w:tcPr>
-            <w:tcW w:type="dxa" w:w="4702"/>
-            <w:vAlign w:val="center"/>
+            <w:tcW w:type="dxa" w:w="4535"/>
+            <w:tcBorders>
+              <w:top w:val="single" w:sz="5" w:color="B7C0C8"/>
+              <w:left w:val="single" w:sz="5" w:color="B7C0C8"/>
+              <w:bottom w:val="single" w:sz="5" w:color="B7C0C8"/>
+              <w:right w:val="single" w:sz="5" w:color="B7C0C8"/>
+            </w:tcBorders>
           </w:tcPr>
           <w:p>
-            <w:pPr>
-              <w:spacing w:line="264" w:lineRule="auto" w:after="0"/>
-              <w:jc w:val="left"/>
-            </w:pPr>
-            <w:r/>
             <w:r>
-              <w:t>Dice trung bình từng ảnh</w:t>
+              <w:rPr>
+                <w:rFonts w:ascii="Times New Roman" w:hAnsi="Times New Roman"/>
+                <w:sz w:val="19"/>
+              </w:rPr>
+              <w:t>Validation Dice</w:t>
             </w:r>
           </w:p>
         </w:tc>
         <w:tc>
           <w:tcPr>
-            <w:tcW w:type="dxa" w:w="4702"/>
-            <w:vAlign w:val="center"/>
+            <w:tcW w:type="dxa" w:w="4535"/>
+            <w:tcBorders>
+              <w:top w:val="single" w:sz="5" w:color="B7C0C8"/>
+              <w:left w:val="single" w:sz="5" w:color="B7C0C8"/>
+              <w:bottom w:val="single" w:sz="5" w:color="B7C0C8"/>
+              <w:right w:val="single" w:sz="5" w:color="B7C0C8"/>
+            </w:tcBorders>
           </w:tcPr>
           <w:p>
-            <w:pPr>
-              <w:spacing w:line="264" w:lineRule="auto" w:after="0"/>
-              <w:jc w:val="left"/>
-            </w:pPr>
-            <w:r/>
             <w:r>
-              <w:t>0,8094</w:t>
+              <w:rPr>
+                <w:rFonts w:ascii="Times New Roman" w:hAnsi="Times New Roman"/>
+                <w:sz w:val="19"/>
+              </w:rPr>
+              <w:t>0,5830</w:t>
             </w:r>
           </w:p>
         </w:tc>
@@ -518,33 +509,43 @@
       <w:tr>
         <w:tc>
           <w:tcPr>
-            <w:tcW w:type="dxa" w:w="4702"/>
-            <w:vAlign w:val="center"/>
+            <w:tcW w:type="dxa" w:w="4535"/>
+            <w:tcBorders>
+              <w:top w:val="single" w:sz="5" w:color="B7C0C8"/>
+              <w:left w:val="single" w:sz="5" w:color="B7C0C8"/>
+              <w:bottom w:val="single" w:sz="5" w:color="B7C0C8"/>
+              <w:right w:val="single" w:sz="5" w:color="B7C0C8"/>
+            </w:tcBorders>
+            <w:shd w:fill="F7F9FA"/>
           </w:tcPr>
           <w:p>
-            <w:pPr>
-              <w:spacing w:line="264" w:lineRule="auto" w:after="0"/>
-              <w:jc w:val="left"/>
-            </w:pPr>
-            <w:r/>
             <w:r>
-              <w:t>IoU trung bình từng ảnh</w:t>
+              <w:rPr>
+                <w:rFonts w:ascii="Times New Roman" w:hAnsi="Times New Roman"/>
+                <w:sz w:val="19"/>
+              </w:rPr>
+              <w:t>Test Foreground Dice</w:t>
             </w:r>
           </w:p>
         </w:tc>
         <w:tc>
           <w:tcPr>
-            <w:tcW w:type="dxa" w:w="4702"/>
-            <w:vAlign w:val="center"/>
+            <w:tcW w:type="dxa" w:w="4535"/>
+            <w:tcBorders>
+              <w:top w:val="single" w:sz="5" w:color="B7C0C8"/>
+              <w:left w:val="single" w:sz="5" w:color="B7C0C8"/>
+              <w:bottom w:val="single" w:sz="5" w:color="B7C0C8"/>
+              <w:right w:val="single" w:sz="5" w:color="B7C0C8"/>
+            </w:tcBorders>
+            <w:shd w:fill="F7F9FA"/>
           </w:tcPr>
           <w:p>
-            <w:pPr>
-              <w:spacing w:line="264" w:lineRule="auto" w:after="0"/>
-              <w:jc w:val="left"/>
-            </w:pPr>
-            <w:r/>
             <w:r>
-              <w:t>0,7160</w:t>
+              <w:rPr>
+                <w:rFonts w:ascii="Times New Roman" w:hAnsi="Times New Roman"/>
+                <w:sz w:val="19"/>
+              </w:rPr>
+              <w:t>0,5719 ± 0,2482</w:t>
             </w:r>
           </w:p>
         </w:tc>
@@ -552,33 +553,41 @@
       <w:tr>
         <w:tc>
           <w:tcPr>
-            <w:tcW w:type="dxa" w:w="4702"/>
-            <w:vAlign w:val="center"/>
+            <w:tcW w:type="dxa" w:w="4535"/>
+            <w:tcBorders>
+              <w:top w:val="single" w:sz="5" w:color="B7C0C8"/>
+              <w:left w:val="single" w:sz="5" w:color="B7C0C8"/>
+              <w:bottom w:val="single" w:sz="5" w:color="B7C0C8"/>
+              <w:right w:val="single" w:sz="5" w:color="B7C0C8"/>
+            </w:tcBorders>
           </w:tcPr>
           <w:p>
-            <w:pPr>
-              <w:spacing w:line="264" w:lineRule="auto" w:after="0"/>
-              <w:jc w:val="left"/>
-            </w:pPr>
-            <w:r/>
             <w:r>
-              <w:t>Precision trung bình từng ảnh</w:t>
+              <w:rPr>
+                <w:rFonts w:ascii="Times New Roman" w:hAnsi="Times New Roman"/>
+                <w:sz w:val="19"/>
+              </w:rPr>
+              <w:t>Test IoU</w:t>
             </w:r>
           </w:p>
         </w:tc>
         <w:tc>
           <w:tcPr>
-            <w:tcW w:type="dxa" w:w="4702"/>
-            <w:vAlign w:val="center"/>
+            <w:tcW w:type="dxa" w:w="4535"/>
+            <w:tcBorders>
+              <w:top w:val="single" w:sz="5" w:color="B7C0C8"/>
+              <w:left w:val="single" w:sz="5" w:color="B7C0C8"/>
+              <w:bottom w:val="single" w:sz="5" w:color="B7C0C8"/>
+              <w:right w:val="single" w:sz="5" w:color="B7C0C8"/>
+            </w:tcBorders>
           </w:tcPr>
           <w:p>
-            <w:pPr>
-              <w:spacing w:line="264" w:lineRule="auto" w:after="0"/>
-              <w:jc w:val="left"/>
-            </w:pPr>
-            <w:r/>
             <w:r>
-              <w:t>0,8111</w:t>
+              <w:rPr>
+                <w:rFonts w:ascii="Times New Roman" w:hAnsi="Times New Roman"/>
+                <w:sz w:val="19"/>
+              </w:rPr>
+              <w:t>0,4405 ± 0,2341</w:t>
             </w:r>
           </w:p>
         </w:tc>
@@ -586,33 +595,43 @@
       <w:tr>
         <w:tc>
           <w:tcPr>
-            <w:tcW w:type="dxa" w:w="4702"/>
-            <w:vAlign w:val="center"/>
+            <w:tcW w:type="dxa" w:w="4535"/>
+            <w:tcBorders>
+              <w:top w:val="single" w:sz="5" w:color="B7C0C8"/>
+              <w:left w:val="single" w:sz="5" w:color="B7C0C8"/>
+              <w:bottom w:val="single" w:sz="5" w:color="B7C0C8"/>
+              <w:right w:val="single" w:sz="5" w:color="B7C0C8"/>
+            </w:tcBorders>
+            <w:shd w:fill="F7F9FA"/>
           </w:tcPr>
           <w:p>
-            <w:pPr>
-              <w:spacing w:line="264" w:lineRule="auto" w:after="0"/>
-              <w:jc w:val="left"/>
-            </w:pPr>
-            <w:r/>
             <w:r>
-              <w:t>Recall trung bình từng ảnh</w:t>
+              <w:rPr>
+                <w:rFonts w:ascii="Times New Roman" w:hAnsi="Times New Roman"/>
+                <w:sz w:val="19"/>
+              </w:rPr>
+              <w:t>Test Recall</w:t>
             </w:r>
           </w:p>
         </w:tc>
         <w:tc>
           <w:tcPr>
-            <w:tcW w:type="dxa" w:w="4702"/>
-            <w:vAlign w:val="center"/>
+            <w:tcW w:type="dxa" w:w="4535"/>
+            <w:tcBorders>
+              <w:top w:val="single" w:sz="5" w:color="B7C0C8"/>
+              <w:left w:val="single" w:sz="5" w:color="B7C0C8"/>
+              <w:bottom w:val="single" w:sz="5" w:color="B7C0C8"/>
+              <w:right w:val="single" w:sz="5" w:color="B7C0C8"/>
+            </w:tcBorders>
+            <w:shd w:fill="F7F9FA"/>
           </w:tcPr>
           <w:p>
-            <w:pPr>
-              <w:spacing w:line="264" w:lineRule="auto" w:after="0"/>
-              <w:jc w:val="left"/>
-            </w:pPr>
-            <w:r/>
             <w:r>
-              <w:t>0,8665</w:t>
+              <w:rPr>
+                <w:rFonts w:ascii="Times New Roman" w:hAnsi="Times New Roman"/>
+                <w:sz w:val="19"/>
+              </w:rPr>
+              <w:t>0,6362</w:t>
             </w:r>
           </w:p>
         </w:tc>
@@ -620,43 +639,90 @@
       <w:tr>
         <w:tc>
           <w:tcPr>
-            <w:tcW w:type="dxa" w:w="4702"/>
-            <w:vAlign w:val="center"/>
+            <w:tcW w:type="dxa" w:w="4535"/>
+            <w:tcBorders>
+              <w:top w:val="single" w:sz="5" w:color="B7C0C8"/>
+              <w:left w:val="single" w:sz="5" w:color="B7C0C8"/>
+              <w:bottom w:val="single" w:sz="5" w:color="B7C0C8"/>
+              <w:right w:val="single" w:sz="5" w:color="B7C0C8"/>
+            </w:tcBorders>
           </w:tcPr>
           <w:p>
-            <w:pPr>
-              <w:spacing w:line="264" w:lineRule="auto" w:after="0"/>
-              <w:jc w:val="left"/>
-            </w:pPr>
-            <w:r/>
             <w:r>
-              <w:t>Specificity của pixel nền</w:t>
+              <w:rPr>
+                <w:rFonts w:ascii="Times New Roman" w:hAnsi="Times New Roman"/>
+                <w:sz w:val="19"/>
+              </w:rPr>
+              <w:t>Test Precision</w:t>
             </w:r>
           </w:p>
         </w:tc>
         <w:tc>
           <w:tcPr>
-            <w:tcW w:type="dxa" w:w="4702"/>
-            <w:vAlign w:val="center"/>
+            <w:tcW w:type="dxa" w:w="4535"/>
+            <w:tcBorders>
+              <w:top w:val="single" w:sz="5" w:color="B7C0C8"/>
+              <w:left w:val="single" w:sz="5" w:color="B7C0C8"/>
+              <w:bottom w:val="single" w:sz="5" w:color="B7C0C8"/>
+              <w:right w:val="single" w:sz="5" w:color="B7C0C8"/>
+            </w:tcBorders>
           </w:tcPr>
           <w:p>
-            <w:pPr>
-              <w:spacing w:line="264" w:lineRule="auto" w:after="0"/>
-              <w:jc w:val="left"/>
-            </w:pPr>
-            <w:r/>
             <w:r>
-              <w:t>0,9716</w:t>
+              <w:rPr>
+                <w:rFonts w:ascii="Times New Roman" w:hAnsi="Times New Roman"/>
+                <w:sz w:val="19"/>
+              </w:rPr>
+              <w:t>0,5864</w:t>
+            </w:r>
+          </w:p>
+        </w:tc>
+      </w:tr>
+      <w:tr>
+        <w:tc>
+          <w:tcPr>
+            <w:tcW w:type="dxa" w:w="4535"/>
+            <w:tcBorders>
+              <w:top w:val="single" w:sz="5" w:color="B7C0C8"/>
+              <w:left w:val="single" w:sz="5" w:color="B7C0C8"/>
+              <w:bottom w:val="single" w:sz="5" w:color="B7C0C8"/>
+              <w:right w:val="single" w:sz="5" w:color="B7C0C8"/>
+            </w:tcBorders>
+            <w:shd w:fill="F7F9FA"/>
+          </w:tcPr>
+          <w:p>
+            <w:r>
+              <w:rPr>
+                <w:rFonts w:ascii="Times New Roman" w:hAnsi="Times New Roman"/>
+                <w:sz w:val="19"/>
+              </w:rPr>
+              <w:t>Test Specificity — 5 bản ghi mask rỗng theo định nghĩa của Mốc 1</w:t>
+            </w:r>
+          </w:p>
+        </w:tc>
+        <w:tc>
+          <w:tcPr>
+            <w:tcW w:type="dxa" w:w="4535"/>
+            <w:tcBorders>
+              <w:top w:val="single" w:sz="5" w:color="B7C0C8"/>
+              <w:left w:val="single" w:sz="5" w:color="B7C0C8"/>
+              <w:bottom w:val="single" w:sz="5" w:color="B7C0C8"/>
+              <w:right w:val="single" w:sz="5" w:color="B7C0C8"/>
+            </w:tcBorders>
+            <w:shd w:fill="F7F9FA"/>
+          </w:tcPr>
+          <w:p>
+            <w:r>
+              <w:rPr>
+                <w:rFonts w:ascii="Times New Roman" w:hAnsi="Times New Roman"/>
+                <w:sz w:val="19"/>
+              </w:rPr>
+              <w:t>0,8235</w:t>
             </w:r>
           </w:p>
         </w:tc>
       </w:tr>
     </w:tbl>
-    <w:p>
-      <w:pPr>
-        <w:spacing w:after="0"/>
-      </w:pPr>
-    </w:p>
     <w:p>
       <w:pPr>
         <w:jc w:val="both"/>
@@ -665,14 +731,16 @@
         <w:t xml:space="preserve">Nguồn: </w:t>
       </w:r>
       <w:r>
-        <w:rPr>
-          <w:rFonts w:ascii="Consolas" w:hAnsi="Consolas"/>
-          <w:sz w:val="20"/>
-        </w:rPr>
-        <w:t>evaluation/retrain_2d_2026-10-03/test_summary.json</w:t>
+        <w:t>evaluation/baseline_test_metrics.json</w:t>
       </w:r>
       <w:r>
-        <w:t xml:space="preserve">. Đây là </w:t>
+        <w:t xml:space="preserve">, </w:t>
+      </w:r>
+      <w:r>
+        <w:t>checkpoints/archive_milestone_1/README.md</w:t>
+      </w:r>
+      <w:r>
+        <w:t xml:space="preserve"> và Báo cáo Mốc 1. Các chỉ số là </w:t>
       </w:r>
       <w:r>
         <w:rPr>
@@ -681,7 +749,54 @@
         <w:t>Segmentation Metrics</w:t>
       </w:r>
       <w:r>
-        <w:t>, không phải Diagnostic Accuracy. Các số liệu này thuộc split huấn luyện riêng, không phải kết quả của bộ Mốc 1. Báo cáo đánh giá ghi nhận danh tính bệnh nhân nguồn chưa được xác minh và Test của lượt huấn luyện này từng được truy cập trong đánh giá checkpoint trước đó; vì vậy không diễn giải là đánh giá mù hoặc độc lập cấp bệnh nhân.</w:t>
+        <w:t xml:space="preserve"> đo độ chồng lấp/phân loại pixel, không đại diện cho độ chính xác chẩn đoán lâm sàng. Các mask rỗng dẫn xuất chưa được xác nhận là nhãn âm tính lâm sàng.</w:t>
+      </w:r>
+    </w:p>
+    <w:p>
+      <w:pPr>
+        <w:jc w:val="center"/>
+      </w:pPr>
+      <w:r>
+        <w:drawing>
+          <wp:inline xmlns:a="http://schemas.openxmlformats.org/drawingml/2006/main" xmlns:pic="http://schemas.openxmlformats.org/drawingml/2006/picture">
+            <wp:extent cx="5943600" cy="2116606"/>
+            <wp:docPr id="1" name="Picture 1"/>
+            <wp:cNvGraphicFramePr>
+              <a:graphicFrameLocks noChangeAspect="1"/>
+            </wp:cNvGraphicFramePr>
+            <a:graphic>
+              <a:graphicData uri="http://schemas.openxmlformats.org/drawingml/2006/picture">
+                <pic:pic>
+                  <pic:nvPicPr>
+                    <pic:cNvPr id="0" name="m1_training_history.png"/>
+                    <pic:cNvPicPr/>
+                  </pic:nvPicPr>
+                  <pic:blipFill>
+                    <a:blip r:embed="rId10"/>
+                    <a:stretch>
+                      <a:fillRect/>
+                    </a:stretch>
+                  </pic:blipFill>
+                  <pic:spPr>
+                    <a:xfrm>
+                      <a:off x="0" y="0"/>
+                      <a:ext cx="5943600" cy="2116606"/>
+                    </a:xfrm>
+                    <a:prstGeom prst="rect"/>
+                  </pic:spPr>
+                </pic:pic>
+              </a:graphicData>
+            </a:graphic>
+          </wp:inline>
+        </w:drawing>
+      </w:r>
+    </w:p>
+    <w:p>
+      <w:pPr>
+        <w:jc w:val="center"/>
+      </w:pPr>
+      <w:r>
+        <w:t>Đồ thị huấn luyện Standard U-Net 12 epoch trong Mốc 1</w:t>
       </w:r>
     </w:p>
     <w:p>
@@ -689,27 +804,124 @@
         <w:jc w:val="both"/>
       </w:pPr>
       <w:r>
-        <w:t xml:space="preserve">Kiểm tra suy luận trên 46 ảnh Validation Mốc 1 nạp checkpoint thành công với </w:t>
+        <w:rPr>
+          <w:b/>
+        </w:rPr>
+        <w:t>Hình 1.</w:t>
+      </w:r>
+      <w:r>
+        <w:t xml:space="preserve"> Đồ thị Loss và Dice được giữ nguyên từ Báo cáo Mốc 1; không phải kết quả huấn luyện mới ở Mốc 2.</w:t>
+      </w:r>
+    </w:p>
+    <w:p>
+      <w:pPr>
+        <w:jc w:val="center"/>
+      </w:pPr>
+      <w:r>
+        <w:drawing>
+          <wp:inline xmlns:a="http://schemas.openxmlformats.org/drawingml/2006/main" xmlns:pic="http://schemas.openxmlformats.org/drawingml/2006/picture">
+            <wp:extent cx="5943600" cy="5896984"/>
+            <wp:docPr id="2" name="Picture 2"/>
+            <wp:cNvGraphicFramePr>
+              <a:graphicFrameLocks noChangeAspect="1"/>
+            </wp:cNvGraphicFramePr>
+            <a:graphic>
+              <a:graphicData uri="http://schemas.openxmlformats.org/drawingml/2006/picture">
+                <pic:pic>
+                  <pic:nvPicPr>
+                    <pic:cNvPr id="0" name="m1_prediction_examples.png"/>
+                    <pic:cNvPicPr/>
+                  </pic:nvPicPr>
+                  <pic:blipFill>
+                    <a:blip r:embed="rId11"/>
+                    <a:stretch>
+                      <a:fillRect/>
+                    </a:stretch>
+                  </pic:blipFill>
+                  <pic:spPr>
+                    <a:xfrm>
+                      <a:off x="0" y="0"/>
+                      <a:ext cx="5943600" cy="5896984"/>
+                    </a:xfrm>
+                    <a:prstGeom prst="rect"/>
+                  </pic:spPr>
+                </pic:pic>
+              </a:graphicData>
+            </a:graphic>
+          </wp:inline>
+        </w:drawing>
+      </w:r>
+    </w:p>
+    <w:p>
+      <w:pPr>
+        <w:jc w:val="center"/>
+      </w:pPr>
+      <w:r>
+        <w:t>Các ví dụ phân đoạn trong Báo cáo Mốc 1</w:t>
+      </w:r>
+    </w:p>
+    <w:p>
+      <w:pPr>
+        <w:jc w:val="both"/>
+      </w:pPr>
+      <w:r>
+        <w:rPr>
+          <w:b/>
+        </w:rPr>
+        <w:t>Hình 2.</w:t>
+      </w:r>
+      <w:r>
+        <w:t xml:space="preserve"> Các ví dụ ảnh gốc, mask tham chiếu và prediction được giữ nguyên từ Báo cáo Mốc 1; chỉ minh họa kết quả baseline đã báo cáo, không dùng để suy luận bệnh học.</w:t>
+      </w:r>
+    </w:p>
+    <w:p>
+      <w:pPr>
+        <w:pStyle w:val="Heading1"/>
+        <w:keepNext/>
+      </w:pPr>
+      <w:r>
+        <w:rPr>
+          <w:b/>
+          <w:sz w:val="28"/>
+        </w:rPr>
+        <w:t>3. Prototype, kiểm thử và giới hạn</w:t>
+      </w:r>
+    </w:p>
+    <w:p>
+      <w:pPr>
+        <w:jc w:val="both"/>
+      </w:pPr>
+      <w:r>
+        <w:t>Prototype hỗ trợ năm bước khép kín: tải ảnh; chạy phân đoạn; xem Original/Mask/Overlay; rà soát/chỉnh sửa bằng Brush hoặc Eraser; xác nhận và lưu kết quả. Nhật ký Browser Smoke Test ngày 04/10 ghi PASS cho kịch bản một ảnh Validation (</w:t>
+      </w:r>
+      <w:r>
+        <w:t>evaluation/milestone_2_m1_scope/browser_smoke_2026-10-04.json</w:t>
+      </w:r>
+      <w:r>
+        <w:t xml:space="preserve">). Bộ kiểm thử tự động ghi nhận </w:t>
       </w:r>
       <w:r>
         <w:rPr>
-          <w:rFonts w:ascii="Consolas" w:hAnsi="Consolas"/>
-          <w:sz w:val="20"/>
+          <w:b/>
         </w:rPr>
-        <w:t>strict=True</w:t>
+        <w:t>61 passed, 0 failed</w:t>
       </w:r>
       <w:r>
-        <w:t>, không thiếu/thừa key (</w:t>
+        <w:t xml:space="preserve"> (</w:t>
       </w:r>
       <w:r>
-        <w:rPr>
-          <w:rFonts w:ascii="Consolas" w:hAnsi="Consolas"/>
-          <w:sz w:val="20"/>
-        </w:rPr>
-        <w:t>evaluation/m1_validation_sanity_check.json</w:t>
+        <w:t>evaluation/milestone_2_m1_scope/pytest_2026-10-04.txt</w:t>
       </w:r>
       <w:r>
-        <w:t xml:space="preserve">). Median forward pass là </w:t>
+        <w:t>).</w:t>
+      </w:r>
+    </w:p>
+    <w:p>
+      <w:pPr>
+        <w:jc w:val="both"/>
+      </w:pPr>
+      <w:r>
+        <w:t xml:space="preserve">Phép đo suy diễn kỹ thuật trên 46 ảnh Validation Mốc 1 ghi nhận median forward pass </w:t>
       </w:r>
       <w:r>
         <w:rPr>
@@ -718,7 +930,7 @@
         <w:t>30,26 ms</w:t>
       </w:r>
       <w:r>
-        <w:t xml:space="preserve">; median tiền xử lý cộng forward là </w:t>
+        <w:t xml:space="preserve"> và median tiền xử lý cộng forward </w:t>
       </w:r>
       <w:r>
         <w:rPr>
@@ -727,170 +939,66 @@
         <w:t>46,04 ms</w:t>
       </w:r>
       <w:r>
-        <w:t xml:space="preserve">. Phép đo API trên Validation Mốc 1 có </w:t>
-      </w:r>
-      <w:r>
-        <w:rPr>
-          <w:b/>
-        </w:rPr>
-        <w:t>5 quan sát</w:t>
-      </w:r>
-      <w:r>
-        <w:t xml:space="preserve">, median </w:t>
-      </w:r>
-      <w:r>
-        <w:rPr>
-          <w:b/>
-        </w:rPr>
-        <w:t>176,69 ms</w:t>
-      </w:r>
-      <w:r>
-        <w:t xml:space="preserve">, p95 </w:t>
-      </w:r>
-      <w:r>
-        <w:rPr>
-          <w:b/>
-        </w:rPr>
-        <w:t>185,76 ms</w:t>
-      </w:r>
-      <w:r>
         <w:t xml:space="preserve"> (</w:t>
       </w:r>
       <w:r>
-        <w:rPr>
-          <w:rFonts w:ascii="Consolas" w:hAnsi="Consolas"/>
-          <w:sz w:val="20"/>
-        </w:rPr>
-        <w:t>evaluation/milestone_2_m1_scope/api_latency_validation_2026-10-04.json</w:t>
+        <w:t>evaluation/m1_validation_sanity_check.json</w:t>
       </w:r>
       <w:r>
-        <w:t>). Cỡ mẫu nhỏ nên chỉ mang tính mô tả, chưa đại diện cho tải thực tế.</w:t>
+        <w:t xml:space="preserve">). Đây là đo kiểm tương thích/vận hành; log ghi checkpoint SHA </w:t>
+      </w:r>
+      <w:r>
+        <w:t>5e14be…</w:t>
+      </w:r>
+      <w:r>
+        <w:t xml:space="preserve">, khác checkpoint Mốc 1 SHA </w:t>
+      </w:r>
+      <w:r>
+        <w:t>44b862…</w:t>
+      </w:r>
+      <w:r>
+        <w:t xml:space="preserve"> được lưu tại </w:t>
+      </w:r>
+      <w:r>
+        <w:t>checkpoints/archive_milestone_1/</w:t>
+      </w:r>
+      <w:r>
+        <w:t>. Do đó phép đo này không chứng minh hiệu năng phân đoạn của checkpoint Mốc 1 và không thay thế các metric trong Mục 2. Browser smoke test cũng là kiểm tra chức năng, không phải đánh giá hiệu năng lâm sàng hoặc usability trên nhiều người dùng.</w:t>
       </w:r>
     </w:p>
     <w:p>
       <w:pPr>
-        <w:pStyle w:val="Heading2"/>
+        <w:jc w:val="both"/>
       </w:pPr>
       <w:r>
-        <w:t>3. Minh chứng và rủi ro</w:t>
+        <w:t>Rủi ro còn lại: chưa có mapping xác thực từ mã ẩn danh tới PID bệnh viện; nguồn provenance của 35 mask rỗng dẫn xuất cần được xác minh trước khi dùng chúng làm nhãn đánh giá; chưa có so sánh kiến trúc thứ hai hoặc phản hồi usability từ chuyên viên y tế. Mốc 2 không dùng Test Mốc 1 để chọn checkpoint/ngưỡng và không thực hiện đánh giá Test mới.</w:t>
       </w:r>
     </w:p>
     <w:p>
       <w:pPr>
-        <w:pStyle w:val="ListBullet"/>
-        <w:jc w:val="both"/>
+        <w:pStyle w:val="Heading1"/>
+        <w:keepNext/>
       </w:pPr>
-      <w:r>
-        <w:t xml:space="preserve">Automated tests: </w:t>
-      </w:r>
       <w:r>
         <w:rPr>
           <w:b/>
+          <w:sz w:val="28"/>
         </w:rPr>
-        <w:t>61 passed, 0 failed</w:t>
-      </w:r>
-      <w:r>
-        <w:t xml:space="preserve">. Ruff: </w:t>
-      </w:r>
-      <w:r>
-        <w:rPr>
-          <w:b/>
-        </w:rPr>
-        <w:t>All checks passed</w:t>
-      </w:r>
-      <w:r>
-        <w:t xml:space="preserve">. API khởi động, trả trạng thái healthy và nạp đúng checkpoint SHA </w:t>
-      </w:r>
-      <w:r>
-        <w:rPr>
-          <w:rFonts w:ascii="Consolas" w:hAnsi="Consolas"/>
-          <w:sz w:val="20"/>
-        </w:rPr>
-        <w:t>5e14be…494e</w:t>
-      </w:r>
-      <w:r>
-        <w:t>.</w:t>
+        <w:t>4. Kế hoạch tiếp theo</w:t>
       </w:r>
     </w:p>
     <w:p>
       <w:pPr>
-        <w:pStyle w:val="ListBullet"/>
         <w:jc w:val="both"/>
       </w:pPr>
       <w:r>
-        <w:t>Browser smoke log ngày 04/10 ghi PASS cho kịch bản một ảnh Validation, gồm suy luận, các chế độ xem, Brush/Eraser, Undo, lưu và mở lại ca (</w:t>
-      </w:r>
-      <w:r>
-        <w:rPr>
-          <w:rFonts w:ascii="Consolas" w:hAnsi="Consolas"/>
-          <w:sz w:val="20"/>
-        </w:rPr>
-        <w:t>evaluation/milestone_2_m1_scope/browser_smoke_2026-10-04.json</w:t>
-      </w:r>
-      <w:r>
-        <w:t>). Trong lượt rà soát hiện tại chưa chạy lại browser test vì môi trường thiếu Playwright.</w:t>
-      </w:r>
-    </w:p>
-    <w:p>
-      <w:pPr>
-        <w:pStyle w:val="ListBullet"/>
-        <w:jc w:val="both"/>
-      </w:pPr>
-      <w:r>
-        <w:t>Mốc 1 có 185 mã nhóm ẩn danh rời nhau trong các split; chưa có mapping xác thực tới PID bệnh viện, nên chưa thể kết luận patient-level independence. Có 35 mask rỗng dẫn xuất; không xem là nhãn âm tính lâm sàng và không dùng để tính metric y tế. File provenance được dẫn trong tài liệu cũ hiện không có tại đường dẫn đã ghi, cần khôi phục hoặc xác minh trước khi sử dụng.</w:t>
-      </w:r>
-    </w:p>
-    <w:p>
-      <w:pPr>
-        <w:pStyle w:val="ListBullet"/>
-        <w:jc w:val="both"/>
-      </w:pPr>
-      <w:r>
-        <w:t>Chưa hoàn tất so sánh kiến trúc thứ hai hoặc đánh giá usability với chuyên viên y tế.</w:t>
-      </w:r>
-    </w:p>
-    <w:p>
-      <w:pPr>
-        <w:pStyle w:val="Heading2"/>
-      </w:pPr>
-      <w:r>
-        <w:t>4. Kế hoạch tiếp theo — Mốc 3 (06/10–18/10/2026)</w:t>
-      </w:r>
-    </w:p>
-    <w:p>
-      <w:pPr>
-        <w:pStyle w:val="ListNumber"/>
-        <w:jc w:val="both"/>
-      </w:pPr>
-      <w:r>
-        <w:t>Xác minh nguồn Ground Truth và provenance mask trước khi tính metric bổ sung; giữ nguyên lịch sử sử dụng Test và không gọi lần đánh giá tiếp theo là “mù” nếu dữ liệu đã được truy cập.</w:t>
-      </w:r>
-    </w:p>
-    <w:p>
-      <w:pPr>
-        <w:pStyle w:val="ListNumber"/>
-        <w:jc w:val="both"/>
-      </w:pPr>
-      <w:r>
-        <w:t>Kiểm tra lại E2E trên browser khi có Playwright; lưu ảnh prediction/overlay và log thao tác HITL.</w:t>
-      </w:r>
-    </w:p>
-    <w:p>
-      <w:pPr>
-        <w:pStyle w:val="ListNumber"/>
-        <w:jc w:val="both"/>
-      </w:pPr>
-      <w:r>
-        <w:t>Phân tích các ca phân đoạn tốt và lỗi lớn bằng ảnh gốc, mask tham chiếu và mask dự đoán; chỉ mô tả “vùng nghi ngờ tổn thương được phân đoạn”, không tự gán nhãn bệnh học.</w:t>
-      </w:r>
-    </w:p>
-    <w:p>
-      <w:pPr>
-        <w:pStyle w:val="ListNumber"/>
-        <w:jc w:val="both"/>
-      </w:pPr>
-      <w:r>
-        <w:t>Nếu tiếp cận được chuyên viên, ghi nhận thời gian thao tác và phản hồi về tính hữu dụng của Brush/Eraser và quy trình Confirm/Save.</w:t>
+        <w:t>1. Thống nhất checkpoint tích hợp với checkpoint Mốc 1 trước khi công bố prototype là đang chạy chính mô hình baseline Mốc 1; sau khi thay đổi cần lưu SHA và chạy lại kiểm tra nạp/suy diễn.</w:t>
+        <w:br/>
+        <w:t>2. Giữ nguyên split 215/46/46 và chỉ đánh giá Test theo kế hoạch được Thầy duyệt, với Ground Truth và lịch sử truy cập dữ liệu được xác minh.</w:t>
+        <w:br/>
+        <w:t>3. Lưu ảnh prediction/overlay và log thao tác HITL có nguồn gốc rõ ràng; phân tích ca tốt/lỗi mà không gán nhãn bệnh học ngoài metadata.</w:t>
+        <w:br/>
+        <w:t>4. Nếu tiếp cận được chuyên viên, ghi nhận thời gian thao tác và phản hồi về Brush/Eraser, Undo/Redo, Confirm/Save.</w:t>
       </w:r>
     </w:p>
     <w:p>
@@ -911,23 +1019,39 @@
         </w:rPr>
         <w:t>Nguyễn Hữu Dũng</w:t>
       </w:r>
-    </w:p>
-    <w:p>
-      <w:pPr>
-        <w:jc w:val="both"/>
-      </w:pPr>
       <w:r>
+        <w:br/>
         <w:t>MSV: 11235559</w:t>
       </w:r>
     </w:p>
     <w:sectPr>
-      <w:pgSz w:w="12240" w:h="15840"/>
+      <w:footerReference w:type="default" r:id="rId9"/>
+      <w:pgSz w:w="11906" w:h="16838"/>
       <w:pgMar w:top="1134" w:right="1134" w:bottom="1134" w:left="1701" w:header="720" w:footer="720" w:gutter="0"/>
       <w:cols w:space="720"/>
       <w:docGrid w:linePitch="360"/>
     </w:sectPr>
   </w:body>
 </w:document>
+</file>
+
+<file path=word/footer1.xml><?xml version="1.0" encoding="utf-8"?>
+<w:ftr xmlns:m="http://schemas.openxmlformats.org/officeDocument/2006/math" xmlns:mc="http://schemas.openxmlformats.org/markup-compatibility/2006" xmlns:mo="http://schemas.microsoft.com/office/mac/office/2008/main" xmlns:mv="urn:schemas-microsoft-com:mac:vml" xmlns:o="urn:schemas-microsoft-com:office:office" xmlns:r="http://schemas.openxmlformats.org/officeDocument/2006/relationships" xmlns:v="urn:schemas-microsoft-com:vml" xmlns:w10="urn:schemas-microsoft-com:office:word" xmlns:w14="http://schemas.microsoft.com/office/word/2010/wordml" xmlns:w="http://schemas.openxmlformats.org/wordprocessingml/2006/main" xmlns:wne="http://schemas.microsoft.com/office/word/2006/wordml" xmlns:wp14="http://schemas.microsoft.com/office/word/2010/wordprocessingDrawing" xmlns:wp="http://schemas.openxmlformats.org/drawingml/2006/wordprocessingDrawing" xmlns:wpc="http://schemas.microsoft.com/office/word/2010/wordprocessingCanvas" xmlns:wpg="http://schemas.microsoft.com/office/word/2010/wordprocessingGroup" xmlns:wpi="http://schemas.microsoft.com/office/word/2010/wordprocessingInk" xmlns:wps="http://schemas.microsoft.com/office/word/2010/wordprocessingShape" mc:Ignorable="w14 wp14">
+  <w:p>
+    <w:pPr>
+      <w:pStyle w:val="Footer"/>
+      <w:jc w:val="center"/>
+    </w:pPr>
+    <w:r>
+      <w:rPr>
+        <w:rFonts w:ascii="Times New Roman" w:hAnsi="Times New Roman"/>
+        <w:sz w:val="20"/>
+      </w:rPr>
+      <w:t xml:space="preserve">Trang </w:t>
+    </w:r>
+    <w:fldSimple w:instr="PAGE"/>
+  </w:p>
+</w:ftr>
 </file>
 
 <file path=word/numbering.xml><?xml version="1.0" encoding="utf-8"?>
@@ -1294,11 +1418,10 @@
     <w:qFormat/>
     <w:rsid w:val="00FC693F"/>
     <w:pPr>
-      <w:spacing w:line="312" w:lineRule="auto" w:after="100"/>
+      <w:spacing w:after="100" w:line="324" w:lineRule="auto"/>
     </w:pPr>
     <w:rPr>
-      <w:rFonts w:ascii="Times New Roman" w:hAnsi="Times New Roman" w:eastAsia="Times New Roman"/>
-      <w:color w:val="142A38"/>
+      <w:rFonts w:ascii="Times New Roman" w:hAnsi="Times New Roman"/>
       <w:sz w:val="24"/>
     </w:rPr>
   </w:style>
@@ -1357,14 +1480,14 @@
     <w:pPr>
       <w:keepNext/>
       <w:keepLines/>
-      <w:spacing w:before="480" w:after="0"/>
+      <w:spacing w:before="240" w:after="120"/>
       <w:outlineLvl w:val="0"/>
     </w:pPr>
     <w:rPr>
-      <w:rFonts w:asciiTheme="majorHAnsi" w:eastAsiaTheme="majorEastAsia" w:hAnsiTheme="majorHAnsi" w:cstheme="majorBidi" w:ascii="Times New Roman" w:hAnsi="Times New Roman" w:eastAsia="Times New Roman"/>
+      <w:rFonts w:asciiTheme="majorHAnsi" w:eastAsiaTheme="majorEastAsia" w:hAnsiTheme="majorHAnsi" w:cstheme="majorBidi" w:ascii="Times New Roman" w:hAnsi="Times New Roman"/>
       <w:b/>
       <w:bCs/>
-      <w:color w:val="142A38"/>
+      <w:color w:val="365F91" w:themeColor="accent1" w:themeShade="BF"/>
       <w:sz w:val="28"/>
       <w:szCs w:val="28"/>
     </w:rPr>
@@ -1381,15 +1504,15 @@
     <w:pPr>
       <w:keepNext/>
       <w:keepLines/>
-      <w:spacing w:before="200" w:after="0"/>
+      <w:spacing w:before="240" w:after="120"/>
       <w:outlineLvl w:val="1"/>
     </w:pPr>
     <w:rPr>
-      <w:rFonts w:asciiTheme="majorHAnsi" w:eastAsiaTheme="majorEastAsia" w:hAnsiTheme="majorHAnsi" w:cstheme="majorBidi" w:ascii="Times New Roman" w:hAnsi="Times New Roman" w:eastAsia="Times New Roman"/>
+      <w:rFonts w:asciiTheme="majorHAnsi" w:eastAsiaTheme="majorEastAsia" w:hAnsiTheme="majorHAnsi" w:cstheme="majorBidi" w:ascii="Times New Roman" w:hAnsi="Times New Roman"/>
       <w:b/>
       <w:bCs/>
-      <w:color w:val="142A38"/>
-      <w:sz w:val="26"/>
+      <w:color w:val="4F81BD" w:themeColor="accent1"/>
+      <w:sz w:val="25"/>
       <w:szCs w:val="26"/>
     </w:rPr>
   </w:style>
@@ -1650,12 +1773,11 @@
       <w:contextualSpacing/>
     </w:pPr>
     <w:rPr>
-      <w:rFonts w:asciiTheme="majorHAnsi" w:eastAsiaTheme="majorEastAsia" w:hAnsiTheme="majorHAnsi" w:cstheme="majorBidi" w:ascii="Times New Roman" w:hAnsi="Times New Roman" w:eastAsia="Times New Roman"/>
-      <w:b/>
-      <w:color w:val="142A38"/>
+      <w:rFonts w:asciiTheme="majorHAnsi" w:eastAsiaTheme="majorEastAsia" w:hAnsiTheme="majorHAnsi" w:cstheme="majorBidi"/>
+      <w:color w:val="17365D" w:themeColor="text2" w:themeShade="BF"/>
       <w:spacing w:val="5"/>
       <w:kern w:val="28"/>
-      <w:sz w:val="32"/>
+      <w:sz w:val="52"/>
       <w:szCs w:val="52"/>
     </w:rPr>
   </w:style>

</xml_diff>